<commit_message>
Add TUST paper link (ScienceDirect)
</commit_message>
<xml_diff>
--- a/Curriculum_Vitae_Hyunchul_Park.docx
+++ b/Curriculum_Vitae_Hyunchul_Park.docx
@@ -5,7 +5,7 @@
     <w:p>
       <w:pPr>
         <w:pStyle w:val="1"/>
-        <w:divId w:val="2105179446"/>
+        <w:divId w:val="598099298"/>
         <w:rPr>
           <w:rFonts w:ascii="Cambria" w:hAnsi="Cambria"/>
           <w:color w:val="000000"/>
@@ -24,7 +24,7 @@
     <w:p>
       <w:pPr>
         <w:pStyle w:val="topbio"/>
-        <w:divId w:val="2105179446"/>
+        <w:divId w:val="598099298"/>
         <w:rPr>
           <w:rFonts w:ascii="Cambria" w:hAnsi="Cambria"/>
           <w:color w:val="000000"/>
@@ -47,7 +47,7 @@
     <w:p>
       <w:pPr>
         <w:pStyle w:val="topbio"/>
-        <w:divId w:val="2105179446"/>
+        <w:divId w:val="598099298"/>
         <w:rPr>
           <w:rFonts w:ascii="Cambria" w:hAnsi="Cambria"/>
           <w:color w:val="000000"/>
@@ -70,7 +70,7 @@
     <w:p>
       <w:pPr>
         <w:pStyle w:val="contact"/>
-        <w:divId w:val="2105179446"/>
+        <w:divId w:val="598099298"/>
         <w:rPr>
           <w:rFonts w:ascii="Cambria" w:hAnsi="Cambria"/>
           <w:color w:val="000000"/>
@@ -106,7 +106,7 @@
     <w:p>
       <w:pPr>
         <w:pStyle w:val="contact"/>
-        <w:divId w:val="2105179446"/>
+        <w:divId w:val="598099298"/>
         <w:rPr>
           <w:rFonts w:ascii="Cambria" w:hAnsi="Cambria"/>
           <w:color w:val="000000"/>
@@ -142,7 +142,7 @@
     <w:p>
       <w:pPr>
         <w:pStyle w:val="2"/>
-        <w:divId w:val="2105179446"/>
+        <w:divId w:val="598099298"/>
         <w:rPr>
           <w:rFonts w:ascii="Cambria" w:hAnsi="Cambria"/>
           <w:color w:val="000000"/>
@@ -175,7 +175,7 @@
       </w:tblGrid>
       <w:tr>
         <w:trPr>
-          <w:divId w:val="2105179446"/>
+          <w:divId w:val="598099298"/>
         </w:trPr>
         <w:tc>
           <w:tcPr>
@@ -294,7 +294,7 @@
       </w:tr>
       <w:tr>
         <w:trPr>
-          <w:divId w:val="2105179446"/>
+          <w:divId w:val="598099298"/>
         </w:trPr>
         <w:tc>
           <w:tcPr>
@@ -413,7 +413,7 @@
       </w:tr>
       <w:tr>
         <w:trPr>
-          <w:divId w:val="2105179446"/>
+          <w:divId w:val="598099298"/>
         </w:trPr>
         <w:tc>
           <w:tcPr>
@@ -497,7 +497,7 @@
     <w:p>
       <w:pPr>
         <w:pStyle w:val="2"/>
-        <w:divId w:val="2105179446"/>
+        <w:divId w:val="598099298"/>
         <w:rPr>
           <w:rFonts w:ascii="Cambria" w:hAnsi="Cambria"/>
           <w:color w:val="000000"/>
@@ -516,7 +516,7 @@
     <w:p>
       <w:pPr>
         <w:pStyle w:val="a6"/>
-        <w:divId w:val="2105179446"/>
+        <w:divId w:val="598099298"/>
         <w:rPr>
           <w:rFonts w:ascii="Cambria" w:hAnsi="Cambria"/>
           <w:color w:val="000000"/>
@@ -539,7 +539,7 @@
     <w:p>
       <w:pPr>
         <w:pStyle w:val="2"/>
-        <w:divId w:val="2105179446"/>
+        <w:divId w:val="598099298"/>
         <w:rPr>
           <w:rFonts w:ascii="Cambria" w:hAnsi="Cambria"/>
           <w:color w:val="000000"/>
@@ -559,7 +559,7 @@
       <w:pPr>
         <w:pStyle w:val="blank"/>
         <w:spacing w:before="60" w:beforeAutospacing="0" w:after="120" w:afterAutospacing="0"/>
-        <w:divId w:val="2105179446"/>
+        <w:divId w:val="598099298"/>
         <w:rPr>
           <w:rFonts w:ascii="Cambria" w:hAnsi="Cambria"/>
           <w:sz w:val="19"/>
@@ -611,7 +611,7 @@
       <w:pPr>
         <w:pStyle w:val="3"/>
         <w:spacing w:before="240"/>
-        <w:divId w:val="2105179446"/>
+        <w:divId w:val="598099298"/>
         <w:rPr>
           <w:rFonts w:ascii="Cambria" w:hAnsi="Cambria"/>
           <w:color w:val="000000"/>
@@ -634,7 +634,7 @@
           <w:numId w:val="1"/>
         </w:numPr>
         <w:spacing w:before="100" w:beforeAutospacing="1" w:after="100" w:afterAutospacing="1"/>
-        <w:divId w:val="2105179446"/>
+        <w:divId w:val="598099298"/>
         <w:rPr>
           <w:rFonts w:ascii="Cambria" w:hAnsi="Cambria"/>
           <w:color w:val="000000"/>
@@ -746,7 +746,7 @@
           <w:numId w:val="1"/>
         </w:numPr>
         <w:spacing w:before="100" w:beforeAutospacing="1" w:after="100" w:afterAutospacing="1"/>
-        <w:divId w:val="2105179446"/>
+        <w:divId w:val="598099298"/>
         <w:rPr>
           <w:rFonts w:ascii="Cambria" w:hAnsi="Cambria"/>
           <w:color w:val="000000"/>
@@ -828,6 +828,28 @@
           <w:lang w:val="en"/>
         </w:rPr>
         <w:t xml:space="preserve">, 157, 106365. </w:t>
+      </w:r>
+      <w:hyperlink r:id="rId10" w:history="1">
+        <w:r>
+          <w:rPr>
+            <w:rStyle w:val="a3"/>
+            <w:rFonts w:ascii="Cambria" w:hAnsi="Cambria"/>
+            <w:sz w:val="22"/>
+            <w:szCs w:val="22"/>
+            <w:lang w:val="en"/>
+          </w:rPr>
+          <w:t>https://www.sciencedirect.com/science/article/pii/S0886779825000033</w:t>
+        </w:r>
+      </w:hyperlink>
+      <w:r>
+        <w:rPr>
+          <w:rFonts w:ascii="Cambria" w:hAnsi="Cambria"/>
+          <w:color w:val="000000"/>
+          <w:sz w:val="22"/>
+          <w:szCs w:val="22"/>
+          <w:lang w:val="en"/>
+        </w:rPr>
+        <w:t xml:space="preserve"> </w:t>
       </w:r>
     </w:p>
     <w:p>
@@ -837,7 +859,7 @@
           <w:numId w:val="1"/>
         </w:numPr>
         <w:spacing w:before="100" w:beforeAutospacing="1" w:after="100" w:afterAutospacing="1"/>
-        <w:divId w:val="2105179446"/>
+        <w:divId w:val="598099298"/>
         <w:rPr>
           <w:rFonts w:ascii="Cambria" w:hAnsi="Cambria"/>
           <w:color w:val="000000"/>
@@ -909,7 +931,7 @@
         </w:rPr>
         <w:t xml:space="preserve">, 205, 107685. </w:t>
       </w:r>
-      <w:hyperlink r:id="rId10" w:history="1">
+      <w:hyperlink r:id="rId11" w:history="1">
         <w:r>
           <w:rPr>
             <w:rStyle w:val="a3"/>
@@ -936,7 +958,7 @@
       <w:pPr>
         <w:pStyle w:val="3"/>
         <w:spacing w:before="240"/>
-        <w:divId w:val="2105179446"/>
+        <w:divId w:val="598099298"/>
         <w:rPr>
           <w:rFonts w:ascii="Cambria" w:hAnsi="Cambria"/>
           <w:color w:val="000000"/>
@@ -959,7 +981,7 @@
           <w:numId w:val="2"/>
         </w:numPr>
         <w:spacing w:before="100" w:beforeAutospacing="1" w:after="100" w:afterAutospacing="1"/>
-        <w:divId w:val="2105179446"/>
+        <w:divId w:val="598099298"/>
         <w:rPr>
           <w:rFonts w:ascii="Cambria" w:hAnsi="Cambria"/>
           <w:color w:val="000000"/>
@@ -1039,7 +1061,7 @@
           <w:numId w:val="2"/>
         </w:numPr>
         <w:spacing w:before="100" w:beforeAutospacing="1" w:after="100" w:afterAutospacing="1"/>
-        <w:divId w:val="2105179446"/>
+        <w:divId w:val="598099298"/>
         <w:rPr>
           <w:rFonts w:ascii="Cambria" w:hAnsi="Cambria"/>
           <w:color w:val="000000"/>
@@ -1129,7 +1151,7 @@
           <w:numId w:val="2"/>
         </w:numPr>
         <w:spacing w:before="100" w:beforeAutospacing="1" w:after="100" w:afterAutospacing="1"/>
-        <w:divId w:val="2105179446"/>
+        <w:divId w:val="598099298"/>
         <w:rPr>
           <w:rFonts w:ascii="Cambria" w:hAnsi="Cambria"/>
           <w:color w:val="000000"/>
@@ -1209,7 +1231,7 @@
           <w:numId w:val="2"/>
         </w:numPr>
         <w:spacing w:before="100" w:beforeAutospacing="1" w:after="100" w:afterAutospacing="1"/>
-        <w:divId w:val="2105179446"/>
+        <w:divId w:val="598099298"/>
         <w:rPr>
           <w:rFonts w:ascii="Cambria" w:hAnsi="Cambria"/>
           <w:color w:val="000000"/>
@@ -1296,7 +1318,7 @@
       <w:pPr>
         <w:pStyle w:val="3"/>
         <w:spacing w:before="240"/>
-        <w:divId w:val="2105179446"/>
+        <w:divId w:val="598099298"/>
         <w:rPr>
           <w:rFonts w:ascii="Cambria" w:hAnsi="Cambria"/>
           <w:color w:val="000000"/>
@@ -1319,7 +1341,7 @@
           <w:numId w:val="3"/>
         </w:numPr>
         <w:spacing w:before="100" w:beforeAutospacing="1" w:after="100" w:afterAutospacing="1"/>
-        <w:divId w:val="2105179446"/>
+        <w:divId w:val="598099298"/>
         <w:rPr>
           <w:rFonts w:ascii="Cambria" w:hAnsi="Cambria"/>
           <w:color w:val="000000"/>
@@ -1378,7 +1400,7 @@
           <w:numId w:val="3"/>
         </w:numPr>
         <w:spacing w:before="100" w:beforeAutospacing="1" w:after="100" w:afterAutospacing="1"/>
-        <w:divId w:val="2105179446"/>
+        <w:divId w:val="598099298"/>
         <w:rPr>
           <w:rFonts w:ascii="Cambria" w:hAnsi="Cambria"/>
           <w:color w:val="000000"/>
@@ -1437,7 +1459,7 @@
           <w:numId w:val="3"/>
         </w:numPr>
         <w:spacing w:before="100" w:beforeAutospacing="1" w:after="100" w:afterAutospacing="1"/>
-        <w:divId w:val="2105179446"/>
+        <w:divId w:val="598099298"/>
         <w:rPr>
           <w:rFonts w:ascii="Cambria" w:hAnsi="Cambria"/>
           <w:color w:val="000000"/>
@@ -1493,7 +1515,7 @@
       <w:pPr>
         <w:pStyle w:val="3"/>
         <w:spacing w:before="240"/>
-        <w:divId w:val="2105179446"/>
+        <w:divId w:val="598099298"/>
         <w:rPr>
           <w:rFonts w:ascii="Cambria" w:hAnsi="Cambria"/>
           <w:color w:val="000000"/>
@@ -1516,7 +1538,7 @@
           <w:numId w:val="4"/>
         </w:numPr>
         <w:spacing w:before="100" w:beforeAutospacing="1" w:after="100" w:afterAutospacing="1"/>
-        <w:divId w:val="2105179446"/>
+        <w:divId w:val="598099298"/>
         <w:rPr>
           <w:rFonts w:ascii="Cambria" w:hAnsi="Cambria"/>
           <w:color w:val="000000"/>
@@ -1592,7 +1614,7 @@
     <w:p>
       <w:pPr>
         <w:pStyle w:val="2"/>
-        <w:divId w:val="2105179446"/>
+        <w:divId w:val="598099298"/>
         <w:rPr>
           <w:rFonts w:ascii="Cambria" w:hAnsi="Cambria"/>
           <w:color w:val="000000"/>
@@ -1612,7 +1634,7 @@
       <w:pPr>
         <w:pStyle w:val="3"/>
         <w:spacing w:before="240"/>
-        <w:divId w:val="2105179446"/>
+        <w:divId w:val="598099298"/>
         <w:rPr>
           <w:rFonts w:ascii="Cambria" w:hAnsi="Cambria"/>
           <w:color w:val="000000"/>
@@ -1635,7 +1657,7 @@
           <w:numId w:val="5"/>
         </w:numPr>
         <w:spacing w:before="100" w:beforeAutospacing="1" w:after="100" w:afterAutospacing="1"/>
-        <w:divId w:val="2105179446"/>
+        <w:divId w:val="598099298"/>
         <w:rPr>
           <w:rFonts w:ascii="Cambria" w:hAnsi="Cambria"/>
           <w:color w:val="000000"/>
@@ -1673,7 +1695,7 @@
           <w:numId w:val="5"/>
         </w:numPr>
         <w:spacing w:before="100" w:beforeAutospacing="1" w:after="100" w:afterAutospacing="1"/>
-        <w:divId w:val="2105179446"/>
+        <w:divId w:val="598099298"/>
         <w:rPr>
           <w:rFonts w:ascii="Cambria" w:hAnsi="Cambria"/>
           <w:color w:val="000000"/>
@@ -1708,7 +1730,7 @@
       <w:pPr>
         <w:pStyle w:val="3"/>
         <w:spacing w:before="240"/>
-        <w:divId w:val="2105179446"/>
+        <w:divId w:val="598099298"/>
         <w:rPr>
           <w:rFonts w:ascii="Cambria" w:hAnsi="Cambria"/>
           <w:color w:val="000000"/>
@@ -1731,7 +1753,7 @@
           <w:numId w:val="6"/>
         </w:numPr>
         <w:spacing w:before="100" w:beforeAutospacing="1" w:after="100" w:afterAutospacing="1"/>
-        <w:divId w:val="2105179446"/>
+        <w:divId w:val="598099298"/>
         <w:rPr>
           <w:rFonts w:ascii="Cambria" w:hAnsi="Cambria"/>
           <w:color w:val="000000"/>
@@ -1749,6 +1771,7 @@
           <w:szCs w:val="22"/>
           <w:lang w:val="en"/>
         </w:rPr>
+        <w:lastRenderedPageBreak/>
         <w:t>Park, H.</w:t>
       </w:r>
       <w:r>
@@ -1781,18 +1804,7 @@
           <w:lang w:val="en"/>
         </w:rPr>
         <w:br/>
-        <w:t xml:space="preserve">Micromobility Safety Challenges: A Study on Drivers Overtaking Bicycles and E-Scooters </w:t>
-      </w:r>
-      <w:r>
-        <w:rPr>
-          <w:rFonts w:ascii="Cambria" w:hAnsi="Cambria"/>
-          <w:color w:val="000000"/>
-          <w:sz w:val="22"/>
-          <w:szCs w:val="22"/>
-          <w:lang w:val="en"/>
-        </w:rPr>
-        <w:lastRenderedPageBreak/>
-        <w:t>according to Road Conditions and Cross-Modal Experience.</w:t>
+        <w:t>Micromobility Safety Challenges: A Study on Drivers Overtaking Bicycles and E-Scooters according to Road Conditions and Cross-Modal Experience.</w:t>
       </w:r>
       <w:r>
         <w:rPr>
@@ -1885,7 +1897,7 @@
           <w:numId w:val="6"/>
         </w:numPr>
         <w:spacing w:before="100" w:beforeAutospacing="1" w:after="100" w:afterAutospacing="1"/>
-        <w:divId w:val="2105179446"/>
+        <w:divId w:val="598099298"/>
         <w:rPr>
           <w:rFonts w:ascii="Cambria" w:hAnsi="Cambria"/>
           <w:color w:val="000000"/>
@@ -1976,7 +1988,7 @@
           <w:numId w:val="6"/>
         </w:numPr>
         <w:spacing w:before="100" w:beforeAutospacing="1" w:after="100" w:afterAutospacing="1"/>
-        <w:divId w:val="2105179446"/>
+        <w:divId w:val="598099298"/>
         <w:rPr>
           <w:rFonts w:ascii="Cambria" w:hAnsi="Cambria"/>
           <w:color w:val="000000"/>
@@ -2077,7 +2089,7 @@
           <w:numId w:val="6"/>
         </w:numPr>
         <w:spacing w:before="100" w:beforeAutospacing="1" w:after="100" w:afterAutospacing="1"/>
-        <w:divId w:val="2105179446"/>
+        <w:divId w:val="598099298"/>
         <w:rPr>
           <w:rFonts w:ascii="Cambria" w:hAnsi="Cambria"/>
           <w:color w:val="000000"/>
@@ -2168,7 +2180,7 @@
           <w:numId w:val="6"/>
         </w:numPr>
         <w:spacing w:before="100" w:beforeAutospacing="1" w:after="100" w:afterAutospacing="1"/>
-        <w:divId w:val="2105179446"/>
+        <w:divId w:val="598099298"/>
         <w:rPr>
           <w:rFonts w:ascii="Cambria" w:hAnsi="Cambria"/>
           <w:color w:val="000000"/>
@@ -2255,7 +2267,7 @@
     <w:p>
       <w:pPr>
         <w:pStyle w:val="2"/>
-        <w:divId w:val="2105179446"/>
+        <w:divId w:val="598099298"/>
         <w:rPr>
           <w:rFonts w:ascii="Cambria" w:hAnsi="Cambria"/>
           <w:color w:val="000000"/>
@@ -2288,7 +2300,7 @@
       </w:tblGrid>
       <w:tr>
         <w:trPr>
-          <w:divId w:val="2105179446"/>
+          <w:divId w:val="598099298"/>
         </w:trPr>
         <w:tc>
           <w:tcPr>
@@ -2359,7 +2371,7 @@
       </w:tr>
       <w:tr>
         <w:trPr>
-          <w:divId w:val="2105179446"/>
+          <w:divId w:val="598099298"/>
         </w:trPr>
         <w:tc>
           <w:tcPr>
@@ -2430,7 +2442,7 @@
       </w:tr>
       <w:tr>
         <w:trPr>
-          <w:divId w:val="2105179446"/>
+          <w:divId w:val="598099298"/>
         </w:trPr>
         <w:tc>
           <w:tcPr>
@@ -2501,7 +2513,7 @@
       </w:tr>
       <w:tr>
         <w:trPr>
-          <w:divId w:val="2105179446"/>
+          <w:divId w:val="598099298"/>
         </w:trPr>
         <w:tc>
           <w:tcPr>
@@ -2572,7 +2584,7 @@
       </w:tr>
       <w:tr>
         <w:trPr>
-          <w:divId w:val="2105179446"/>
+          <w:divId w:val="598099298"/>
         </w:trPr>
         <w:tc>
           <w:tcPr>
@@ -2643,7 +2655,7 @@
       </w:tr>
       <w:tr>
         <w:trPr>
-          <w:divId w:val="2105179446"/>
+          <w:divId w:val="598099298"/>
         </w:trPr>
         <w:tc>
           <w:tcPr>
@@ -2714,7 +2726,7 @@
       </w:tr>
       <w:tr>
         <w:trPr>
-          <w:divId w:val="2105179446"/>
+          <w:divId w:val="598099298"/>
         </w:trPr>
         <w:tc>
           <w:tcPr>
@@ -2785,7 +2797,7 @@
       </w:tr>
       <w:tr>
         <w:trPr>
-          <w:divId w:val="2105179446"/>
+          <w:divId w:val="598099298"/>
         </w:trPr>
         <w:tc>
           <w:tcPr>
@@ -2856,7 +2868,7 @@
       </w:tr>
       <w:tr>
         <w:trPr>
-          <w:divId w:val="2105179446"/>
+          <w:divId w:val="598099298"/>
         </w:trPr>
         <w:tc>
           <w:tcPr>
@@ -2928,7 +2940,7 @@
       </w:tr>
       <w:tr>
         <w:trPr>
-          <w:divId w:val="2105179446"/>
+          <w:divId w:val="598099298"/>
         </w:trPr>
         <w:tc>
           <w:tcPr>
@@ -3001,7 +3013,7 @@
     <w:p>
       <w:pPr>
         <w:pStyle w:val="2"/>
-        <w:divId w:val="2105179446"/>
+        <w:divId w:val="598099298"/>
         <w:rPr>
           <w:rFonts w:ascii="Cambria" w:hAnsi="Cambria"/>
           <w:color w:val="000000"/>
@@ -3021,7 +3033,7 @@
       <w:pPr>
         <w:pStyle w:val="3"/>
         <w:spacing w:before="240"/>
-        <w:divId w:val="2105179446"/>
+        <w:divId w:val="598099298"/>
         <w:rPr>
           <w:rFonts w:ascii="Cambria" w:hAnsi="Cambria"/>
           <w:color w:val="000000"/>
@@ -3054,7 +3066,7 @@
       </w:tblGrid>
       <w:tr>
         <w:trPr>
-          <w:divId w:val="2105179446"/>
+          <w:divId w:val="598099298"/>
         </w:trPr>
         <w:tc>
           <w:tcPr>
@@ -3155,7 +3167,7 @@
       <w:pPr>
         <w:pStyle w:val="3"/>
         <w:spacing w:before="240"/>
-        <w:divId w:val="2105179446"/>
+        <w:divId w:val="598099298"/>
         <w:rPr>
           <w:rFonts w:ascii="Cambria" w:hAnsi="Cambria"/>
           <w:color w:val="000000"/>
@@ -3188,7 +3200,7 @@
       </w:tblGrid>
       <w:tr>
         <w:trPr>
-          <w:divId w:val="2105179446"/>
+          <w:divId w:val="598099298"/>
         </w:trPr>
         <w:tc>
           <w:tcPr>
@@ -3288,7 +3300,7 @@
     <w:p>
       <w:pPr>
         <w:pStyle w:val="2"/>
-        <w:divId w:val="2105179446"/>
+        <w:divId w:val="598099298"/>
         <w:rPr>
           <w:rFonts w:ascii="Cambria" w:hAnsi="Cambria"/>
           <w:color w:val="000000"/>
@@ -3308,7 +3320,7 @@
       <w:pPr>
         <w:pStyle w:val="blank"/>
         <w:spacing w:before="60" w:beforeAutospacing="0" w:after="60" w:afterAutospacing="0"/>
-        <w:divId w:val="2105179446"/>
+        <w:divId w:val="598099298"/>
         <w:rPr>
           <w:rFonts w:ascii="Cambria" w:hAnsi="Cambria"/>
           <w:sz w:val="22"/>
@@ -3329,7 +3341,7 @@
     <w:p>
       <w:pPr>
         <w:pStyle w:val="2"/>
-        <w:divId w:val="2105179446"/>
+        <w:divId w:val="598099298"/>
         <w:rPr>
           <w:rFonts w:ascii="Cambria" w:hAnsi="Cambria"/>
           <w:color w:val="000000"/>
@@ -3362,7 +3374,7 @@
       </w:tblGrid>
       <w:tr>
         <w:trPr>
-          <w:divId w:val="2105179446"/>
+          <w:divId w:val="598099298"/>
         </w:trPr>
         <w:tc>
           <w:tcPr>
@@ -3443,7 +3455,7 @@
               <w:br/>
               <w:t xml:space="preserve">E-mail: </w:t>
             </w:r>
-            <w:hyperlink r:id="rId11" w:history="1">
+            <w:hyperlink r:id="rId12" w:history="1">
               <w:r>
                 <w:rPr>
                   <w:rStyle w:val="a3"/>
@@ -3491,7 +3503,7 @@
       </w:tr>
       <w:tr>
         <w:trPr>
-          <w:divId w:val="2105179446"/>
+          <w:divId w:val="598099298"/>
         </w:trPr>
         <w:tc>
           <w:tcPr>
@@ -3564,7 +3576,7 @@
       <w:pPr>
         <w:pStyle w:val="footer"/>
         <w:spacing w:after="60" w:afterAutospacing="0"/>
-        <w:divId w:val="2105179446"/>
+        <w:divId w:val="598099298"/>
         <w:rPr>
           <w:rFonts w:ascii="Cambria" w:hAnsi="Cambria"/>
           <w:color w:val="000000"/>
@@ -3635,9 +3647,9 @@
 <file path=word/numbering.xml><?xml version="1.0" encoding="utf-8"?>
 <w:numbering xmlns:wpc="http://schemas.microsoft.com/office/word/2010/wordprocessingCanvas" xmlns:cx="http://schemas.microsoft.com/office/drawing/2014/chartex" xmlns:cx1="http://schemas.microsoft.com/office/drawing/2015/9/8/chartex" xmlns:cx2="http://schemas.microsoft.com/office/drawing/2015/10/21/chartex" xmlns:cx3="http://schemas.microsoft.com/office/drawing/2016/5/9/chartex" xmlns:cx4="http://schemas.microsoft.com/office/drawing/2016/5/10/chartex" xmlns:cx5="http://schemas.microsoft.com/office/drawing/2016/5/11/chartex" xmlns:cx6="http://schemas.microsoft.com/office/drawing/2016/5/12/chartex" xmlns:cx7="http://schemas.microsoft.com/office/drawing/2016/5/13/chartex" xmlns:cx8="http://schemas.microsoft.com/office/drawing/2016/5/14/chartex" xmlns:mc="http://schemas.openxmlformats.org/markup-compatibility/2006" xmlns:aink="http://schemas.microsoft.com/office/drawing/2016/ink" xmlns:am3d="http://schemas.microsoft.com/office/drawing/2017/model3d" xmlns:o="urn:schemas-microsoft-com:office:office" xmlns:oel="http://schemas.microsoft.com/office/2019/extlst" xmlns:r="http://schemas.openxmlformats.org/officeDocument/2006/relationships" xmlns:m="http://schemas.openxmlformats.org/officeDocument/2006/math" xmlns:v="urn:schemas-microsoft-com:vml" xmlns:wp14="http://schemas.microsoft.com/office/word/2010/wordprocessingDrawing" xmlns:wp="http://schemas.openxmlformats.org/drawingml/2006/wordprocessingDrawing" xmlns:w10="urn:schemas-microsoft-com:office:word" xmlns:w="http://schemas.openxmlformats.org/wordprocessingml/2006/main" xmlns:w14="http://schemas.microsoft.com/office/word/2010/wordml" xmlns:w15="http://schemas.microsoft.com/office/word/2012/wordml" xmlns:w16cex="http://schemas.microsoft.com/office/word/2018/wordml/cex" xmlns:w16cid="http://schemas.microsoft.com/office/word/2016/wordml/cid" xmlns:w16="http://schemas.microsoft.com/office/word/2018/wordml" xmlns:w16du="http://schemas.microsoft.com/office/word/2023/wordml/word16du" xmlns:w16sdtdh="http://schemas.microsoft.com/office/word/2020/wordml/sdtdatahash" xmlns:w16sdtfl="http://schemas.microsoft.com/office/word/2024/wordml/sdtformatlock" xmlns:w16se="http://schemas.microsoft.com/office/word/2015/wordml/symex" xmlns:wpg="http://schemas.microsoft.com/office/word/2010/wordprocessingGroup" xmlns:wpi="http://schemas.microsoft.com/office/word/2010/wordprocessingInk" xmlns:wne="http://schemas.microsoft.com/office/word/2006/wordml" xmlns:wps="http://schemas.microsoft.com/office/word/2010/wordprocessingShape" mc:Ignorable="w14 w15 w16se w16cid w16 w16cex w16sdtdh w16sdtfl w16du wp14">
   <w:abstractNum w:abstractNumId="0" w15:restartNumberingAfterBreak="0">
-    <w:nsid w:val="17C2236A"/>
+    <w:nsid w:val="11A2282A"/>
     <w:multiLevelType w:val="multilevel"/>
-    <w:tmpl w:val="9E86F4B8"/>
+    <w:tmpl w:val="1A8259B4"/>
     <w:lvl w:ilvl="0">
       <w:start w:val="1"/>
       <w:numFmt w:val="decimal"/>
@@ -3748,9 +3760,9 @@
     </w:lvl>
   </w:abstractNum>
   <w:abstractNum w:abstractNumId="1" w15:restartNumberingAfterBreak="0">
-    <w:nsid w:val="464C0835"/>
+    <w:nsid w:val="40704A4C"/>
     <w:multiLevelType w:val="multilevel"/>
-    <w:tmpl w:val="26B8D9D0"/>
+    <w:tmpl w:val="EFB233F2"/>
     <w:lvl w:ilvl="0">
       <w:start w:val="1"/>
       <w:numFmt w:val="decimal"/>
@@ -3861,9 +3873,9 @@
     </w:lvl>
   </w:abstractNum>
   <w:abstractNum w:abstractNumId="2" w15:restartNumberingAfterBreak="0">
-    <w:nsid w:val="48256A8D"/>
+    <w:nsid w:val="6BCD68FF"/>
     <w:multiLevelType w:val="multilevel"/>
-    <w:tmpl w:val="F00A5DD2"/>
+    <w:tmpl w:val="4E323FBA"/>
     <w:lvl w:ilvl="0">
       <w:start w:val="1"/>
       <w:numFmt w:val="decimal"/>
@@ -3974,9 +3986,9 @@
     </w:lvl>
   </w:abstractNum>
   <w:abstractNum w:abstractNumId="3" w15:restartNumberingAfterBreak="0">
-    <w:nsid w:val="4AB13784"/>
+    <w:nsid w:val="6CF37856"/>
     <w:multiLevelType w:val="multilevel"/>
-    <w:tmpl w:val="23340C60"/>
+    <w:tmpl w:val="81F4D1E0"/>
     <w:lvl w:ilvl="0">
       <w:start w:val="1"/>
       <w:numFmt w:val="decimal"/>
@@ -4087,9 +4099,9 @@
     </w:lvl>
   </w:abstractNum>
   <w:abstractNum w:abstractNumId="4" w15:restartNumberingAfterBreak="0">
-    <w:nsid w:val="52747A4E"/>
+    <w:nsid w:val="6E5570CC"/>
     <w:multiLevelType w:val="multilevel"/>
-    <w:tmpl w:val="909EA91A"/>
+    <w:tmpl w:val="00506742"/>
     <w:lvl w:ilvl="0">
       <w:start w:val="1"/>
       <w:numFmt w:val="decimal"/>
@@ -4200,9 +4212,9 @@
     </w:lvl>
   </w:abstractNum>
   <w:abstractNum w:abstractNumId="5" w15:restartNumberingAfterBreak="0">
-    <w:nsid w:val="70E95BA5"/>
+    <w:nsid w:val="7FED6EAE"/>
     <w:multiLevelType w:val="multilevel"/>
-    <w:tmpl w:val="182CB468"/>
+    <w:tmpl w:val="8DFEBEF8"/>
     <w:lvl w:ilvl="0">
       <w:start w:val="1"/>
       <w:numFmt w:val="decimal"/>
@@ -4312,23 +4324,23 @@
       </w:pPr>
     </w:lvl>
   </w:abstractNum>
-  <w:num w:numId="1" w16cid:durableId="1318657050">
+  <w:num w:numId="1" w16cid:durableId="264725816">
+    <w:abstractNumId w:val="2"/>
+  </w:num>
+  <w:num w:numId="2" w16cid:durableId="1920208468">
+    <w:abstractNumId w:val="4"/>
+  </w:num>
+  <w:num w:numId="3" w16cid:durableId="90128962">
+    <w:abstractNumId w:val="3"/>
+  </w:num>
+  <w:num w:numId="4" w16cid:durableId="1870600369">
+    <w:abstractNumId w:val="0"/>
+  </w:num>
+  <w:num w:numId="5" w16cid:durableId="1907571730">
     <w:abstractNumId w:val="5"/>
   </w:num>
-  <w:num w:numId="2" w16cid:durableId="1659579806">
-    <w:abstractNumId w:val="2"/>
-  </w:num>
-  <w:num w:numId="3" w16cid:durableId="1067192586">
+  <w:num w:numId="6" w16cid:durableId="501552757">
     <w:abstractNumId w:val="1"/>
-  </w:num>
-  <w:num w:numId="4" w16cid:durableId="1629362487">
-    <w:abstractNumId w:val="4"/>
-  </w:num>
-  <w:num w:numId="5" w16cid:durableId="1754010079">
-    <w:abstractNumId w:val="0"/>
-  </w:num>
-  <w:num w:numId="6" w16cid:durableId="176164538">
-    <w:abstractNumId w:val="3"/>
   </w:num>
 </w:numbering>
 </file>
@@ -5076,7 +5088,7 @@
     <w:link w:val="Char"/>
     <w:uiPriority w:val="99"/>
     <w:unhideWhenUsed/>
-    <w:rsid w:val="00460CAB"/>
+    <w:rsid w:val="00FA2D95"/>
     <w:pPr>
       <w:tabs>
         <w:tab w:val="center" w:pos="4513"/>
@@ -5090,7 +5102,7 @@
     <w:basedOn w:val="a0"/>
     <w:link w:val="a8"/>
     <w:uiPriority w:val="99"/>
-    <w:rsid w:val="00460CAB"/>
+    <w:rsid w:val="00FA2D95"/>
     <w:rPr>
       <w:rFonts w:ascii="굴림" w:eastAsia="굴림" w:hAnsi="굴림" w:cs="굴림"/>
       <w:sz w:val="24"/>
@@ -5103,7 +5115,7 @@
     <w:link w:val="Char0"/>
     <w:uiPriority w:val="99"/>
     <w:unhideWhenUsed/>
-    <w:rsid w:val="00460CAB"/>
+    <w:rsid w:val="00FA2D95"/>
     <w:pPr>
       <w:tabs>
         <w:tab w:val="center" w:pos="4513"/>
@@ -5117,7 +5129,7 @@
     <w:basedOn w:val="a0"/>
     <w:link w:val="a9"/>
     <w:uiPriority w:val="99"/>
-    <w:rsid w:val="00460CAB"/>
+    <w:rsid w:val="00FA2D95"/>
     <w:rPr>
       <w:rFonts w:ascii="굴림" w:eastAsia="굴림" w:hAnsi="굴림" w:cs="굴림"/>
       <w:sz w:val="24"/>

</xml_diff>

<commit_message>
CV: split KITS dates; reorder under-review with first-author first
</commit_message>
<xml_diff>
--- a/Curriculum_Vitae_Hyunchul_Park.docx
+++ b/Curriculum_Vitae_Hyunchul_Park.docx
@@ -5,7 +5,7 @@
     <w:p>
       <w:pPr>
         <w:pStyle w:val="1"/>
-        <w:divId w:val="598099298"/>
+        <w:divId w:val="2123187493"/>
         <w:rPr>
           <w:rFonts w:ascii="Cambria" w:hAnsi="Cambria"/>
           <w:color w:val="000000"/>
@@ -24,7 +24,7 @@
     <w:p>
       <w:pPr>
         <w:pStyle w:val="topbio"/>
-        <w:divId w:val="598099298"/>
+        <w:divId w:val="2123187493"/>
         <w:rPr>
           <w:rFonts w:ascii="Cambria" w:hAnsi="Cambria"/>
           <w:color w:val="000000"/>
@@ -47,7 +47,7 @@
     <w:p>
       <w:pPr>
         <w:pStyle w:val="topbio"/>
-        <w:divId w:val="598099298"/>
+        <w:divId w:val="2123187493"/>
         <w:rPr>
           <w:rFonts w:ascii="Cambria" w:hAnsi="Cambria"/>
           <w:color w:val="000000"/>
@@ -70,7 +70,7 @@
     <w:p>
       <w:pPr>
         <w:pStyle w:val="contact"/>
-        <w:divId w:val="598099298"/>
+        <w:divId w:val="2123187493"/>
         <w:rPr>
           <w:rFonts w:ascii="Cambria" w:hAnsi="Cambria"/>
           <w:color w:val="000000"/>
@@ -106,7 +106,7 @@
     <w:p>
       <w:pPr>
         <w:pStyle w:val="contact"/>
-        <w:divId w:val="598099298"/>
+        <w:divId w:val="2123187493"/>
         <w:rPr>
           <w:rFonts w:ascii="Cambria" w:hAnsi="Cambria"/>
           <w:color w:val="000000"/>
@@ -142,7 +142,7 @@
     <w:p>
       <w:pPr>
         <w:pStyle w:val="2"/>
-        <w:divId w:val="598099298"/>
+        <w:divId w:val="2123187493"/>
         <w:rPr>
           <w:rFonts w:ascii="Cambria" w:hAnsi="Cambria"/>
           <w:color w:val="000000"/>
@@ -175,7 +175,7 @@
       </w:tblGrid>
       <w:tr>
         <w:trPr>
-          <w:divId w:val="598099298"/>
+          <w:divId w:val="2123187493"/>
         </w:trPr>
         <w:tc>
           <w:tcPr>
@@ -294,7 +294,7 @@
       </w:tr>
       <w:tr>
         <w:trPr>
-          <w:divId w:val="598099298"/>
+          <w:divId w:val="2123187493"/>
         </w:trPr>
         <w:tc>
           <w:tcPr>
@@ -413,7 +413,7 @@
       </w:tr>
       <w:tr>
         <w:trPr>
-          <w:divId w:val="598099298"/>
+          <w:divId w:val="2123187493"/>
         </w:trPr>
         <w:tc>
           <w:tcPr>
@@ -497,7 +497,7 @@
     <w:p>
       <w:pPr>
         <w:pStyle w:val="2"/>
-        <w:divId w:val="598099298"/>
+        <w:divId w:val="2123187493"/>
         <w:rPr>
           <w:rFonts w:ascii="Cambria" w:hAnsi="Cambria"/>
           <w:color w:val="000000"/>
@@ -516,7 +516,7 @@
     <w:p>
       <w:pPr>
         <w:pStyle w:val="a6"/>
-        <w:divId w:val="598099298"/>
+        <w:divId w:val="2123187493"/>
         <w:rPr>
           <w:rFonts w:ascii="Cambria" w:hAnsi="Cambria"/>
           <w:color w:val="000000"/>
@@ -539,7 +539,7 @@
     <w:p>
       <w:pPr>
         <w:pStyle w:val="2"/>
-        <w:divId w:val="598099298"/>
+        <w:divId w:val="2123187493"/>
         <w:rPr>
           <w:rFonts w:ascii="Cambria" w:hAnsi="Cambria"/>
           <w:color w:val="000000"/>
@@ -559,7 +559,7 @@
       <w:pPr>
         <w:pStyle w:val="blank"/>
         <w:spacing w:before="60" w:beforeAutospacing="0" w:after="120" w:afterAutospacing="0"/>
-        <w:divId w:val="598099298"/>
+        <w:divId w:val="2123187493"/>
         <w:rPr>
           <w:rFonts w:ascii="Cambria" w:hAnsi="Cambria"/>
           <w:sz w:val="19"/>
@@ -611,7 +611,7 @@
       <w:pPr>
         <w:pStyle w:val="3"/>
         <w:spacing w:before="240"/>
-        <w:divId w:val="598099298"/>
+        <w:divId w:val="2123187493"/>
         <w:rPr>
           <w:rFonts w:ascii="Cambria" w:hAnsi="Cambria"/>
           <w:color w:val="000000"/>
@@ -634,7 +634,7 @@
           <w:numId w:val="1"/>
         </w:numPr>
         <w:spacing w:before="100" w:beforeAutospacing="1" w:after="100" w:afterAutospacing="1"/>
-        <w:divId w:val="598099298"/>
+        <w:divId w:val="2123187493"/>
         <w:rPr>
           <w:rFonts w:ascii="Cambria" w:hAnsi="Cambria"/>
           <w:color w:val="000000"/>
@@ -746,7 +746,7 @@
           <w:numId w:val="1"/>
         </w:numPr>
         <w:spacing w:before="100" w:beforeAutospacing="1" w:after="100" w:afterAutospacing="1"/>
-        <w:divId w:val="598099298"/>
+        <w:divId w:val="2123187493"/>
         <w:rPr>
           <w:rFonts w:ascii="Cambria" w:hAnsi="Cambria"/>
           <w:color w:val="000000"/>
@@ -859,7 +859,7 @@
           <w:numId w:val="1"/>
         </w:numPr>
         <w:spacing w:before="100" w:beforeAutospacing="1" w:after="100" w:afterAutospacing="1"/>
-        <w:divId w:val="598099298"/>
+        <w:divId w:val="2123187493"/>
         <w:rPr>
           <w:rFonts w:ascii="Cambria" w:hAnsi="Cambria"/>
           <w:color w:val="000000"/>
@@ -958,7 +958,7 @@
       <w:pPr>
         <w:pStyle w:val="3"/>
         <w:spacing w:before="240"/>
-        <w:divId w:val="598099298"/>
+        <w:divId w:val="2123187493"/>
         <w:rPr>
           <w:rFonts w:ascii="Cambria" w:hAnsi="Cambria"/>
           <w:color w:val="000000"/>
@@ -981,7 +981,7 @@
           <w:numId w:val="2"/>
         </w:numPr>
         <w:spacing w:before="100" w:beforeAutospacing="1" w:after="100" w:afterAutospacing="1"/>
-        <w:divId w:val="598099298"/>
+        <w:divId w:val="2123187493"/>
         <w:rPr>
           <w:rFonts w:ascii="Cambria" w:hAnsi="Cambria"/>
           <w:color w:val="000000"/>
@@ -1061,25 +1061,15 @@
           <w:numId w:val="2"/>
         </w:numPr>
         <w:spacing w:before="100" w:beforeAutospacing="1" w:after="100" w:afterAutospacing="1"/>
-        <w:divId w:val="598099298"/>
-        <w:rPr>
-          <w:rFonts w:ascii="Cambria" w:hAnsi="Cambria"/>
-          <w:color w:val="000000"/>
-          <w:sz w:val="22"/>
-          <w:szCs w:val="22"/>
-          <w:lang w:val="en"/>
-        </w:rPr>
-      </w:pPr>
-      <w:r>
-        <w:rPr>
-          <w:rFonts w:ascii="Cambria" w:hAnsi="Cambria"/>
-          <w:color w:val="000000"/>
-          <w:sz w:val="22"/>
-          <w:szCs w:val="22"/>
-          <w:lang w:val="en"/>
-        </w:rPr>
-        <w:t xml:space="preserve">Baek, J., Kim, J., </w:t>
-      </w:r>
+        <w:divId w:val="2123187493"/>
+        <w:rPr>
+          <w:rFonts w:ascii="Cambria" w:hAnsi="Cambria"/>
+          <w:color w:val="000000"/>
+          <w:sz w:val="22"/>
+          <w:szCs w:val="22"/>
+          <w:lang w:val="en"/>
+        </w:rPr>
+      </w:pPr>
       <w:r>
         <w:rPr>
           <w:rStyle w:val="me3"/>
@@ -1099,7 +1089,7 @@
           <w:szCs w:val="22"/>
           <w:lang w:val="en"/>
         </w:rPr>
-        <w:t>, &amp; Kim, I.</w:t>
+        <w:t>, Oh, T., Liu, Y., &amp; Kim, I.</w:t>
       </w:r>
       <w:r>
         <w:rPr>
@@ -1120,7 +1110,7 @@
           <w:szCs w:val="22"/>
           <w:lang w:val="en"/>
         </w:rPr>
-        <w:t xml:space="preserve"> (2026). How Age-Related Constraints Reshape Transport Disadvantage in Railway Information Systems: Evidence from Virtual Aging Simulation. Submitted to </w:t>
+        <w:t xml:space="preserve"> (2026). Aggressiveness-Calibrated Adversarial Reinforcement Learning for Safety Evaluation of Highway Autonomous Vehicles. Submitted to </w:t>
       </w:r>
       <w:r>
         <w:rPr>
@@ -1131,7 +1121,7 @@
           <w:szCs w:val="22"/>
           <w:lang w:val="en"/>
         </w:rPr>
-        <w:t>Journal of Urban Mobility</w:t>
+        <w:t>Accident Analysis &amp; Prevention</w:t>
       </w:r>
       <w:r>
         <w:rPr>
@@ -1151,15 +1141,25 @@
           <w:numId w:val="2"/>
         </w:numPr>
         <w:spacing w:before="100" w:beforeAutospacing="1" w:after="100" w:afterAutospacing="1"/>
-        <w:divId w:val="598099298"/>
-        <w:rPr>
-          <w:rFonts w:ascii="Cambria" w:hAnsi="Cambria"/>
-          <w:color w:val="000000"/>
-          <w:sz w:val="22"/>
-          <w:szCs w:val="22"/>
-          <w:lang w:val="en"/>
-        </w:rPr>
-      </w:pPr>
+        <w:divId w:val="2123187493"/>
+        <w:rPr>
+          <w:rFonts w:ascii="Cambria" w:hAnsi="Cambria"/>
+          <w:color w:val="000000"/>
+          <w:sz w:val="22"/>
+          <w:szCs w:val="22"/>
+          <w:lang w:val="en"/>
+        </w:rPr>
+      </w:pPr>
+      <w:r>
+        <w:rPr>
+          <w:rFonts w:ascii="Cambria" w:hAnsi="Cambria"/>
+          <w:color w:val="000000"/>
+          <w:sz w:val="22"/>
+          <w:szCs w:val="22"/>
+          <w:lang w:val="en"/>
+        </w:rPr>
+        <w:t xml:space="preserve">Baek, J., Kim, J., </w:t>
+      </w:r>
       <w:r>
         <w:rPr>
           <w:rStyle w:val="me3"/>
@@ -1179,7 +1179,7 @@
           <w:szCs w:val="22"/>
           <w:lang w:val="en"/>
         </w:rPr>
-        <w:t>, Oh, T., Liu, Y., &amp; Kim, I.</w:t>
+        <w:t>, &amp; Kim, I.</w:t>
       </w:r>
       <w:r>
         <w:rPr>
@@ -1200,7 +1200,7 @@
           <w:szCs w:val="22"/>
           <w:lang w:val="en"/>
         </w:rPr>
-        <w:t xml:space="preserve"> (2026). Aggressiveness-Calibrated Adversarial Reinforcement Learning for Safety Evaluation of Highway Autonomous Vehicles. Submitted to </w:t>
+        <w:t xml:space="preserve"> (2026). How Age-Related Constraints Reshape Transport Disadvantage in Railway Information Systems: Evidence from Virtual Aging Simulation. Submitted to </w:t>
       </w:r>
       <w:r>
         <w:rPr>
@@ -1211,7 +1211,7 @@
           <w:szCs w:val="22"/>
           <w:lang w:val="en"/>
         </w:rPr>
-        <w:t>Accident Analysis &amp; Prevention</w:t>
+        <w:t>Journal of Urban Mobility</w:t>
       </w:r>
       <w:r>
         <w:rPr>
@@ -1231,7 +1231,7 @@
           <w:numId w:val="2"/>
         </w:numPr>
         <w:spacing w:before="100" w:beforeAutospacing="1" w:after="100" w:afterAutospacing="1"/>
-        <w:divId w:val="598099298"/>
+        <w:divId w:val="2123187493"/>
         <w:rPr>
           <w:rFonts w:ascii="Cambria" w:hAnsi="Cambria"/>
           <w:color w:val="000000"/>
@@ -1318,7 +1318,7 @@
       <w:pPr>
         <w:pStyle w:val="3"/>
         <w:spacing w:before="240"/>
-        <w:divId w:val="598099298"/>
+        <w:divId w:val="2123187493"/>
         <w:rPr>
           <w:rFonts w:ascii="Cambria" w:hAnsi="Cambria"/>
           <w:color w:val="000000"/>
@@ -1341,7 +1341,7 @@
           <w:numId w:val="3"/>
         </w:numPr>
         <w:spacing w:before="100" w:beforeAutospacing="1" w:after="100" w:afterAutospacing="1"/>
-        <w:divId w:val="598099298"/>
+        <w:divId w:val="2123187493"/>
         <w:rPr>
           <w:rFonts w:ascii="Cambria" w:hAnsi="Cambria"/>
           <w:color w:val="000000"/>
@@ -1400,7 +1400,7 @@
           <w:numId w:val="3"/>
         </w:numPr>
         <w:spacing w:before="100" w:beforeAutospacing="1" w:after="100" w:afterAutospacing="1"/>
-        <w:divId w:val="598099298"/>
+        <w:divId w:val="2123187493"/>
         <w:rPr>
           <w:rFonts w:ascii="Cambria" w:hAnsi="Cambria"/>
           <w:color w:val="000000"/>
@@ -1459,7 +1459,7 @@
           <w:numId w:val="3"/>
         </w:numPr>
         <w:spacing w:before="100" w:beforeAutospacing="1" w:after="100" w:afterAutospacing="1"/>
-        <w:divId w:val="598099298"/>
+        <w:divId w:val="2123187493"/>
         <w:rPr>
           <w:rFonts w:ascii="Cambria" w:hAnsi="Cambria"/>
           <w:color w:val="000000"/>
@@ -1515,7 +1515,7 @@
       <w:pPr>
         <w:pStyle w:val="3"/>
         <w:spacing w:before="240"/>
-        <w:divId w:val="598099298"/>
+        <w:divId w:val="2123187493"/>
         <w:rPr>
           <w:rFonts w:ascii="Cambria" w:hAnsi="Cambria"/>
           <w:color w:val="000000"/>
@@ -1538,7 +1538,7 @@
           <w:numId w:val="4"/>
         </w:numPr>
         <w:spacing w:before="100" w:beforeAutospacing="1" w:after="100" w:afterAutospacing="1"/>
-        <w:divId w:val="598099298"/>
+        <w:divId w:val="2123187493"/>
         <w:rPr>
           <w:rFonts w:ascii="Cambria" w:hAnsi="Cambria"/>
           <w:color w:val="000000"/>
@@ -1614,7 +1614,7 @@
     <w:p>
       <w:pPr>
         <w:pStyle w:val="2"/>
-        <w:divId w:val="598099298"/>
+        <w:divId w:val="2123187493"/>
         <w:rPr>
           <w:rFonts w:ascii="Cambria" w:hAnsi="Cambria"/>
           <w:color w:val="000000"/>
@@ -1634,7 +1634,7 @@
       <w:pPr>
         <w:pStyle w:val="3"/>
         <w:spacing w:before="240"/>
-        <w:divId w:val="598099298"/>
+        <w:divId w:val="2123187493"/>
         <w:rPr>
           <w:rFonts w:ascii="Cambria" w:hAnsi="Cambria"/>
           <w:color w:val="000000"/>
@@ -1657,7 +1657,7 @@
           <w:numId w:val="5"/>
         </w:numPr>
         <w:spacing w:before="100" w:beforeAutospacing="1" w:after="100" w:afterAutospacing="1"/>
-        <w:divId w:val="598099298"/>
+        <w:divId w:val="2123187493"/>
         <w:rPr>
           <w:rFonts w:ascii="Cambria" w:hAnsi="Cambria"/>
           <w:color w:val="000000"/>
@@ -1695,7 +1695,7 @@
           <w:numId w:val="5"/>
         </w:numPr>
         <w:spacing w:before="100" w:beforeAutospacing="1" w:after="100" w:afterAutospacing="1"/>
-        <w:divId w:val="598099298"/>
+        <w:divId w:val="2123187493"/>
         <w:rPr>
           <w:rFonts w:ascii="Cambria" w:hAnsi="Cambria"/>
           <w:color w:val="000000"/>
@@ -1730,7 +1730,7 @@
       <w:pPr>
         <w:pStyle w:val="3"/>
         <w:spacing w:before="240"/>
-        <w:divId w:val="598099298"/>
+        <w:divId w:val="2123187493"/>
         <w:rPr>
           <w:rFonts w:ascii="Cambria" w:hAnsi="Cambria"/>
           <w:color w:val="000000"/>
@@ -1753,7 +1753,7 @@
           <w:numId w:val="6"/>
         </w:numPr>
         <w:spacing w:before="100" w:beforeAutospacing="1" w:after="100" w:afterAutospacing="1"/>
-        <w:divId w:val="598099298"/>
+        <w:divId w:val="2123187493"/>
         <w:rPr>
           <w:rFonts w:ascii="Cambria" w:hAnsi="Cambria"/>
           <w:color w:val="000000"/>
@@ -1897,7 +1897,7 @@
           <w:numId w:val="6"/>
         </w:numPr>
         <w:spacing w:before="100" w:beforeAutospacing="1" w:after="100" w:afterAutospacing="1"/>
-        <w:divId w:val="598099298"/>
+        <w:divId w:val="2123187493"/>
         <w:rPr>
           <w:rFonts w:ascii="Cambria" w:hAnsi="Cambria"/>
           <w:color w:val="000000"/>
@@ -1988,7 +1988,7 @@
           <w:numId w:val="6"/>
         </w:numPr>
         <w:spacing w:before="100" w:beforeAutospacing="1" w:after="100" w:afterAutospacing="1"/>
-        <w:divId w:val="598099298"/>
+        <w:divId w:val="2123187493"/>
         <w:rPr>
           <w:rFonts w:ascii="Cambria" w:hAnsi="Cambria"/>
           <w:color w:val="000000"/>
@@ -2089,7 +2089,7 @@
           <w:numId w:val="6"/>
         </w:numPr>
         <w:spacing w:before="100" w:beforeAutospacing="1" w:after="100" w:afterAutospacing="1"/>
-        <w:divId w:val="598099298"/>
+        <w:divId w:val="2123187493"/>
         <w:rPr>
           <w:rFonts w:ascii="Cambria" w:hAnsi="Cambria"/>
           <w:color w:val="000000"/>
@@ -2180,7 +2180,7 @@
           <w:numId w:val="6"/>
         </w:numPr>
         <w:spacing w:before="100" w:beforeAutospacing="1" w:after="100" w:afterAutospacing="1"/>
-        <w:divId w:val="598099298"/>
+        <w:divId w:val="2123187493"/>
         <w:rPr>
           <w:rFonts w:ascii="Cambria" w:hAnsi="Cambria"/>
           <w:color w:val="000000"/>
@@ -2267,7 +2267,7 @@
     <w:p>
       <w:pPr>
         <w:pStyle w:val="2"/>
-        <w:divId w:val="598099298"/>
+        <w:divId w:val="2123187493"/>
         <w:rPr>
           <w:rFonts w:ascii="Cambria" w:hAnsi="Cambria"/>
           <w:color w:val="000000"/>
@@ -2295,12 +2295,12 @@
         <w:tblLook w:val="04A0" w:firstRow="1" w:lastRow="0" w:firstColumn="1" w:lastColumn="0" w:noHBand="0" w:noVBand="1"/>
       </w:tblPr>
       <w:tblGrid>
-        <w:gridCol w:w="6744"/>
-        <w:gridCol w:w="2282"/>
+        <w:gridCol w:w="7717"/>
+        <w:gridCol w:w="1309"/>
       </w:tblGrid>
       <w:tr>
         <w:trPr>
-          <w:divId w:val="598099298"/>
+          <w:divId w:val="2123187493"/>
         </w:trPr>
         <w:tc>
           <w:tcPr>
@@ -2371,7 +2371,7 @@
       </w:tr>
       <w:tr>
         <w:trPr>
-          <w:divId w:val="598099298"/>
+          <w:divId w:val="2123187493"/>
         </w:trPr>
         <w:tc>
           <w:tcPr>
@@ -2442,7 +2442,7 @@
       </w:tr>
       <w:tr>
         <w:trPr>
-          <w:divId w:val="598099298"/>
+          <w:divId w:val="2123187493"/>
         </w:trPr>
         <w:tc>
           <w:tcPr>
@@ -2513,7 +2513,7 @@
       </w:tr>
       <w:tr>
         <w:trPr>
-          <w:divId w:val="598099298"/>
+          <w:divId w:val="2123187493"/>
         </w:trPr>
         <w:tc>
           <w:tcPr>
@@ -2584,7 +2584,7 @@
       </w:tr>
       <w:tr>
         <w:trPr>
-          <w:divId w:val="598099298"/>
+          <w:divId w:val="2123187493"/>
         </w:trPr>
         <w:tc>
           <w:tcPr>
@@ -2655,7 +2655,7 @@
       </w:tr>
       <w:tr>
         <w:trPr>
-          <w:divId w:val="598099298"/>
+          <w:divId w:val="2123187493"/>
         </w:trPr>
         <w:tc>
           <w:tcPr>
@@ -2726,7 +2726,7 @@
       </w:tr>
       <w:tr>
         <w:trPr>
-          <w:divId w:val="598099298"/>
+          <w:divId w:val="2123187493"/>
         </w:trPr>
         <w:tc>
           <w:tcPr>
@@ -2797,7 +2797,7 @@
       </w:tr>
       <w:tr>
         <w:trPr>
-          <w:divId w:val="598099298"/>
+          <w:divId w:val="2123187493"/>
         </w:trPr>
         <w:tc>
           <w:tcPr>
@@ -2861,14 +2861,14 @@
                 <w:sz w:val="22"/>
                 <w:szCs w:val="22"/>
               </w:rPr>
-              <w:t>Apr. 2023, Oct. 2021</w:t>
+              <w:t>Apr. 2023</w:t>
             </w:r>
           </w:p>
         </w:tc>
       </w:tr>
       <w:tr>
         <w:trPr>
-          <w:divId w:val="598099298"/>
+          <w:divId w:val="2123187493"/>
         </w:trPr>
         <w:tc>
           <w:tcPr>
@@ -2899,7 +2899,7 @@
                 <w:szCs w:val="22"/>
               </w:rPr>
               <w:lastRenderedPageBreak/>
-              <w:t>UNIST Excellence Award (Marine Big Data Analysis Competition)</w:t>
+              <w:t>KITS Best Paper Award</w:t>
             </w:r>
           </w:p>
         </w:tc>
@@ -2933,14 +2933,14 @@
                 <w:sz w:val="22"/>
                 <w:szCs w:val="22"/>
               </w:rPr>
-              <w:t>Aug. 2021</w:t>
+              <w:t>Oct. 2021</w:t>
             </w:r>
           </w:p>
         </w:tc>
       </w:tr>
       <w:tr>
         <w:trPr>
-          <w:divId w:val="598099298"/>
+          <w:divId w:val="2123187493"/>
         </w:trPr>
         <w:tc>
           <w:tcPr>
@@ -2970,7 +2970,7 @@
                 <w:sz w:val="22"/>
                 <w:szCs w:val="22"/>
               </w:rPr>
-              <w:t>Kongju National University President's Award (Capstone) — rescue-drone proposal; patent opportunity</w:t>
+              <w:t>UNIST Excellence Award (Marine Big Data Analysis Competition)</w:t>
             </w:r>
           </w:p>
         </w:tc>
@@ -3004,6 +3004,77 @@
                 <w:sz w:val="22"/>
                 <w:szCs w:val="22"/>
               </w:rPr>
+              <w:t>Aug. 2021</w:t>
+            </w:r>
+          </w:p>
+        </w:tc>
+      </w:tr>
+      <w:tr>
+        <w:trPr>
+          <w:divId w:val="2123187493"/>
+        </w:trPr>
+        <w:tc>
+          <w:tcPr>
+            <w:tcW w:w="0" w:type="auto"/>
+            <w:tcMar>
+              <w:top w:w="120" w:type="dxa"/>
+              <w:left w:w="0" w:type="dxa"/>
+              <w:bottom w:w="120" w:type="dxa"/>
+              <w:right w:w="0" w:type="dxa"/>
+            </w:tcMar>
+            <w:hideMark/>
+          </w:tcPr>
+          <w:p>
+            <w:pPr>
+              <w:spacing w:before="120" w:after="200"/>
+              <w:rPr>
+                <w:rFonts w:ascii="Cambria" w:hAnsi="Cambria"/>
+                <w:color w:val="000000"/>
+                <w:sz w:val="22"/>
+                <w:szCs w:val="22"/>
+              </w:rPr>
+            </w:pPr>
+            <w:r>
+              <w:rPr>
+                <w:rFonts w:ascii="Cambria" w:hAnsi="Cambria"/>
+                <w:color w:val="000000"/>
+                <w:sz w:val="22"/>
+                <w:szCs w:val="22"/>
+              </w:rPr>
+              <w:t>Kongju National University President's Award (Capstone) — rescue-drone proposal; patent opportunity</w:t>
+            </w:r>
+          </w:p>
+        </w:tc>
+        <w:tc>
+          <w:tcPr>
+            <w:tcW w:w="50" w:type="pct"/>
+            <w:noWrap/>
+            <w:tcMar>
+              <w:top w:w="120" w:type="dxa"/>
+              <w:left w:w="360" w:type="dxa"/>
+              <w:bottom w:w="120" w:type="dxa"/>
+              <w:right w:w="0" w:type="dxa"/>
+            </w:tcMar>
+            <w:hideMark/>
+          </w:tcPr>
+          <w:p>
+            <w:pPr>
+              <w:spacing w:before="120" w:after="200"/>
+              <w:jc w:val="right"/>
+              <w:rPr>
+                <w:rFonts w:ascii="Cambria" w:hAnsi="Cambria"/>
+                <w:color w:val="000000"/>
+                <w:sz w:val="22"/>
+                <w:szCs w:val="22"/>
+              </w:rPr>
+            </w:pPr>
+            <w:r>
+              <w:rPr>
+                <w:rFonts w:ascii="Cambria" w:hAnsi="Cambria"/>
+                <w:color w:val="000000"/>
+                <w:sz w:val="22"/>
+                <w:szCs w:val="22"/>
+              </w:rPr>
               <w:t>Dec. 2020</w:t>
             </w:r>
           </w:p>
@@ -3013,7 +3084,7 @@
     <w:p>
       <w:pPr>
         <w:pStyle w:val="2"/>
-        <w:divId w:val="598099298"/>
+        <w:divId w:val="2123187493"/>
         <w:rPr>
           <w:rFonts w:ascii="Cambria" w:hAnsi="Cambria"/>
           <w:color w:val="000000"/>
@@ -3033,7 +3104,7 @@
       <w:pPr>
         <w:pStyle w:val="3"/>
         <w:spacing w:before="240"/>
-        <w:divId w:val="598099298"/>
+        <w:divId w:val="2123187493"/>
         <w:rPr>
           <w:rFonts w:ascii="Cambria" w:hAnsi="Cambria"/>
           <w:color w:val="000000"/>
@@ -3066,7 +3137,7 @@
       </w:tblGrid>
       <w:tr>
         <w:trPr>
-          <w:divId w:val="598099298"/>
+          <w:divId w:val="2123187493"/>
         </w:trPr>
         <w:tc>
           <w:tcPr>
@@ -3167,7 +3238,7 @@
       <w:pPr>
         <w:pStyle w:val="3"/>
         <w:spacing w:before="240"/>
-        <w:divId w:val="598099298"/>
+        <w:divId w:val="2123187493"/>
         <w:rPr>
           <w:rFonts w:ascii="Cambria" w:hAnsi="Cambria"/>
           <w:color w:val="000000"/>
@@ -3200,7 +3271,7 @@
       </w:tblGrid>
       <w:tr>
         <w:trPr>
-          <w:divId w:val="598099298"/>
+          <w:divId w:val="2123187493"/>
         </w:trPr>
         <w:tc>
           <w:tcPr>
@@ -3300,7 +3371,7 @@
     <w:p>
       <w:pPr>
         <w:pStyle w:val="2"/>
-        <w:divId w:val="598099298"/>
+        <w:divId w:val="2123187493"/>
         <w:rPr>
           <w:rFonts w:ascii="Cambria" w:hAnsi="Cambria"/>
           <w:color w:val="000000"/>
@@ -3320,7 +3391,7 @@
       <w:pPr>
         <w:pStyle w:val="blank"/>
         <w:spacing w:before="60" w:beforeAutospacing="0" w:after="60" w:afterAutospacing="0"/>
-        <w:divId w:val="598099298"/>
+        <w:divId w:val="2123187493"/>
         <w:rPr>
           <w:rFonts w:ascii="Cambria" w:hAnsi="Cambria"/>
           <w:sz w:val="22"/>
@@ -3341,7 +3412,7 @@
     <w:p>
       <w:pPr>
         <w:pStyle w:val="2"/>
-        <w:divId w:val="598099298"/>
+        <w:divId w:val="2123187493"/>
         <w:rPr>
           <w:rFonts w:ascii="Cambria" w:hAnsi="Cambria"/>
           <w:color w:val="000000"/>
@@ -3374,7 +3445,7 @@
       </w:tblGrid>
       <w:tr>
         <w:trPr>
-          <w:divId w:val="598099298"/>
+          <w:divId w:val="2123187493"/>
         </w:trPr>
         <w:tc>
           <w:tcPr>
@@ -3443,6 +3514,15 @@
                 <w:szCs w:val="22"/>
               </w:rPr>
               <w:br/>
+            </w:r>
+            <w:r>
+              <w:rPr>
+                <w:rFonts w:ascii="Cambria" w:hAnsi="Cambria"/>
+                <w:color w:val="000000"/>
+                <w:sz w:val="22"/>
+                <w:szCs w:val="22"/>
+              </w:rPr>
+              <w:lastRenderedPageBreak/>
               <w:t>Korea Advanced Institute of Science and Technology (KAIST)</w:t>
             </w:r>
             <w:r>
@@ -3503,7 +3583,7 @@
       </w:tr>
       <w:tr>
         <w:trPr>
-          <w:divId w:val="598099298"/>
+          <w:divId w:val="2123187493"/>
         </w:trPr>
         <w:tc>
           <w:tcPr>
@@ -3533,7 +3613,6 @@
                 <w:sz w:val="22"/>
                 <w:szCs w:val="22"/>
               </w:rPr>
-              <w:lastRenderedPageBreak/>
               <w:t>[Optional: add a second / third reference here — e.g., committee members, collaborators.]</w:t>
             </w:r>
             <w:r>
@@ -3576,7 +3655,7 @@
       <w:pPr>
         <w:pStyle w:val="footer"/>
         <w:spacing w:after="60" w:afterAutospacing="0"/>
-        <w:divId w:val="598099298"/>
+        <w:divId w:val="2123187493"/>
         <w:rPr>
           <w:rFonts w:ascii="Cambria" w:hAnsi="Cambria"/>
           <w:color w:val="000000"/>
@@ -3647,9 +3726,9 @@
 <file path=word/numbering.xml><?xml version="1.0" encoding="utf-8"?>
 <w:numbering xmlns:wpc="http://schemas.microsoft.com/office/word/2010/wordprocessingCanvas" xmlns:cx="http://schemas.microsoft.com/office/drawing/2014/chartex" xmlns:cx1="http://schemas.microsoft.com/office/drawing/2015/9/8/chartex" xmlns:cx2="http://schemas.microsoft.com/office/drawing/2015/10/21/chartex" xmlns:cx3="http://schemas.microsoft.com/office/drawing/2016/5/9/chartex" xmlns:cx4="http://schemas.microsoft.com/office/drawing/2016/5/10/chartex" xmlns:cx5="http://schemas.microsoft.com/office/drawing/2016/5/11/chartex" xmlns:cx6="http://schemas.microsoft.com/office/drawing/2016/5/12/chartex" xmlns:cx7="http://schemas.microsoft.com/office/drawing/2016/5/13/chartex" xmlns:cx8="http://schemas.microsoft.com/office/drawing/2016/5/14/chartex" xmlns:mc="http://schemas.openxmlformats.org/markup-compatibility/2006" xmlns:aink="http://schemas.microsoft.com/office/drawing/2016/ink" xmlns:am3d="http://schemas.microsoft.com/office/drawing/2017/model3d" xmlns:o="urn:schemas-microsoft-com:office:office" xmlns:oel="http://schemas.microsoft.com/office/2019/extlst" xmlns:r="http://schemas.openxmlformats.org/officeDocument/2006/relationships" xmlns:m="http://schemas.openxmlformats.org/officeDocument/2006/math" xmlns:v="urn:schemas-microsoft-com:vml" xmlns:wp14="http://schemas.microsoft.com/office/word/2010/wordprocessingDrawing" xmlns:wp="http://schemas.openxmlformats.org/drawingml/2006/wordprocessingDrawing" xmlns:w10="urn:schemas-microsoft-com:office:word" xmlns:w="http://schemas.openxmlformats.org/wordprocessingml/2006/main" xmlns:w14="http://schemas.microsoft.com/office/word/2010/wordml" xmlns:w15="http://schemas.microsoft.com/office/word/2012/wordml" xmlns:w16cex="http://schemas.microsoft.com/office/word/2018/wordml/cex" xmlns:w16cid="http://schemas.microsoft.com/office/word/2016/wordml/cid" xmlns:w16="http://schemas.microsoft.com/office/word/2018/wordml" xmlns:w16du="http://schemas.microsoft.com/office/word/2023/wordml/word16du" xmlns:w16sdtdh="http://schemas.microsoft.com/office/word/2020/wordml/sdtdatahash" xmlns:w16sdtfl="http://schemas.microsoft.com/office/word/2024/wordml/sdtformatlock" xmlns:w16se="http://schemas.microsoft.com/office/word/2015/wordml/symex" xmlns:wpg="http://schemas.microsoft.com/office/word/2010/wordprocessingGroup" xmlns:wpi="http://schemas.microsoft.com/office/word/2010/wordprocessingInk" xmlns:wne="http://schemas.microsoft.com/office/word/2006/wordml" xmlns:wps="http://schemas.microsoft.com/office/word/2010/wordprocessingShape" mc:Ignorable="w14 w15 w16se w16cid w16 w16cex w16sdtdh w16sdtfl w16du wp14">
   <w:abstractNum w:abstractNumId="0" w15:restartNumberingAfterBreak="0">
-    <w:nsid w:val="11A2282A"/>
+    <w:nsid w:val="0A5A418B"/>
     <w:multiLevelType w:val="multilevel"/>
-    <w:tmpl w:val="1A8259B4"/>
+    <w:tmpl w:val="51FA6FF6"/>
     <w:lvl w:ilvl="0">
       <w:start w:val="1"/>
       <w:numFmt w:val="decimal"/>
@@ -3760,9 +3839,9 @@
     </w:lvl>
   </w:abstractNum>
   <w:abstractNum w:abstractNumId="1" w15:restartNumberingAfterBreak="0">
-    <w:nsid w:val="40704A4C"/>
+    <w:nsid w:val="0F323595"/>
     <w:multiLevelType w:val="multilevel"/>
-    <w:tmpl w:val="EFB233F2"/>
+    <w:tmpl w:val="C8C6F17A"/>
     <w:lvl w:ilvl="0">
       <w:start w:val="1"/>
       <w:numFmt w:val="decimal"/>
@@ -3873,9 +3952,9 @@
     </w:lvl>
   </w:abstractNum>
   <w:abstractNum w:abstractNumId="2" w15:restartNumberingAfterBreak="0">
-    <w:nsid w:val="6BCD68FF"/>
+    <w:nsid w:val="41EB2614"/>
     <w:multiLevelType w:val="multilevel"/>
-    <w:tmpl w:val="4E323FBA"/>
+    <w:tmpl w:val="27705C50"/>
     <w:lvl w:ilvl="0">
       <w:start w:val="1"/>
       <w:numFmt w:val="decimal"/>
@@ -3986,9 +4065,9 @@
     </w:lvl>
   </w:abstractNum>
   <w:abstractNum w:abstractNumId="3" w15:restartNumberingAfterBreak="0">
-    <w:nsid w:val="6CF37856"/>
+    <w:nsid w:val="48B7600F"/>
     <w:multiLevelType w:val="multilevel"/>
-    <w:tmpl w:val="81F4D1E0"/>
+    <w:tmpl w:val="E6863090"/>
     <w:lvl w:ilvl="0">
       <w:start w:val="1"/>
       <w:numFmt w:val="decimal"/>
@@ -4099,9 +4178,9 @@
     </w:lvl>
   </w:abstractNum>
   <w:abstractNum w:abstractNumId="4" w15:restartNumberingAfterBreak="0">
-    <w:nsid w:val="6E5570CC"/>
+    <w:nsid w:val="4E694F1E"/>
     <w:multiLevelType w:val="multilevel"/>
-    <w:tmpl w:val="00506742"/>
+    <w:tmpl w:val="144AE0C8"/>
     <w:lvl w:ilvl="0">
       <w:start w:val="1"/>
       <w:numFmt w:val="decimal"/>
@@ -4212,9 +4291,9 @@
     </w:lvl>
   </w:abstractNum>
   <w:abstractNum w:abstractNumId="5" w15:restartNumberingAfterBreak="0">
-    <w:nsid w:val="7FED6EAE"/>
+    <w:nsid w:val="750D4889"/>
     <w:multiLevelType w:val="multilevel"/>
-    <w:tmpl w:val="8DFEBEF8"/>
+    <w:tmpl w:val="CD6C39B0"/>
     <w:lvl w:ilvl="0">
       <w:start w:val="1"/>
       <w:numFmt w:val="decimal"/>
@@ -4324,22 +4403,22 @@
       </w:pPr>
     </w:lvl>
   </w:abstractNum>
-  <w:num w:numId="1" w16cid:durableId="264725816">
+  <w:num w:numId="1" w16cid:durableId="2093768760">
+    <w:abstractNumId w:val="4"/>
+  </w:num>
+  <w:num w:numId="2" w16cid:durableId="1313556125">
+    <w:abstractNumId w:val="0"/>
+  </w:num>
+  <w:num w:numId="3" w16cid:durableId="2102409095">
     <w:abstractNumId w:val="2"/>
   </w:num>
-  <w:num w:numId="2" w16cid:durableId="1920208468">
-    <w:abstractNumId w:val="4"/>
+  <w:num w:numId="4" w16cid:durableId="1241603640">
+    <w:abstractNumId w:val="5"/>
   </w:num>
-  <w:num w:numId="3" w16cid:durableId="90128962">
+  <w:num w:numId="5" w16cid:durableId="779758020">
     <w:abstractNumId w:val="3"/>
   </w:num>
-  <w:num w:numId="4" w16cid:durableId="1870600369">
-    <w:abstractNumId w:val="0"/>
-  </w:num>
-  <w:num w:numId="5" w16cid:durableId="1907571730">
-    <w:abstractNumId w:val="5"/>
-  </w:num>
-  <w:num w:numId="6" w16cid:durableId="501552757">
+  <w:num w:numId="6" w16cid:durableId="1291738974">
     <w:abstractNumId w:val="1"/>
   </w:num>
 </w:numbering>
@@ -5088,7 +5167,7 @@
     <w:link w:val="Char"/>
     <w:uiPriority w:val="99"/>
     <w:unhideWhenUsed/>
-    <w:rsid w:val="00FA2D95"/>
+    <w:rsid w:val="003D2EF9"/>
     <w:pPr>
       <w:tabs>
         <w:tab w:val="center" w:pos="4513"/>
@@ -5102,7 +5181,7 @@
     <w:basedOn w:val="a0"/>
     <w:link w:val="a8"/>
     <w:uiPriority w:val="99"/>
-    <w:rsid w:val="00FA2D95"/>
+    <w:rsid w:val="003D2EF9"/>
     <w:rPr>
       <w:rFonts w:ascii="굴림" w:eastAsia="굴림" w:hAnsi="굴림" w:cs="굴림"/>
       <w:sz w:val="24"/>
@@ -5115,7 +5194,7 @@
     <w:link w:val="Char0"/>
     <w:uiPriority w:val="99"/>
     <w:unhideWhenUsed/>
-    <w:rsid w:val="00FA2D95"/>
+    <w:rsid w:val="003D2EF9"/>
     <w:pPr>
       <w:tabs>
         <w:tab w:val="center" w:pos="4513"/>
@@ -5129,7 +5208,7 @@
     <w:basedOn w:val="a0"/>
     <w:link w:val="a9"/>
     <w:uiPriority w:val="99"/>
-    <w:rsid w:val="00FA2D95"/>
+    <w:rsid w:val="003D2EF9"/>
     <w:rPr>
       <w:rFonts w:ascii="굴림" w:eastAsia="굴림" w:hAnsi="굴림" w:cs="굴림"/>
       <w:sz w:val="24"/>

</xml_diff>

<commit_message>
Update Aggressive AV paper title (scenario generation)
</commit_message>
<xml_diff>
--- a/Curriculum_Vitae_Hyunchul_Park.docx
+++ b/Curriculum_Vitae_Hyunchul_Park.docx
@@ -5,7 +5,7 @@
     <w:p>
       <w:pPr>
         <w:pStyle w:val="1"/>
-        <w:divId w:val="2123187493"/>
+        <w:divId w:val="1395353832"/>
         <w:rPr>
           <w:rFonts w:ascii="Cambria" w:hAnsi="Cambria"/>
           <w:color w:val="000000"/>
@@ -24,7 +24,7 @@
     <w:p>
       <w:pPr>
         <w:pStyle w:val="topbio"/>
-        <w:divId w:val="2123187493"/>
+        <w:divId w:val="1395353832"/>
         <w:rPr>
           <w:rFonts w:ascii="Cambria" w:hAnsi="Cambria"/>
           <w:color w:val="000000"/>
@@ -47,7 +47,7 @@
     <w:p>
       <w:pPr>
         <w:pStyle w:val="topbio"/>
-        <w:divId w:val="2123187493"/>
+        <w:divId w:val="1395353832"/>
         <w:rPr>
           <w:rFonts w:ascii="Cambria" w:hAnsi="Cambria"/>
           <w:color w:val="000000"/>
@@ -70,7 +70,7 @@
     <w:p>
       <w:pPr>
         <w:pStyle w:val="contact"/>
-        <w:divId w:val="2123187493"/>
+        <w:divId w:val="1395353832"/>
         <w:rPr>
           <w:rFonts w:ascii="Cambria" w:hAnsi="Cambria"/>
           <w:color w:val="000000"/>
@@ -89,7 +89,7 @@
         </w:rPr>
         <w:t xml:space="preserve">E-mail: </w:t>
       </w:r>
-      <w:hyperlink r:id="rId7" w:history="1">
+      <w:hyperlink r:id="rId5" w:history="1">
         <w:r>
           <w:rPr>
             <w:rFonts w:ascii="Cambria" w:hAnsi="Cambria"/>
@@ -106,7 +106,7 @@
     <w:p>
       <w:pPr>
         <w:pStyle w:val="contact"/>
-        <w:divId w:val="2123187493"/>
+        <w:divId w:val="1395353832"/>
         <w:rPr>
           <w:rFonts w:ascii="Cambria" w:hAnsi="Cambria"/>
           <w:color w:val="000000"/>
@@ -125,7 +125,7 @@
         </w:rPr>
         <w:t xml:space="preserve">Google Scholar: </w:t>
       </w:r>
-      <w:hyperlink r:id="rId8" w:history="1">
+      <w:hyperlink r:id="rId6" w:history="1">
         <w:r>
           <w:rPr>
             <w:rFonts w:ascii="Cambria" w:hAnsi="Cambria"/>
@@ -142,7 +142,7 @@
     <w:p>
       <w:pPr>
         <w:pStyle w:val="2"/>
-        <w:divId w:val="2123187493"/>
+        <w:divId w:val="1395353832"/>
         <w:rPr>
           <w:rFonts w:ascii="Cambria" w:hAnsi="Cambria"/>
           <w:color w:val="000000"/>
@@ -175,7 +175,7 @@
       </w:tblGrid>
       <w:tr>
         <w:trPr>
-          <w:divId w:val="2123187493"/>
+          <w:divId w:val="1395353832"/>
         </w:trPr>
         <w:tc>
           <w:tcPr>
@@ -294,7 +294,7 @@
       </w:tr>
       <w:tr>
         <w:trPr>
-          <w:divId w:val="2123187493"/>
+          <w:divId w:val="1395353832"/>
         </w:trPr>
         <w:tc>
           <w:tcPr>
@@ -413,7 +413,7 @@
       </w:tr>
       <w:tr>
         <w:trPr>
-          <w:divId w:val="2123187493"/>
+          <w:divId w:val="1395353832"/>
         </w:trPr>
         <w:tc>
           <w:tcPr>
@@ -497,7 +497,7 @@
     <w:p>
       <w:pPr>
         <w:pStyle w:val="2"/>
-        <w:divId w:val="2123187493"/>
+        <w:divId w:val="1395353832"/>
         <w:rPr>
           <w:rFonts w:ascii="Cambria" w:hAnsi="Cambria"/>
           <w:color w:val="000000"/>
@@ -516,7 +516,7 @@
     <w:p>
       <w:pPr>
         <w:pStyle w:val="a6"/>
-        <w:divId w:val="2123187493"/>
+        <w:divId w:val="1395353832"/>
         <w:rPr>
           <w:rFonts w:ascii="Cambria" w:hAnsi="Cambria"/>
           <w:color w:val="000000"/>
@@ -539,7 +539,7 @@
     <w:p>
       <w:pPr>
         <w:pStyle w:val="2"/>
-        <w:divId w:val="2123187493"/>
+        <w:divId w:val="1395353832"/>
         <w:rPr>
           <w:rFonts w:ascii="Cambria" w:hAnsi="Cambria"/>
           <w:color w:val="000000"/>
@@ -559,7 +559,7 @@
       <w:pPr>
         <w:pStyle w:val="blank"/>
         <w:spacing w:before="60" w:beforeAutospacing="0" w:after="120" w:afterAutospacing="0"/>
-        <w:divId w:val="2123187493"/>
+        <w:divId w:val="1395353832"/>
         <w:rPr>
           <w:rFonts w:ascii="Cambria" w:hAnsi="Cambria"/>
           <w:sz w:val="19"/>
@@ -611,7 +611,7 @@
       <w:pPr>
         <w:pStyle w:val="3"/>
         <w:spacing w:before="240"/>
-        <w:divId w:val="2123187493"/>
+        <w:divId w:val="1395353832"/>
         <w:rPr>
           <w:rFonts w:ascii="Cambria" w:hAnsi="Cambria"/>
           <w:color w:val="000000"/>
@@ -634,7 +634,7 @@
           <w:numId w:val="1"/>
         </w:numPr>
         <w:spacing w:before="100" w:beforeAutospacing="1" w:after="100" w:afterAutospacing="1"/>
-        <w:divId w:val="2123187493"/>
+        <w:divId w:val="1395353832"/>
         <w:rPr>
           <w:rFonts w:ascii="Cambria" w:hAnsi="Cambria"/>
           <w:color w:val="000000"/>
@@ -716,7 +716,7 @@
         </w:rPr>
         <w:t xml:space="preserve">. </w:t>
       </w:r>
-      <w:hyperlink r:id="rId9" w:history="1">
+      <w:hyperlink r:id="rId7" w:history="1">
         <w:r>
           <w:rPr>
             <w:rStyle w:val="a3"/>
@@ -746,24 +746,23 @@
           <w:numId w:val="1"/>
         </w:numPr>
         <w:spacing w:before="100" w:beforeAutospacing="1" w:after="100" w:afterAutospacing="1"/>
-        <w:divId w:val="2123187493"/>
-        <w:rPr>
-          <w:rFonts w:ascii="Cambria" w:hAnsi="Cambria"/>
-          <w:color w:val="000000"/>
-          <w:sz w:val="22"/>
-          <w:szCs w:val="22"/>
-          <w:lang w:val="en"/>
-        </w:rPr>
-      </w:pPr>
-      <w:r>
-        <w:rPr>
-          <w:rFonts w:ascii="Cambria" w:hAnsi="Cambria"/>
-          <w:color w:val="000000"/>
-          <w:sz w:val="22"/>
-          <w:szCs w:val="22"/>
-          <w:lang w:val="en"/>
-        </w:rPr>
-        <w:lastRenderedPageBreak/>
+        <w:divId w:val="1395353832"/>
+        <w:rPr>
+          <w:rFonts w:ascii="Cambria" w:hAnsi="Cambria"/>
+          <w:color w:val="000000"/>
+          <w:sz w:val="22"/>
+          <w:szCs w:val="22"/>
+          <w:lang w:val="en"/>
+        </w:rPr>
+      </w:pPr>
+      <w:r>
+        <w:rPr>
+          <w:rFonts w:ascii="Cambria" w:hAnsi="Cambria"/>
+          <w:color w:val="000000"/>
+          <w:sz w:val="22"/>
+          <w:szCs w:val="22"/>
+          <w:lang w:val="en"/>
+        </w:rPr>
         <w:t xml:space="preserve">Lim, J., </w:t>
       </w:r>
       <w:r>
@@ -829,7 +828,7 @@
         </w:rPr>
         <w:t xml:space="preserve">, 157, 106365. </w:t>
       </w:r>
-      <w:hyperlink r:id="rId10" w:history="1">
+      <w:hyperlink r:id="rId8" w:history="1">
         <w:r>
           <w:rPr>
             <w:rStyle w:val="a3"/>
@@ -859,7 +858,7 @@
           <w:numId w:val="1"/>
         </w:numPr>
         <w:spacing w:before="100" w:beforeAutospacing="1" w:after="100" w:afterAutospacing="1"/>
-        <w:divId w:val="2123187493"/>
+        <w:divId w:val="1395353832"/>
         <w:rPr>
           <w:rFonts w:ascii="Cambria" w:hAnsi="Cambria"/>
           <w:color w:val="000000"/>
@@ -931,7 +930,7 @@
         </w:rPr>
         <w:t xml:space="preserve">, 205, 107685. </w:t>
       </w:r>
-      <w:hyperlink r:id="rId11" w:history="1">
+      <w:hyperlink r:id="rId9" w:history="1">
         <w:r>
           <w:rPr>
             <w:rStyle w:val="a3"/>
@@ -958,7 +957,7 @@
       <w:pPr>
         <w:pStyle w:val="3"/>
         <w:spacing w:before="240"/>
-        <w:divId w:val="2123187493"/>
+        <w:divId w:val="1395353832"/>
         <w:rPr>
           <w:rFonts w:ascii="Cambria" w:hAnsi="Cambria"/>
           <w:color w:val="000000"/>
@@ -981,7 +980,7 @@
           <w:numId w:val="2"/>
         </w:numPr>
         <w:spacing w:before="100" w:beforeAutospacing="1" w:after="100" w:afterAutospacing="1"/>
-        <w:divId w:val="2123187493"/>
+        <w:divId w:val="1395353832"/>
         <w:rPr>
           <w:rFonts w:ascii="Cambria" w:hAnsi="Cambria"/>
           <w:color w:val="000000"/>
@@ -1061,7 +1060,7 @@
           <w:numId w:val="2"/>
         </w:numPr>
         <w:spacing w:before="100" w:beforeAutospacing="1" w:after="100" w:afterAutospacing="1"/>
-        <w:divId w:val="2123187493"/>
+        <w:divId w:val="1395353832"/>
         <w:rPr>
           <w:rFonts w:ascii="Cambria" w:hAnsi="Cambria"/>
           <w:color w:val="000000"/>
@@ -1110,7 +1109,7 @@
           <w:szCs w:val="22"/>
           <w:lang w:val="en"/>
         </w:rPr>
-        <w:t xml:space="preserve"> (2026). Aggressiveness-Calibrated Adversarial Reinforcement Learning for Safety Evaluation of Highway Autonomous Vehicles. Submitted to </w:t>
+        <w:t xml:space="preserve"> (2026). Aggressiveness-Calibrated Adversarial Scenario Generation for Highway Autonomous Vehicle Safety Evaluation. Submitted to </w:t>
       </w:r>
       <w:r>
         <w:rPr>
@@ -1141,7 +1140,7 @@
           <w:numId w:val="2"/>
         </w:numPr>
         <w:spacing w:before="100" w:beforeAutospacing="1" w:after="100" w:afterAutospacing="1"/>
-        <w:divId w:val="2123187493"/>
+        <w:divId w:val="1395353832"/>
         <w:rPr>
           <w:rFonts w:ascii="Cambria" w:hAnsi="Cambria"/>
           <w:color w:val="000000"/>
@@ -1231,7 +1230,7 @@
           <w:numId w:val="2"/>
         </w:numPr>
         <w:spacing w:before="100" w:beforeAutospacing="1" w:after="100" w:afterAutospacing="1"/>
-        <w:divId w:val="2123187493"/>
+        <w:divId w:val="1395353832"/>
         <w:rPr>
           <w:rFonts w:ascii="Cambria" w:hAnsi="Cambria"/>
           <w:color w:val="000000"/>
@@ -1318,7 +1317,7 @@
       <w:pPr>
         <w:pStyle w:val="3"/>
         <w:spacing w:before="240"/>
-        <w:divId w:val="2123187493"/>
+        <w:divId w:val="1395353832"/>
         <w:rPr>
           <w:rFonts w:ascii="Cambria" w:hAnsi="Cambria"/>
           <w:color w:val="000000"/>
@@ -1341,7 +1340,7 @@
           <w:numId w:val="3"/>
         </w:numPr>
         <w:spacing w:before="100" w:beforeAutospacing="1" w:after="100" w:afterAutospacing="1"/>
-        <w:divId w:val="2123187493"/>
+        <w:divId w:val="1395353832"/>
         <w:rPr>
           <w:rFonts w:ascii="Cambria" w:hAnsi="Cambria"/>
           <w:color w:val="000000"/>
@@ -1400,7 +1399,7 @@
           <w:numId w:val="3"/>
         </w:numPr>
         <w:spacing w:before="100" w:beforeAutospacing="1" w:after="100" w:afterAutospacing="1"/>
-        <w:divId w:val="2123187493"/>
+        <w:divId w:val="1395353832"/>
         <w:rPr>
           <w:rFonts w:ascii="Cambria" w:hAnsi="Cambria"/>
           <w:color w:val="000000"/>
@@ -1459,7 +1458,7 @@
           <w:numId w:val="3"/>
         </w:numPr>
         <w:spacing w:before="100" w:beforeAutospacing="1" w:after="100" w:afterAutospacing="1"/>
-        <w:divId w:val="2123187493"/>
+        <w:divId w:val="1395353832"/>
         <w:rPr>
           <w:rFonts w:ascii="Cambria" w:hAnsi="Cambria"/>
           <w:color w:val="000000"/>
@@ -1515,7 +1514,7 @@
       <w:pPr>
         <w:pStyle w:val="3"/>
         <w:spacing w:before="240"/>
-        <w:divId w:val="2123187493"/>
+        <w:divId w:val="1395353832"/>
         <w:rPr>
           <w:rFonts w:ascii="Cambria" w:hAnsi="Cambria"/>
           <w:color w:val="000000"/>
@@ -1538,7 +1537,7 @@
           <w:numId w:val="4"/>
         </w:numPr>
         <w:spacing w:before="100" w:beforeAutospacing="1" w:after="100" w:afterAutospacing="1"/>
-        <w:divId w:val="2123187493"/>
+        <w:divId w:val="1395353832"/>
         <w:rPr>
           <w:rFonts w:ascii="Cambria" w:hAnsi="Cambria"/>
           <w:color w:val="000000"/>
@@ -1614,7 +1613,7 @@
     <w:p>
       <w:pPr>
         <w:pStyle w:val="2"/>
-        <w:divId w:val="2123187493"/>
+        <w:divId w:val="1395353832"/>
         <w:rPr>
           <w:rFonts w:ascii="Cambria" w:hAnsi="Cambria"/>
           <w:color w:val="000000"/>
@@ -1634,7 +1633,7 @@
       <w:pPr>
         <w:pStyle w:val="3"/>
         <w:spacing w:before="240"/>
-        <w:divId w:val="2123187493"/>
+        <w:divId w:val="1395353832"/>
         <w:rPr>
           <w:rFonts w:ascii="Cambria" w:hAnsi="Cambria"/>
           <w:color w:val="000000"/>
@@ -1657,7 +1656,7 @@
           <w:numId w:val="5"/>
         </w:numPr>
         <w:spacing w:before="100" w:beforeAutospacing="1" w:after="100" w:afterAutospacing="1"/>
-        <w:divId w:val="2123187493"/>
+        <w:divId w:val="1395353832"/>
         <w:rPr>
           <w:rFonts w:ascii="Cambria" w:hAnsi="Cambria"/>
           <w:color w:val="000000"/>
@@ -1695,7 +1694,7 @@
           <w:numId w:val="5"/>
         </w:numPr>
         <w:spacing w:before="100" w:beforeAutospacing="1" w:after="100" w:afterAutospacing="1"/>
-        <w:divId w:val="2123187493"/>
+        <w:divId w:val="1395353832"/>
         <w:rPr>
           <w:rFonts w:ascii="Cambria" w:hAnsi="Cambria"/>
           <w:color w:val="000000"/>
@@ -1730,19 +1729,20 @@
       <w:pPr>
         <w:pStyle w:val="3"/>
         <w:spacing w:before="240"/>
-        <w:divId w:val="2123187493"/>
-        <w:rPr>
-          <w:rFonts w:ascii="Cambria" w:hAnsi="Cambria"/>
-          <w:color w:val="000000"/>
-          <w:lang w:val="en"/>
-        </w:rPr>
-      </w:pPr>
-      <w:r>
-        <w:rPr>
-          <w:rFonts w:ascii="Cambria" w:hAnsi="Cambria"/>
-          <w:color w:val="000000"/>
-          <w:lang w:val="en"/>
-        </w:rPr>
+        <w:divId w:val="1395353832"/>
+        <w:rPr>
+          <w:rFonts w:ascii="Cambria" w:hAnsi="Cambria"/>
+          <w:color w:val="000000"/>
+          <w:lang w:val="en"/>
+        </w:rPr>
+      </w:pPr>
+      <w:r>
+        <w:rPr>
+          <w:rFonts w:ascii="Cambria" w:hAnsi="Cambria"/>
+          <w:color w:val="000000"/>
+          <w:lang w:val="en"/>
+        </w:rPr>
+        <w:lastRenderedPageBreak/>
         <w:t>Articles in International Conference Proceedings</w:t>
       </w:r>
     </w:p>
@@ -1753,7 +1753,7 @@
           <w:numId w:val="6"/>
         </w:numPr>
         <w:spacing w:before="100" w:beforeAutospacing="1" w:after="100" w:afterAutospacing="1"/>
-        <w:divId w:val="2123187493"/>
+        <w:divId w:val="1395353832"/>
         <w:rPr>
           <w:rFonts w:ascii="Cambria" w:hAnsi="Cambria"/>
           <w:color w:val="000000"/>
@@ -1771,7 +1771,6 @@
           <w:szCs w:val="22"/>
           <w:lang w:val="en"/>
         </w:rPr>
-        <w:lastRenderedPageBreak/>
         <w:t>Park, H.</w:t>
       </w:r>
       <w:r>
@@ -1897,7 +1896,7 @@
           <w:numId w:val="6"/>
         </w:numPr>
         <w:spacing w:before="100" w:beforeAutospacing="1" w:after="100" w:afterAutospacing="1"/>
-        <w:divId w:val="2123187493"/>
+        <w:divId w:val="1395353832"/>
         <w:rPr>
           <w:rFonts w:ascii="Cambria" w:hAnsi="Cambria"/>
           <w:color w:val="000000"/>
@@ -1988,7 +1987,7 @@
           <w:numId w:val="6"/>
         </w:numPr>
         <w:spacing w:before="100" w:beforeAutospacing="1" w:after="100" w:afterAutospacing="1"/>
-        <w:divId w:val="2123187493"/>
+        <w:divId w:val="1395353832"/>
         <w:rPr>
           <w:rFonts w:ascii="Cambria" w:hAnsi="Cambria"/>
           <w:color w:val="000000"/>
@@ -2089,7 +2088,7 @@
           <w:numId w:val="6"/>
         </w:numPr>
         <w:spacing w:before="100" w:beforeAutospacing="1" w:after="100" w:afterAutospacing="1"/>
-        <w:divId w:val="2123187493"/>
+        <w:divId w:val="1395353832"/>
         <w:rPr>
           <w:rFonts w:ascii="Cambria" w:hAnsi="Cambria"/>
           <w:color w:val="000000"/>
@@ -2180,7 +2179,7 @@
           <w:numId w:val="6"/>
         </w:numPr>
         <w:spacing w:before="100" w:beforeAutospacing="1" w:after="100" w:afterAutospacing="1"/>
-        <w:divId w:val="2123187493"/>
+        <w:divId w:val="1395353832"/>
         <w:rPr>
           <w:rFonts w:ascii="Cambria" w:hAnsi="Cambria"/>
           <w:color w:val="000000"/>
@@ -2267,7 +2266,7 @@
     <w:p>
       <w:pPr>
         <w:pStyle w:val="2"/>
-        <w:divId w:val="2123187493"/>
+        <w:divId w:val="1395353832"/>
         <w:rPr>
           <w:rFonts w:ascii="Cambria" w:hAnsi="Cambria"/>
           <w:color w:val="000000"/>
@@ -2300,7 +2299,7 @@
       </w:tblGrid>
       <w:tr>
         <w:trPr>
-          <w:divId w:val="2123187493"/>
+          <w:divId w:val="1395353832"/>
         </w:trPr>
         <w:tc>
           <w:tcPr>
@@ -2371,7 +2370,7 @@
       </w:tr>
       <w:tr>
         <w:trPr>
-          <w:divId w:val="2123187493"/>
+          <w:divId w:val="1395353832"/>
         </w:trPr>
         <w:tc>
           <w:tcPr>
@@ -2442,7 +2441,7 @@
       </w:tr>
       <w:tr>
         <w:trPr>
-          <w:divId w:val="2123187493"/>
+          <w:divId w:val="1395353832"/>
         </w:trPr>
         <w:tc>
           <w:tcPr>
@@ -2513,7 +2512,7 @@
       </w:tr>
       <w:tr>
         <w:trPr>
-          <w:divId w:val="2123187493"/>
+          <w:divId w:val="1395353832"/>
         </w:trPr>
         <w:tc>
           <w:tcPr>
@@ -2584,7 +2583,7 @@
       </w:tr>
       <w:tr>
         <w:trPr>
-          <w:divId w:val="2123187493"/>
+          <w:divId w:val="1395353832"/>
         </w:trPr>
         <w:tc>
           <w:tcPr>
@@ -2655,7 +2654,7 @@
       </w:tr>
       <w:tr>
         <w:trPr>
-          <w:divId w:val="2123187493"/>
+          <w:divId w:val="1395353832"/>
         </w:trPr>
         <w:tc>
           <w:tcPr>
@@ -2726,7 +2725,7 @@
       </w:tr>
       <w:tr>
         <w:trPr>
-          <w:divId w:val="2123187493"/>
+          <w:divId w:val="1395353832"/>
         </w:trPr>
         <w:tc>
           <w:tcPr>
@@ -2797,7 +2796,7 @@
       </w:tr>
       <w:tr>
         <w:trPr>
-          <w:divId w:val="2123187493"/>
+          <w:divId w:val="1395353832"/>
         </w:trPr>
         <w:tc>
           <w:tcPr>
@@ -2868,7 +2867,7 @@
       </w:tr>
       <w:tr>
         <w:trPr>
-          <w:divId w:val="2123187493"/>
+          <w:divId w:val="1395353832"/>
         </w:trPr>
         <w:tc>
           <w:tcPr>
@@ -2940,7 +2939,7 @@
       </w:tr>
       <w:tr>
         <w:trPr>
-          <w:divId w:val="2123187493"/>
+          <w:divId w:val="1395353832"/>
         </w:trPr>
         <w:tc>
           <w:tcPr>
@@ -3011,7 +3010,7 @@
       </w:tr>
       <w:tr>
         <w:trPr>
-          <w:divId w:val="2123187493"/>
+          <w:divId w:val="1395353832"/>
         </w:trPr>
         <w:tc>
           <w:tcPr>
@@ -3084,7 +3083,7 @@
     <w:p>
       <w:pPr>
         <w:pStyle w:val="2"/>
-        <w:divId w:val="2123187493"/>
+        <w:divId w:val="1395353832"/>
         <w:rPr>
           <w:rFonts w:ascii="Cambria" w:hAnsi="Cambria"/>
           <w:color w:val="000000"/>
@@ -3104,7 +3103,7 @@
       <w:pPr>
         <w:pStyle w:val="3"/>
         <w:spacing w:before="240"/>
-        <w:divId w:val="2123187493"/>
+        <w:divId w:val="1395353832"/>
         <w:rPr>
           <w:rFonts w:ascii="Cambria" w:hAnsi="Cambria"/>
           <w:color w:val="000000"/>
@@ -3137,7 +3136,7 @@
       </w:tblGrid>
       <w:tr>
         <w:trPr>
-          <w:divId w:val="2123187493"/>
+          <w:divId w:val="1395353832"/>
         </w:trPr>
         <w:tc>
           <w:tcPr>
@@ -3238,7 +3237,7 @@
       <w:pPr>
         <w:pStyle w:val="3"/>
         <w:spacing w:before="240"/>
-        <w:divId w:val="2123187493"/>
+        <w:divId w:val="1395353832"/>
         <w:rPr>
           <w:rFonts w:ascii="Cambria" w:hAnsi="Cambria"/>
           <w:color w:val="000000"/>
@@ -3271,7 +3270,7 @@
       </w:tblGrid>
       <w:tr>
         <w:trPr>
-          <w:divId w:val="2123187493"/>
+          <w:divId w:val="1395353832"/>
         </w:trPr>
         <w:tc>
           <w:tcPr>
@@ -3371,7 +3370,7 @@
     <w:p>
       <w:pPr>
         <w:pStyle w:val="2"/>
-        <w:divId w:val="2123187493"/>
+        <w:divId w:val="1395353832"/>
         <w:rPr>
           <w:rFonts w:ascii="Cambria" w:hAnsi="Cambria"/>
           <w:color w:val="000000"/>
@@ -3391,7 +3390,7 @@
       <w:pPr>
         <w:pStyle w:val="blank"/>
         <w:spacing w:before="60" w:beforeAutospacing="0" w:after="60" w:afterAutospacing="0"/>
-        <w:divId w:val="2123187493"/>
+        <w:divId w:val="1395353832"/>
         <w:rPr>
           <w:rFonts w:ascii="Cambria" w:hAnsi="Cambria"/>
           <w:sz w:val="22"/>
@@ -3412,7 +3411,7 @@
     <w:p>
       <w:pPr>
         <w:pStyle w:val="2"/>
-        <w:divId w:val="2123187493"/>
+        <w:divId w:val="1395353832"/>
         <w:rPr>
           <w:rFonts w:ascii="Cambria" w:hAnsi="Cambria"/>
           <w:color w:val="000000"/>
@@ -3445,7 +3444,7 @@
       </w:tblGrid>
       <w:tr>
         <w:trPr>
-          <w:divId w:val="2123187493"/>
+          <w:divId w:val="1395353832"/>
         </w:trPr>
         <w:tc>
           <w:tcPr>
@@ -3535,7 +3534,7 @@
               <w:br/>
               <w:t xml:space="preserve">E-mail: </w:t>
             </w:r>
-            <w:hyperlink r:id="rId12" w:history="1">
+            <w:hyperlink r:id="rId10" w:history="1">
               <w:r>
                 <w:rPr>
                   <w:rStyle w:val="a3"/>
@@ -3583,7 +3582,7 @@
       </w:tr>
       <w:tr>
         <w:trPr>
-          <w:divId w:val="2123187493"/>
+          <w:divId w:val="1395353832"/>
         </w:trPr>
         <w:tc>
           <w:tcPr>
@@ -3655,7 +3654,7 @@
       <w:pPr>
         <w:pStyle w:val="footer"/>
         <w:spacing w:after="60" w:afterAutospacing="0"/>
-        <w:divId w:val="2123187493"/>
+        <w:divId w:val="1395353832"/>
         <w:rPr>
           <w:rFonts w:ascii="Cambria" w:hAnsi="Cambria"/>
           <w:color w:val="000000"/>
@@ -3685,50 +3684,12 @@
 </w:document>
 </file>
 
-<file path=word/endnotes.xml><?xml version="1.0" encoding="utf-8"?>
-<w:endnotes xmlns:wpc="http://schemas.microsoft.com/office/word/2010/wordprocessingCanvas" xmlns:cx="http://schemas.microsoft.com/office/drawing/2014/chartex" xmlns:cx1="http://schemas.microsoft.com/office/drawing/2015/9/8/chartex" xmlns:cx2="http://schemas.microsoft.com/office/drawing/2015/10/21/chartex" xmlns:cx3="http://schemas.microsoft.com/office/drawing/2016/5/9/chartex" xmlns:cx4="http://schemas.microsoft.com/office/drawing/2016/5/10/chartex" xmlns:cx5="http://schemas.microsoft.com/office/drawing/2016/5/11/chartex" xmlns:cx6="http://schemas.microsoft.com/office/drawing/2016/5/12/chartex" xmlns:cx7="http://schemas.microsoft.com/office/drawing/2016/5/13/chartex" xmlns:cx8="http://schemas.microsoft.com/office/drawing/2016/5/14/chartex" xmlns:mc="http://schemas.openxmlformats.org/markup-compatibility/2006" xmlns:aink="http://schemas.microsoft.com/office/drawing/2016/ink" xmlns:am3d="http://schemas.microsoft.com/office/drawing/2017/model3d" xmlns:o="urn:schemas-microsoft-com:office:office" xmlns:oel="http://schemas.microsoft.com/office/2019/extlst" xmlns:r="http://schemas.openxmlformats.org/officeDocument/2006/relationships" xmlns:m="http://schemas.openxmlformats.org/officeDocument/2006/math" xmlns:v="urn:schemas-microsoft-com:vml" xmlns:wp14="http://schemas.microsoft.com/office/word/2010/wordprocessingDrawing" xmlns:wp="http://schemas.openxmlformats.org/drawingml/2006/wordprocessingDrawing" xmlns:w10="urn:schemas-microsoft-com:office:word" xmlns:w="http://schemas.openxmlformats.org/wordprocessingml/2006/main" xmlns:w14="http://schemas.microsoft.com/office/word/2010/wordml" xmlns:w15="http://schemas.microsoft.com/office/word/2012/wordml" xmlns:w16cex="http://schemas.microsoft.com/office/word/2018/wordml/cex" xmlns:w16cid="http://schemas.microsoft.com/office/word/2016/wordml/cid" xmlns:w16="http://schemas.microsoft.com/office/word/2018/wordml" xmlns:w16du="http://schemas.microsoft.com/office/word/2023/wordml/word16du" xmlns:w16sdtdh="http://schemas.microsoft.com/office/word/2020/wordml/sdtdatahash" xmlns:w16sdtfl="http://schemas.microsoft.com/office/word/2024/wordml/sdtformatlock" xmlns:w16se="http://schemas.microsoft.com/office/word/2015/wordml/symex" xmlns:wpg="http://schemas.microsoft.com/office/word/2010/wordprocessingGroup" xmlns:wpi="http://schemas.microsoft.com/office/word/2010/wordprocessingInk" xmlns:wne="http://schemas.microsoft.com/office/word/2006/wordml" xmlns:wps="http://schemas.microsoft.com/office/word/2010/wordprocessingShape" mc:Ignorable="w14 w15 w16se w16cid w16 w16cex w16sdtdh w16sdtfl w16du wp14">
-  <w:endnote w:type="separator" w:id="-1">
-    <w:p>
-      <w:r>
-        <w:separator/>
-      </w:r>
-    </w:p>
-  </w:endnote>
-  <w:endnote w:type="continuationSeparator" w:id="0">
-    <w:p>
-      <w:r>
-        <w:continuationSeparator/>
-      </w:r>
-    </w:p>
-  </w:endnote>
-</w:endnotes>
-</file>
-
-<file path=word/footnotes.xml><?xml version="1.0" encoding="utf-8"?>
-<w:footnotes xmlns:wpc="http://schemas.microsoft.com/office/word/2010/wordprocessingCanvas" xmlns:cx="http://schemas.microsoft.com/office/drawing/2014/chartex" xmlns:cx1="http://schemas.microsoft.com/office/drawing/2015/9/8/chartex" xmlns:cx2="http://schemas.microsoft.com/office/drawing/2015/10/21/chartex" xmlns:cx3="http://schemas.microsoft.com/office/drawing/2016/5/9/chartex" xmlns:cx4="http://schemas.microsoft.com/office/drawing/2016/5/10/chartex" xmlns:cx5="http://schemas.microsoft.com/office/drawing/2016/5/11/chartex" xmlns:cx6="http://schemas.microsoft.com/office/drawing/2016/5/12/chartex" xmlns:cx7="http://schemas.microsoft.com/office/drawing/2016/5/13/chartex" xmlns:cx8="http://schemas.microsoft.com/office/drawing/2016/5/14/chartex" xmlns:mc="http://schemas.openxmlformats.org/markup-compatibility/2006" xmlns:aink="http://schemas.microsoft.com/office/drawing/2016/ink" xmlns:am3d="http://schemas.microsoft.com/office/drawing/2017/model3d" xmlns:o="urn:schemas-microsoft-com:office:office" xmlns:oel="http://schemas.microsoft.com/office/2019/extlst" xmlns:r="http://schemas.openxmlformats.org/officeDocument/2006/relationships" xmlns:m="http://schemas.openxmlformats.org/officeDocument/2006/math" xmlns:v="urn:schemas-microsoft-com:vml" xmlns:wp14="http://schemas.microsoft.com/office/word/2010/wordprocessingDrawing" xmlns:wp="http://schemas.openxmlformats.org/drawingml/2006/wordprocessingDrawing" xmlns:w10="urn:schemas-microsoft-com:office:word" xmlns:w="http://schemas.openxmlformats.org/wordprocessingml/2006/main" xmlns:w14="http://schemas.microsoft.com/office/word/2010/wordml" xmlns:w15="http://schemas.microsoft.com/office/word/2012/wordml" xmlns:w16cex="http://schemas.microsoft.com/office/word/2018/wordml/cex" xmlns:w16cid="http://schemas.microsoft.com/office/word/2016/wordml/cid" xmlns:w16="http://schemas.microsoft.com/office/word/2018/wordml" xmlns:w16du="http://schemas.microsoft.com/office/word/2023/wordml/word16du" xmlns:w16sdtdh="http://schemas.microsoft.com/office/word/2020/wordml/sdtdatahash" xmlns:w16sdtfl="http://schemas.microsoft.com/office/word/2024/wordml/sdtformatlock" xmlns:w16se="http://schemas.microsoft.com/office/word/2015/wordml/symex" xmlns:wpg="http://schemas.microsoft.com/office/word/2010/wordprocessingGroup" xmlns:wpi="http://schemas.microsoft.com/office/word/2010/wordprocessingInk" xmlns:wne="http://schemas.microsoft.com/office/word/2006/wordml" xmlns:wps="http://schemas.microsoft.com/office/word/2010/wordprocessingShape" mc:Ignorable="w14 w15 w16se w16cid w16 w16cex w16sdtdh w16sdtfl w16du wp14">
-  <w:footnote w:type="separator" w:id="-1">
-    <w:p>
-      <w:r>
-        <w:separator/>
-      </w:r>
-    </w:p>
-  </w:footnote>
-  <w:footnote w:type="continuationSeparator" w:id="0">
-    <w:p>
-      <w:r>
-        <w:continuationSeparator/>
-      </w:r>
-    </w:p>
-  </w:footnote>
-</w:footnotes>
-</file>
-
 <file path=word/numbering.xml><?xml version="1.0" encoding="utf-8"?>
 <w:numbering xmlns:wpc="http://schemas.microsoft.com/office/word/2010/wordprocessingCanvas" xmlns:cx="http://schemas.microsoft.com/office/drawing/2014/chartex" xmlns:cx1="http://schemas.microsoft.com/office/drawing/2015/9/8/chartex" xmlns:cx2="http://schemas.microsoft.com/office/drawing/2015/10/21/chartex" xmlns:cx3="http://schemas.microsoft.com/office/drawing/2016/5/9/chartex" xmlns:cx4="http://schemas.microsoft.com/office/drawing/2016/5/10/chartex" xmlns:cx5="http://schemas.microsoft.com/office/drawing/2016/5/11/chartex" xmlns:cx6="http://schemas.microsoft.com/office/drawing/2016/5/12/chartex" xmlns:cx7="http://schemas.microsoft.com/office/drawing/2016/5/13/chartex" xmlns:cx8="http://schemas.microsoft.com/office/drawing/2016/5/14/chartex" xmlns:mc="http://schemas.openxmlformats.org/markup-compatibility/2006" xmlns:aink="http://schemas.microsoft.com/office/drawing/2016/ink" xmlns:am3d="http://schemas.microsoft.com/office/drawing/2017/model3d" xmlns:o="urn:schemas-microsoft-com:office:office" xmlns:oel="http://schemas.microsoft.com/office/2019/extlst" xmlns:r="http://schemas.openxmlformats.org/officeDocument/2006/relationships" xmlns:m="http://schemas.openxmlformats.org/officeDocument/2006/math" xmlns:v="urn:schemas-microsoft-com:vml" xmlns:wp14="http://schemas.microsoft.com/office/word/2010/wordprocessingDrawing" xmlns:wp="http://schemas.openxmlformats.org/drawingml/2006/wordprocessingDrawing" xmlns:w10="urn:schemas-microsoft-com:office:word" xmlns:w="http://schemas.openxmlformats.org/wordprocessingml/2006/main" xmlns:w14="http://schemas.microsoft.com/office/word/2010/wordml" xmlns:w15="http://schemas.microsoft.com/office/word/2012/wordml" xmlns:w16cex="http://schemas.microsoft.com/office/word/2018/wordml/cex" xmlns:w16cid="http://schemas.microsoft.com/office/word/2016/wordml/cid" xmlns:w16="http://schemas.microsoft.com/office/word/2018/wordml" xmlns:w16du="http://schemas.microsoft.com/office/word/2023/wordml/word16du" xmlns:w16sdtdh="http://schemas.microsoft.com/office/word/2020/wordml/sdtdatahash" xmlns:w16sdtfl="http://schemas.microsoft.com/office/word/2024/wordml/sdtformatlock" xmlns:w16se="http://schemas.microsoft.com/office/word/2015/wordml/symex" xmlns:wpg="http://schemas.microsoft.com/office/word/2010/wordprocessingGroup" xmlns:wpi="http://schemas.microsoft.com/office/word/2010/wordprocessingInk" xmlns:wne="http://schemas.microsoft.com/office/word/2006/wordml" xmlns:wps="http://schemas.microsoft.com/office/word/2010/wordprocessingShape" mc:Ignorable="w14 w15 w16se w16cid w16 w16cex w16sdtdh w16sdtfl w16du wp14">
   <w:abstractNum w:abstractNumId="0" w15:restartNumberingAfterBreak="0">
-    <w:nsid w:val="0A5A418B"/>
+    <w:nsid w:val="1EB0746B"/>
     <w:multiLevelType w:val="multilevel"/>
-    <w:tmpl w:val="51FA6FF6"/>
+    <w:tmpl w:val="06844656"/>
     <w:lvl w:ilvl="0">
       <w:start w:val="1"/>
       <w:numFmt w:val="decimal"/>
@@ -3839,9 +3800,9 @@
     </w:lvl>
   </w:abstractNum>
   <w:abstractNum w:abstractNumId="1" w15:restartNumberingAfterBreak="0">
-    <w:nsid w:val="0F323595"/>
+    <w:nsid w:val="23814A1F"/>
     <w:multiLevelType w:val="multilevel"/>
-    <w:tmpl w:val="C8C6F17A"/>
+    <w:tmpl w:val="93B630D6"/>
     <w:lvl w:ilvl="0">
       <w:start w:val="1"/>
       <w:numFmt w:val="decimal"/>
@@ -3952,9 +3913,9 @@
     </w:lvl>
   </w:abstractNum>
   <w:abstractNum w:abstractNumId="2" w15:restartNumberingAfterBreak="0">
-    <w:nsid w:val="41EB2614"/>
+    <w:nsid w:val="401E75C8"/>
     <w:multiLevelType w:val="multilevel"/>
-    <w:tmpl w:val="27705C50"/>
+    <w:tmpl w:val="7768381C"/>
     <w:lvl w:ilvl="0">
       <w:start w:val="1"/>
       <w:numFmt w:val="decimal"/>
@@ -4065,9 +4026,9 @@
     </w:lvl>
   </w:abstractNum>
   <w:abstractNum w:abstractNumId="3" w15:restartNumberingAfterBreak="0">
-    <w:nsid w:val="48B7600F"/>
+    <w:nsid w:val="5CE33A37"/>
     <w:multiLevelType w:val="multilevel"/>
-    <w:tmpl w:val="E6863090"/>
+    <w:tmpl w:val="39328E60"/>
     <w:lvl w:ilvl="0">
       <w:start w:val="1"/>
       <w:numFmt w:val="decimal"/>
@@ -4178,9 +4139,9 @@
     </w:lvl>
   </w:abstractNum>
   <w:abstractNum w:abstractNumId="4" w15:restartNumberingAfterBreak="0">
-    <w:nsid w:val="4E694F1E"/>
+    <w:nsid w:val="633404BE"/>
     <w:multiLevelType w:val="multilevel"/>
-    <w:tmpl w:val="144AE0C8"/>
+    <w:tmpl w:val="3AD43C06"/>
     <w:lvl w:ilvl="0">
       <w:start w:val="1"/>
       <w:numFmt w:val="decimal"/>
@@ -4291,9 +4252,9 @@
     </w:lvl>
   </w:abstractNum>
   <w:abstractNum w:abstractNumId="5" w15:restartNumberingAfterBreak="0">
-    <w:nsid w:val="750D4889"/>
+    <w:nsid w:val="638E0C2A"/>
     <w:multiLevelType w:val="multilevel"/>
-    <w:tmpl w:val="CD6C39B0"/>
+    <w:tmpl w:val="CFC6822C"/>
     <w:lvl w:ilvl="0">
       <w:start w:val="1"/>
       <w:numFmt w:val="decimal"/>
@@ -4403,23 +4364,23 @@
       </w:pPr>
     </w:lvl>
   </w:abstractNum>
-  <w:num w:numId="1" w16cid:durableId="2093768760">
+  <w:num w:numId="1" w16cid:durableId="68355678">
+    <w:abstractNumId w:val="1"/>
+  </w:num>
+  <w:num w:numId="2" w16cid:durableId="684135486">
+    <w:abstractNumId w:val="5"/>
+  </w:num>
+  <w:num w:numId="3" w16cid:durableId="121729365">
+    <w:abstractNumId w:val="2"/>
+  </w:num>
+  <w:num w:numId="4" w16cid:durableId="1314482508">
+    <w:abstractNumId w:val="0"/>
+  </w:num>
+  <w:num w:numId="5" w16cid:durableId="248464910">
     <w:abstractNumId w:val="4"/>
   </w:num>
-  <w:num w:numId="2" w16cid:durableId="1313556125">
-    <w:abstractNumId w:val="0"/>
-  </w:num>
-  <w:num w:numId="3" w16cid:durableId="2102409095">
-    <w:abstractNumId w:val="2"/>
-  </w:num>
-  <w:num w:numId="4" w16cid:durableId="1241603640">
-    <w:abstractNumId w:val="5"/>
-  </w:num>
-  <w:num w:numId="5" w16cid:durableId="779758020">
+  <w:num w:numId="6" w16cid:durableId="1117025664">
     <w:abstractNumId w:val="3"/>
-  </w:num>
-  <w:num w:numId="6" w16cid:durableId="1291738974">
-    <w:abstractNumId w:val="1"/>
   </w:num>
 </w:numbering>
 </file>
@@ -5161,60 +5122,6 @@
       <w:color w:val="888888"/>
     </w:rPr>
   </w:style>
-  <w:style w:type="paragraph" w:styleId="a8">
-    <w:name w:val="header"/>
-    <w:basedOn w:val="a"/>
-    <w:link w:val="Char"/>
-    <w:uiPriority w:val="99"/>
-    <w:unhideWhenUsed/>
-    <w:rsid w:val="003D2EF9"/>
-    <w:pPr>
-      <w:tabs>
-        <w:tab w:val="center" w:pos="4513"/>
-        <w:tab w:val="right" w:pos="9026"/>
-      </w:tabs>
-      <w:snapToGrid w:val="0"/>
-    </w:pPr>
-  </w:style>
-  <w:style w:type="character" w:customStyle="1" w:styleId="Char">
-    <w:name w:val="머리글 Char"/>
-    <w:basedOn w:val="a0"/>
-    <w:link w:val="a8"/>
-    <w:uiPriority w:val="99"/>
-    <w:rsid w:val="003D2EF9"/>
-    <w:rPr>
-      <w:rFonts w:ascii="굴림" w:eastAsia="굴림" w:hAnsi="굴림" w:cs="굴림"/>
-      <w:sz w:val="24"/>
-      <w:szCs w:val="24"/>
-    </w:rPr>
-  </w:style>
-  <w:style w:type="paragraph" w:styleId="a9">
-    <w:name w:val="footer"/>
-    <w:basedOn w:val="a"/>
-    <w:link w:val="Char0"/>
-    <w:uiPriority w:val="99"/>
-    <w:unhideWhenUsed/>
-    <w:rsid w:val="003D2EF9"/>
-    <w:pPr>
-      <w:tabs>
-        <w:tab w:val="center" w:pos="4513"/>
-        <w:tab w:val="right" w:pos="9026"/>
-      </w:tabs>
-      <w:snapToGrid w:val="0"/>
-    </w:pPr>
-  </w:style>
-  <w:style w:type="character" w:customStyle="1" w:styleId="Char0">
-    <w:name w:val="바닥글 Char"/>
-    <w:basedOn w:val="a0"/>
-    <w:link w:val="a9"/>
-    <w:uiPriority w:val="99"/>
-    <w:rsid w:val="003D2EF9"/>
-    <w:rPr>
-      <w:rFonts w:ascii="굴림" w:eastAsia="굴림" w:hAnsi="굴림" w:cs="굴림"/>
-      <w:sz w:val="24"/>
-      <w:szCs w:val="24"/>
-    </w:rPr>
-  </w:style>
 </w:styles>
 </file>
 

</xml_diff>

<commit_message>
Add first invited talk (KOTI AI Agent Seminar, Jun 2026) to CV + News
</commit_message>
<xml_diff>
--- a/Curriculum_Vitae_Hyunchul_Park.docx
+++ b/Curriculum_Vitae_Hyunchul_Park.docx
@@ -5,7 +5,7 @@
     <w:p>
       <w:pPr>
         <w:pStyle w:val="1"/>
-        <w:divId w:val="1395353832"/>
+        <w:divId w:val="1499534705"/>
         <w:rPr>
           <w:rFonts w:ascii="Cambria" w:hAnsi="Cambria"/>
           <w:color w:val="000000"/>
@@ -24,7 +24,7 @@
     <w:p>
       <w:pPr>
         <w:pStyle w:val="topbio"/>
-        <w:divId w:val="1395353832"/>
+        <w:divId w:val="1499534705"/>
         <w:rPr>
           <w:rFonts w:ascii="Cambria" w:hAnsi="Cambria"/>
           <w:color w:val="000000"/>
@@ -47,7 +47,7 @@
     <w:p>
       <w:pPr>
         <w:pStyle w:val="topbio"/>
-        <w:divId w:val="1395353832"/>
+        <w:divId w:val="1499534705"/>
         <w:rPr>
           <w:rFonts w:ascii="Cambria" w:hAnsi="Cambria"/>
           <w:color w:val="000000"/>
@@ -70,7 +70,7 @@
     <w:p>
       <w:pPr>
         <w:pStyle w:val="contact"/>
-        <w:divId w:val="1395353832"/>
+        <w:divId w:val="1499534705"/>
         <w:rPr>
           <w:rFonts w:ascii="Cambria" w:hAnsi="Cambria"/>
           <w:color w:val="000000"/>
@@ -89,7 +89,7 @@
         </w:rPr>
         <w:t xml:space="preserve">E-mail: </w:t>
       </w:r>
-      <w:hyperlink r:id="rId5" w:history="1">
+      <w:hyperlink r:id="rId7" w:history="1">
         <w:r>
           <w:rPr>
             <w:rFonts w:ascii="Cambria" w:hAnsi="Cambria"/>
@@ -106,7 +106,7 @@
     <w:p>
       <w:pPr>
         <w:pStyle w:val="contact"/>
-        <w:divId w:val="1395353832"/>
+        <w:divId w:val="1499534705"/>
         <w:rPr>
           <w:rFonts w:ascii="Cambria" w:hAnsi="Cambria"/>
           <w:color w:val="000000"/>
@@ -125,7 +125,7 @@
         </w:rPr>
         <w:t xml:space="preserve">Google Scholar: </w:t>
       </w:r>
-      <w:hyperlink r:id="rId6" w:history="1">
+      <w:hyperlink r:id="rId8" w:history="1">
         <w:r>
           <w:rPr>
             <w:rFonts w:ascii="Cambria" w:hAnsi="Cambria"/>
@@ -142,7 +142,7 @@
     <w:p>
       <w:pPr>
         <w:pStyle w:val="2"/>
-        <w:divId w:val="1395353832"/>
+        <w:divId w:val="1499534705"/>
         <w:rPr>
           <w:rFonts w:ascii="Cambria" w:hAnsi="Cambria"/>
           <w:color w:val="000000"/>
@@ -175,7 +175,7 @@
       </w:tblGrid>
       <w:tr>
         <w:trPr>
-          <w:divId w:val="1395353832"/>
+          <w:divId w:val="1499534705"/>
         </w:trPr>
         <w:tc>
           <w:tcPr>
@@ -294,7 +294,7 @@
       </w:tr>
       <w:tr>
         <w:trPr>
-          <w:divId w:val="1395353832"/>
+          <w:divId w:val="1499534705"/>
         </w:trPr>
         <w:tc>
           <w:tcPr>
@@ -413,7 +413,7 @@
       </w:tr>
       <w:tr>
         <w:trPr>
-          <w:divId w:val="1395353832"/>
+          <w:divId w:val="1499534705"/>
         </w:trPr>
         <w:tc>
           <w:tcPr>
@@ -497,7 +497,7 @@
     <w:p>
       <w:pPr>
         <w:pStyle w:val="2"/>
-        <w:divId w:val="1395353832"/>
+        <w:divId w:val="1499534705"/>
         <w:rPr>
           <w:rFonts w:ascii="Cambria" w:hAnsi="Cambria"/>
           <w:color w:val="000000"/>
@@ -516,7 +516,7 @@
     <w:p>
       <w:pPr>
         <w:pStyle w:val="a6"/>
-        <w:divId w:val="1395353832"/>
+        <w:divId w:val="1499534705"/>
         <w:rPr>
           <w:rFonts w:ascii="Cambria" w:hAnsi="Cambria"/>
           <w:color w:val="000000"/>
@@ -539,7 +539,7 @@
     <w:p>
       <w:pPr>
         <w:pStyle w:val="2"/>
-        <w:divId w:val="1395353832"/>
+        <w:divId w:val="1499534705"/>
         <w:rPr>
           <w:rFonts w:ascii="Cambria" w:hAnsi="Cambria"/>
           <w:color w:val="000000"/>
@@ -559,7 +559,7 @@
       <w:pPr>
         <w:pStyle w:val="blank"/>
         <w:spacing w:before="60" w:beforeAutospacing="0" w:after="120" w:afterAutospacing="0"/>
-        <w:divId w:val="1395353832"/>
+        <w:divId w:val="1499534705"/>
         <w:rPr>
           <w:rFonts w:ascii="Cambria" w:hAnsi="Cambria"/>
           <w:sz w:val="19"/>
@@ -611,7 +611,7 @@
       <w:pPr>
         <w:pStyle w:val="3"/>
         <w:spacing w:before="240"/>
-        <w:divId w:val="1395353832"/>
+        <w:divId w:val="1499534705"/>
         <w:rPr>
           <w:rFonts w:ascii="Cambria" w:hAnsi="Cambria"/>
           <w:color w:val="000000"/>
@@ -634,7 +634,7 @@
           <w:numId w:val="1"/>
         </w:numPr>
         <w:spacing w:before="100" w:beforeAutospacing="1" w:after="100" w:afterAutospacing="1"/>
-        <w:divId w:val="1395353832"/>
+        <w:divId w:val="1499534705"/>
         <w:rPr>
           <w:rFonts w:ascii="Cambria" w:hAnsi="Cambria"/>
           <w:color w:val="000000"/>
@@ -716,7 +716,7 @@
         </w:rPr>
         <w:t xml:space="preserve">. </w:t>
       </w:r>
-      <w:hyperlink r:id="rId7" w:history="1">
+      <w:hyperlink r:id="rId9" w:history="1">
         <w:r>
           <w:rPr>
             <w:rStyle w:val="a3"/>
@@ -746,23 +746,24 @@
           <w:numId w:val="1"/>
         </w:numPr>
         <w:spacing w:before="100" w:beforeAutospacing="1" w:after="100" w:afterAutospacing="1"/>
-        <w:divId w:val="1395353832"/>
-        <w:rPr>
-          <w:rFonts w:ascii="Cambria" w:hAnsi="Cambria"/>
-          <w:color w:val="000000"/>
-          <w:sz w:val="22"/>
-          <w:szCs w:val="22"/>
-          <w:lang w:val="en"/>
-        </w:rPr>
-      </w:pPr>
-      <w:r>
-        <w:rPr>
-          <w:rFonts w:ascii="Cambria" w:hAnsi="Cambria"/>
-          <w:color w:val="000000"/>
-          <w:sz w:val="22"/>
-          <w:szCs w:val="22"/>
-          <w:lang w:val="en"/>
-        </w:rPr>
+        <w:divId w:val="1499534705"/>
+        <w:rPr>
+          <w:rFonts w:ascii="Cambria" w:hAnsi="Cambria"/>
+          <w:color w:val="000000"/>
+          <w:sz w:val="22"/>
+          <w:szCs w:val="22"/>
+          <w:lang w:val="en"/>
+        </w:rPr>
+      </w:pPr>
+      <w:r>
+        <w:rPr>
+          <w:rFonts w:ascii="Cambria" w:hAnsi="Cambria"/>
+          <w:color w:val="000000"/>
+          <w:sz w:val="22"/>
+          <w:szCs w:val="22"/>
+          <w:lang w:val="en"/>
+        </w:rPr>
+        <w:lastRenderedPageBreak/>
         <w:t xml:space="preserve">Lim, J., </w:t>
       </w:r>
       <w:r>
@@ -828,7 +829,7 @@
         </w:rPr>
         <w:t xml:space="preserve">, 157, 106365. </w:t>
       </w:r>
-      <w:hyperlink r:id="rId8" w:history="1">
+      <w:hyperlink r:id="rId10" w:history="1">
         <w:r>
           <w:rPr>
             <w:rStyle w:val="a3"/>
@@ -858,7 +859,7 @@
           <w:numId w:val="1"/>
         </w:numPr>
         <w:spacing w:before="100" w:beforeAutospacing="1" w:after="100" w:afterAutospacing="1"/>
-        <w:divId w:val="1395353832"/>
+        <w:divId w:val="1499534705"/>
         <w:rPr>
           <w:rFonts w:ascii="Cambria" w:hAnsi="Cambria"/>
           <w:color w:val="000000"/>
@@ -930,7 +931,7 @@
         </w:rPr>
         <w:t xml:space="preserve">, 205, 107685. </w:t>
       </w:r>
-      <w:hyperlink r:id="rId9" w:history="1">
+      <w:hyperlink r:id="rId11" w:history="1">
         <w:r>
           <w:rPr>
             <w:rStyle w:val="a3"/>
@@ -957,7 +958,7 @@
       <w:pPr>
         <w:pStyle w:val="3"/>
         <w:spacing w:before="240"/>
-        <w:divId w:val="1395353832"/>
+        <w:divId w:val="1499534705"/>
         <w:rPr>
           <w:rFonts w:ascii="Cambria" w:hAnsi="Cambria"/>
           <w:color w:val="000000"/>
@@ -980,7 +981,7 @@
           <w:numId w:val="2"/>
         </w:numPr>
         <w:spacing w:before="100" w:beforeAutospacing="1" w:after="100" w:afterAutospacing="1"/>
-        <w:divId w:val="1395353832"/>
+        <w:divId w:val="1499534705"/>
         <w:rPr>
           <w:rFonts w:ascii="Cambria" w:hAnsi="Cambria"/>
           <w:color w:val="000000"/>
@@ -1060,7 +1061,7 @@
           <w:numId w:val="2"/>
         </w:numPr>
         <w:spacing w:before="100" w:beforeAutospacing="1" w:after="100" w:afterAutospacing="1"/>
-        <w:divId w:val="1395353832"/>
+        <w:divId w:val="1499534705"/>
         <w:rPr>
           <w:rFonts w:ascii="Cambria" w:hAnsi="Cambria"/>
           <w:color w:val="000000"/>
@@ -1140,7 +1141,7 @@
           <w:numId w:val="2"/>
         </w:numPr>
         <w:spacing w:before="100" w:beforeAutospacing="1" w:after="100" w:afterAutospacing="1"/>
-        <w:divId w:val="1395353832"/>
+        <w:divId w:val="1499534705"/>
         <w:rPr>
           <w:rFonts w:ascii="Cambria" w:hAnsi="Cambria"/>
           <w:color w:val="000000"/>
@@ -1230,7 +1231,7 @@
           <w:numId w:val="2"/>
         </w:numPr>
         <w:spacing w:before="100" w:beforeAutospacing="1" w:after="100" w:afterAutospacing="1"/>
-        <w:divId w:val="1395353832"/>
+        <w:divId w:val="1499534705"/>
         <w:rPr>
           <w:rFonts w:ascii="Cambria" w:hAnsi="Cambria"/>
           <w:color w:val="000000"/>
@@ -1317,7 +1318,7 @@
       <w:pPr>
         <w:pStyle w:val="3"/>
         <w:spacing w:before="240"/>
-        <w:divId w:val="1395353832"/>
+        <w:divId w:val="1499534705"/>
         <w:rPr>
           <w:rFonts w:ascii="Cambria" w:hAnsi="Cambria"/>
           <w:color w:val="000000"/>
@@ -1340,7 +1341,7 @@
           <w:numId w:val="3"/>
         </w:numPr>
         <w:spacing w:before="100" w:beforeAutospacing="1" w:after="100" w:afterAutospacing="1"/>
-        <w:divId w:val="1395353832"/>
+        <w:divId w:val="1499534705"/>
         <w:rPr>
           <w:rFonts w:ascii="Cambria" w:hAnsi="Cambria"/>
           <w:color w:val="000000"/>
@@ -1368,7 +1369,7 @@
           <w:szCs w:val="22"/>
           <w:lang w:val="en"/>
         </w:rPr>
-        <w:t>, Lim, J., &amp; Kim, I.</w:t>
+        <w:t>, Tamakloe, R., Kim, E. M., Lim, J., &amp; Kim, I.</w:t>
       </w:r>
       <w:r>
         <w:rPr>
@@ -1399,7 +1400,7 @@
           <w:numId w:val="3"/>
         </w:numPr>
         <w:spacing w:before="100" w:beforeAutospacing="1" w:after="100" w:afterAutospacing="1"/>
-        <w:divId w:val="1395353832"/>
+        <w:divId w:val="1499534705"/>
         <w:rPr>
           <w:rFonts w:ascii="Cambria" w:hAnsi="Cambria"/>
           <w:color w:val="000000"/>
@@ -1458,7 +1459,7 @@
           <w:numId w:val="3"/>
         </w:numPr>
         <w:spacing w:before="100" w:beforeAutospacing="1" w:after="100" w:afterAutospacing="1"/>
-        <w:divId w:val="1395353832"/>
+        <w:divId w:val="1499534705"/>
         <w:rPr>
           <w:rFonts w:ascii="Cambria" w:hAnsi="Cambria"/>
           <w:color w:val="000000"/>
@@ -1514,7 +1515,7 @@
       <w:pPr>
         <w:pStyle w:val="3"/>
         <w:spacing w:before="240"/>
-        <w:divId w:val="1395353832"/>
+        <w:divId w:val="1499534705"/>
         <w:rPr>
           <w:rFonts w:ascii="Cambria" w:hAnsi="Cambria"/>
           <w:color w:val="000000"/>
@@ -1537,7 +1538,7 @@
           <w:numId w:val="4"/>
         </w:numPr>
         <w:spacing w:before="100" w:beforeAutospacing="1" w:after="100" w:afterAutospacing="1"/>
-        <w:divId w:val="1395353832"/>
+        <w:divId w:val="1499534705"/>
         <w:rPr>
           <w:rFonts w:ascii="Cambria" w:hAnsi="Cambria"/>
           <w:color w:val="000000"/>
@@ -1586,7 +1587,17 @@
           <w:szCs w:val="22"/>
           <w:lang w:val="en"/>
         </w:rPr>
-        <w:t xml:space="preserve"> (2022). A Study on Validation of Omnidirectional VR Treadmill by Comparison of Spatial Orientation Skills. </w:t>
+        <w:t xml:space="preserve"> (2022). </w:t>
+      </w:r>
+      <w:r>
+        <w:rPr>
+          <w:rFonts w:ascii="Cambria" w:hAnsi="Cambria"/>
+          <w:color w:val="000000"/>
+          <w:sz w:val="22"/>
+          <w:szCs w:val="22"/>
+          <w:lang w:val="en"/>
+        </w:rPr>
+        <w:t xml:space="preserve">A Study on Validation of Omnidirectional VR Treadmill by Comparison of Spatial Orientation Skills. </w:t>
       </w:r>
       <w:r>
         <w:rPr>
@@ -1613,7 +1624,7 @@
     <w:p>
       <w:pPr>
         <w:pStyle w:val="2"/>
-        <w:divId w:val="1395353832"/>
+        <w:divId w:val="1499534705"/>
         <w:rPr>
           <w:rFonts w:ascii="Cambria" w:hAnsi="Cambria"/>
           <w:color w:val="000000"/>
@@ -1633,7 +1644,7 @@
       <w:pPr>
         <w:pStyle w:val="3"/>
         <w:spacing w:before="240"/>
-        <w:divId w:val="1395353832"/>
+        <w:divId w:val="1499534705"/>
         <w:rPr>
           <w:rFonts w:ascii="Cambria" w:hAnsi="Cambria"/>
           <w:color w:val="000000"/>
@@ -1656,7 +1667,7 @@
           <w:numId w:val="5"/>
         </w:numPr>
         <w:spacing w:before="100" w:beforeAutospacing="1" w:after="100" w:afterAutospacing="1"/>
-        <w:divId w:val="1395353832"/>
+        <w:divId w:val="1499534705"/>
         <w:rPr>
           <w:rFonts w:ascii="Cambria" w:hAnsi="Cambria"/>
           <w:color w:val="000000"/>
@@ -1694,7 +1705,7 @@
           <w:numId w:val="5"/>
         </w:numPr>
         <w:spacing w:before="100" w:beforeAutospacing="1" w:after="100" w:afterAutospacing="1"/>
-        <w:divId w:val="1395353832"/>
+        <w:divId w:val="1499534705"/>
         <w:rPr>
           <w:rFonts w:ascii="Cambria" w:hAnsi="Cambria"/>
           <w:color w:val="000000"/>
@@ -1729,20 +1740,19 @@
       <w:pPr>
         <w:pStyle w:val="3"/>
         <w:spacing w:before="240"/>
-        <w:divId w:val="1395353832"/>
-        <w:rPr>
-          <w:rFonts w:ascii="Cambria" w:hAnsi="Cambria"/>
-          <w:color w:val="000000"/>
-          <w:lang w:val="en"/>
-        </w:rPr>
-      </w:pPr>
-      <w:r>
-        <w:rPr>
-          <w:rFonts w:ascii="Cambria" w:hAnsi="Cambria"/>
-          <w:color w:val="000000"/>
-          <w:lang w:val="en"/>
-        </w:rPr>
-        <w:lastRenderedPageBreak/>
+        <w:divId w:val="1499534705"/>
+        <w:rPr>
+          <w:rFonts w:ascii="Cambria" w:hAnsi="Cambria"/>
+          <w:color w:val="000000"/>
+          <w:lang w:val="en"/>
+        </w:rPr>
+      </w:pPr>
+      <w:r>
+        <w:rPr>
+          <w:rFonts w:ascii="Cambria" w:hAnsi="Cambria"/>
+          <w:color w:val="000000"/>
+          <w:lang w:val="en"/>
+        </w:rPr>
         <w:t>Articles in International Conference Proceedings</w:t>
       </w:r>
     </w:p>
@@ -1753,7 +1763,7 @@
           <w:numId w:val="6"/>
         </w:numPr>
         <w:spacing w:before="100" w:beforeAutospacing="1" w:after="100" w:afterAutospacing="1"/>
-        <w:divId w:val="1395353832"/>
+        <w:divId w:val="1499534705"/>
         <w:rPr>
           <w:rFonts w:ascii="Cambria" w:hAnsi="Cambria"/>
           <w:color w:val="000000"/>
@@ -1771,6 +1781,7 @@
           <w:szCs w:val="22"/>
           <w:lang w:val="en"/>
         </w:rPr>
+        <w:lastRenderedPageBreak/>
         <w:t>Park, H.</w:t>
       </w:r>
       <w:r>
@@ -1896,7 +1907,7 @@
           <w:numId w:val="6"/>
         </w:numPr>
         <w:spacing w:before="100" w:beforeAutospacing="1" w:after="100" w:afterAutospacing="1"/>
-        <w:divId w:val="1395353832"/>
+        <w:divId w:val="1499534705"/>
         <w:rPr>
           <w:rFonts w:ascii="Cambria" w:hAnsi="Cambria"/>
           <w:color w:val="000000"/>
@@ -1987,7 +1998,7 @@
           <w:numId w:val="6"/>
         </w:numPr>
         <w:spacing w:before="100" w:beforeAutospacing="1" w:after="100" w:afterAutospacing="1"/>
-        <w:divId w:val="1395353832"/>
+        <w:divId w:val="1499534705"/>
         <w:rPr>
           <w:rFonts w:ascii="Cambria" w:hAnsi="Cambria"/>
           <w:color w:val="000000"/>
@@ -2088,7 +2099,7 @@
           <w:numId w:val="6"/>
         </w:numPr>
         <w:spacing w:before="100" w:beforeAutospacing="1" w:after="100" w:afterAutospacing="1"/>
-        <w:divId w:val="1395353832"/>
+        <w:divId w:val="1499534705"/>
         <w:rPr>
           <w:rFonts w:ascii="Cambria" w:hAnsi="Cambria"/>
           <w:color w:val="000000"/>
@@ -2179,7 +2190,7 @@
           <w:numId w:val="6"/>
         </w:numPr>
         <w:spacing w:before="100" w:beforeAutospacing="1" w:after="100" w:afterAutospacing="1"/>
-        <w:divId w:val="1395353832"/>
+        <w:divId w:val="1499534705"/>
         <w:rPr>
           <w:rFonts w:ascii="Cambria" w:hAnsi="Cambria"/>
           <w:color w:val="000000"/>
@@ -2266,7 +2277,96 @@
     <w:p>
       <w:pPr>
         <w:pStyle w:val="2"/>
-        <w:divId w:val="1395353832"/>
+        <w:divId w:val="1499534705"/>
+        <w:rPr>
+          <w:rFonts w:ascii="Cambria" w:hAnsi="Cambria"/>
+          <w:color w:val="000000"/>
+          <w:lang w:val="en"/>
+        </w:rPr>
+      </w:pPr>
+      <w:r>
+        <w:rPr>
+          <w:rFonts w:ascii="Cambria" w:hAnsi="Cambria"/>
+          <w:color w:val="000000"/>
+          <w:lang w:val="en"/>
+        </w:rPr>
+        <w:t>Invited Talks</w:t>
+      </w:r>
+    </w:p>
+    <w:p>
+      <w:pPr>
+        <w:numPr>
+          <w:ilvl w:val="0"/>
+          <w:numId w:val="7"/>
+        </w:numPr>
+        <w:spacing w:before="100" w:beforeAutospacing="1" w:after="100" w:afterAutospacing="1"/>
+        <w:divId w:val="1499534705"/>
+        <w:rPr>
+          <w:rFonts w:ascii="Cambria" w:hAnsi="Cambria"/>
+          <w:color w:val="000000"/>
+          <w:sz w:val="22"/>
+          <w:szCs w:val="22"/>
+          <w:lang w:val="en"/>
+        </w:rPr>
+      </w:pPr>
+      <w:r>
+        <w:rPr>
+          <w:rStyle w:val="me3"/>
+          <w:rFonts w:ascii="Cambria" w:hAnsi="Cambria"/>
+          <w:color w:val="000000"/>
+          <w:sz w:val="22"/>
+          <w:szCs w:val="22"/>
+          <w:lang w:val="en"/>
+        </w:rPr>
+        <w:t>Park, H.</w:t>
+      </w:r>
+      <w:r>
+        <w:rPr>
+          <w:rFonts w:ascii="Cambria" w:hAnsi="Cambria"/>
+          <w:color w:val="000000"/>
+          <w:sz w:val="22"/>
+          <w:szCs w:val="22"/>
+          <w:lang w:val="en"/>
+        </w:rPr>
+        <w:br/>
+        <w:t>Design and Implementation of Multi-Agent Pipelines for Research Workflow Automation.</w:t>
+      </w:r>
+      <w:r>
+        <w:rPr>
+          <w:rFonts w:ascii="Cambria" w:hAnsi="Cambria"/>
+          <w:color w:val="000000"/>
+          <w:sz w:val="22"/>
+          <w:szCs w:val="22"/>
+          <w:lang w:val="en"/>
+        </w:rPr>
+        <w:br/>
+      </w:r>
+      <w:r>
+        <w:rPr>
+          <w:rStyle w:val="a5"/>
+          <w:rFonts w:ascii="Cambria" w:hAnsi="Cambria"/>
+          <w:color w:val="000000"/>
+          <w:sz w:val="22"/>
+          <w:szCs w:val="22"/>
+          <w:lang w:val="en"/>
+        </w:rPr>
+        <w:t>Korea Transport Institute (KOTI) AI Agent Seminar</w:t>
+      </w:r>
+      <w:r>
+        <w:rPr>
+          <w:rFonts w:ascii="Cambria" w:hAnsi="Cambria"/>
+          <w:color w:val="000000"/>
+          <w:sz w:val="22"/>
+          <w:szCs w:val="22"/>
+          <w:lang w:val="en"/>
+        </w:rPr>
+        <w:t xml:space="preserve">, Jun. 2026. </w:t>
+      </w:r>
+    </w:p>
+    <w:p>
+      <w:pPr>
+        <w:pStyle w:val="2"/>
+        <w:divId w:val="1499534705"/>
         <w:rPr>
           <w:rFonts w:ascii="Cambria" w:hAnsi="Cambria"/>
           <w:color w:val="000000"/>
@@ -2299,7 +2399,7 @@
       </w:tblGrid>
       <w:tr>
         <w:trPr>
-          <w:divId w:val="1395353832"/>
+          <w:divId w:val="1499534705"/>
         </w:trPr>
         <w:tc>
           <w:tcPr>
@@ -2370,7 +2470,7 @@
       </w:tr>
       <w:tr>
         <w:trPr>
-          <w:divId w:val="1395353832"/>
+          <w:divId w:val="1499534705"/>
         </w:trPr>
         <w:tc>
           <w:tcPr>
@@ -2441,7 +2541,7 @@
       </w:tr>
       <w:tr>
         <w:trPr>
-          <w:divId w:val="1395353832"/>
+          <w:divId w:val="1499534705"/>
         </w:trPr>
         <w:tc>
           <w:tcPr>
@@ -2512,7 +2612,7 @@
       </w:tr>
       <w:tr>
         <w:trPr>
-          <w:divId w:val="1395353832"/>
+          <w:divId w:val="1499534705"/>
         </w:trPr>
         <w:tc>
           <w:tcPr>
@@ -2583,7 +2683,7 @@
       </w:tr>
       <w:tr>
         <w:trPr>
-          <w:divId w:val="1395353832"/>
+          <w:divId w:val="1499534705"/>
         </w:trPr>
         <w:tc>
           <w:tcPr>
@@ -2654,7 +2754,7 @@
       </w:tr>
       <w:tr>
         <w:trPr>
-          <w:divId w:val="1395353832"/>
+          <w:divId w:val="1499534705"/>
         </w:trPr>
         <w:tc>
           <w:tcPr>
@@ -2725,7 +2825,7 @@
       </w:tr>
       <w:tr>
         <w:trPr>
-          <w:divId w:val="1395353832"/>
+          <w:divId w:val="1499534705"/>
         </w:trPr>
         <w:tc>
           <w:tcPr>
@@ -2755,6 +2855,7 @@
                 <w:sz w:val="22"/>
                 <w:szCs w:val="22"/>
               </w:rPr>
+              <w:lastRenderedPageBreak/>
               <w:t>Korean Society of Transportation — President's Award (Distinguished Graduate)</w:t>
             </w:r>
           </w:p>
@@ -2796,7 +2897,7 @@
       </w:tr>
       <w:tr>
         <w:trPr>
-          <w:divId w:val="1395353832"/>
+          <w:divId w:val="1499534705"/>
         </w:trPr>
         <w:tc>
           <w:tcPr>
@@ -2867,7 +2968,7 @@
       </w:tr>
       <w:tr>
         <w:trPr>
-          <w:divId w:val="1395353832"/>
+          <w:divId w:val="1499534705"/>
         </w:trPr>
         <w:tc>
           <w:tcPr>
@@ -2897,7 +2998,6 @@
                 <w:sz w:val="22"/>
                 <w:szCs w:val="22"/>
               </w:rPr>
-              <w:lastRenderedPageBreak/>
               <w:t>KITS Best Paper Award</w:t>
             </w:r>
           </w:p>
@@ -2939,7 +3039,7 @@
       </w:tr>
       <w:tr>
         <w:trPr>
-          <w:divId w:val="1395353832"/>
+          <w:divId w:val="1499534705"/>
         </w:trPr>
         <w:tc>
           <w:tcPr>
@@ -3010,7 +3110,7 @@
       </w:tr>
       <w:tr>
         <w:trPr>
-          <w:divId w:val="1395353832"/>
+          <w:divId w:val="1499534705"/>
         </w:trPr>
         <w:tc>
           <w:tcPr>
@@ -3083,7 +3183,7 @@
     <w:p>
       <w:pPr>
         <w:pStyle w:val="2"/>
-        <w:divId w:val="1395353832"/>
+        <w:divId w:val="1499534705"/>
         <w:rPr>
           <w:rFonts w:ascii="Cambria" w:hAnsi="Cambria"/>
           <w:color w:val="000000"/>
@@ -3103,7 +3203,7 @@
       <w:pPr>
         <w:pStyle w:val="3"/>
         <w:spacing w:before="240"/>
-        <w:divId w:val="1395353832"/>
+        <w:divId w:val="1499534705"/>
         <w:rPr>
           <w:rFonts w:ascii="Cambria" w:hAnsi="Cambria"/>
           <w:color w:val="000000"/>
@@ -3136,7 +3236,7 @@
       </w:tblGrid>
       <w:tr>
         <w:trPr>
-          <w:divId w:val="1395353832"/>
+          <w:divId w:val="1499534705"/>
         </w:trPr>
         <w:tc>
           <w:tcPr>
@@ -3237,7 +3337,7 @@
       <w:pPr>
         <w:pStyle w:val="3"/>
         <w:spacing w:before="240"/>
-        <w:divId w:val="1395353832"/>
+        <w:divId w:val="1499534705"/>
         <w:rPr>
           <w:rFonts w:ascii="Cambria" w:hAnsi="Cambria"/>
           <w:color w:val="000000"/>
@@ -3270,7 +3370,7 @@
       </w:tblGrid>
       <w:tr>
         <w:trPr>
-          <w:divId w:val="1395353832"/>
+          <w:divId w:val="1499534705"/>
         </w:trPr>
         <w:tc>
           <w:tcPr>
@@ -3370,7 +3470,7 @@
     <w:p>
       <w:pPr>
         <w:pStyle w:val="2"/>
-        <w:divId w:val="1395353832"/>
+        <w:divId w:val="1499534705"/>
         <w:rPr>
           <w:rFonts w:ascii="Cambria" w:hAnsi="Cambria"/>
           <w:color w:val="000000"/>
@@ -3390,7 +3490,7 @@
       <w:pPr>
         <w:pStyle w:val="blank"/>
         <w:spacing w:before="60" w:beforeAutospacing="0" w:after="60" w:afterAutospacing="0"/>
-        <w:divId w:val="1395353832"/>
+        <w:divId w:val="1499534705"/>
         <w:rPr>
           <w:rFonts w:ascii="Cambria" w:hAnsi="Cambria"/>
           <w:sz w:val="22"/>
@@ -3411,7 +3511,7 @@
     <w:p>
       <w:pPr>
         <w:pStyle w:val="2"/>
-        <w:divId w:val="1395353832"/>
+        <w:divId w:val="1499534705"/>
         <w:rPr>
           <w:rFonts w:ascii="Cambria" w:hAnsi="Cambria"/>
           <w:color w:val="000000"/>
@@ -3444,7 +3544,7 @@
       </w:tblGrid>
       <w:tr>
         <w:trPr>
-          <w:divId w:val="1395353832"/>
+          <w:divId w:val="1499534705"/>
         </w:trPr>
         <w:tc>
           <w:tcPr>
@@ -3513,15 +3613,6 @@
                 <w:szCs w:val="22"/>
               </w:rPr>
               <w:br/>
-            </w:r>
-            <w:r>
-              <w:rPr>
-                <w:rFonts w:ascii="Cambria" w:hAnsi="Cambria"/>
-                <w:color w:val="000000"/>
-                <w:sz w:val="22"/>
-                <w:szCs w:val="22"/>
-              </w:rPr>
-              <w:lastRenderedPageBreak/>
               <w:t>Korea Advanced Institute of Science and Technology (KAIST)</w:t>
             </w:r>
             <w:r>
@@ -3534,7 +3625,7 @@
               <w:br/>
               <w:t xml:space="preserve">E-mail: </w:t>
             </w:r>
-            <w:hyperlink r:id="rId10" w:history="1">
+            <w:hyperlink r:id="rId12" w:history="1">
               <w:r>
                 <w:rPr>
                   <w:rStyle w:val="a3"/>
@@ -3582,7 +3673,7 @@
       </w:tr>
       <w:tr>
         <w:trPr>
-          <w:divId w:val="1395353832"/>
+          <w:divId w:val="1499534705"/>
         </w:trPr>
         <w:tc>
           <w:tcPr>
@@ -3654,7 +3745,7 @@
       <w:pPr>
         <w:pStyle w:val="footer"/>
         <w:spacing w:after="60" w:afterAutospacing="0"/>
-        <w:divId w:val="1395353832"/>
+        <w:divId w:val="1499534705"/>
         <w:rPr>
           <w:rFonts w:ascii="Cambria" w:hAnsi="Cambria"/>
           <w:color w:val="000000"/>
@@ -3684,12 +3775,50 @@
 </w:document>
 </file>
 
+<file path=word/endnotes.xml><?xml version="1.0" encoding="utf-8"?>
+<w:endnotes xmlns:wpc="http://schemas.microsoft.com/office/word/2010/wordprocessingCanvas" xmlns:cx="http://schemas.microsoft.com/office/drawing/2014/chartex" xmlns:cx1="http://schemas.microsoft.com/office/drawing/2015/9/8/chartex" xmlns:cx2="http://schemas.microsoft.com/office/drawing/2015/10/21/chartex" xmlns:cx3="http://schemas.microsoft.com/office/drawing/2016/5/9/chartex" xmlns:cx4="http://schemas.microsoft.com/office/drawing/2016/5/10/chartex" xmlns:cx5="http://schemas.microsoft.com/office/drawing/2016/5/11/chartex" xmlns:cx6="http://schemas.microsoft.com/office/drawing/2016/5/12/chartex" xmlns:cx7="http://schemas.microsoft.com/office/drawing/2016/5/13/chartex" xmlns:cx8="http://schemas.microsoft.com/office/drawing/2016/5/14/chartex" xmlns:mc="http://schemas.openxmlformats.org/markup-compatibility/2006" xmlns:aink="http://schemas.microsoft.com/office/drawing/2016/ink" xmlns:am3d="http://schemas.microsoft.com/office/drawing/2017/model3d" xmlns:o="urn:schemas-microsoft-com:office:office" xmlns:oel="http://schemas.microsoft.com/office/2019/extlst" xmlns:r="http://schemas.openxmlformats.org/officeDocument/2006/relationships" xmlns:m="http://schemas.openxmlformats.org/officeDocument/2006/math" xmlns:v="urn:schemas-microsoft-com:vml" xmlns:wp14="http://schemas.microsoft.com/office/word/2010/wordprocessingDrawing" xmlns:wp="http://schemas.openxmlformats.org/drawingml/2006/wordprocessingDrawing" xmlns:w10="urn:schemas-microsoft-com:office:word" xmlns:w="http://schemas.openxmlformats.org/wordprocessingml/2006/main" xmlns:w14="http://schemas.microsoft.com/office/word/2010/wordml" xmlns:w15="http://schemas.microsoft.com/office/word/2012/wordml" xmlns:w16cex="http://schemas.microsoft.com/office/word/2018/wordml/cex" xmlns:w16cid="http://schemas.microsoft.com/office/word/2016/wordml/cid" xmlns:w16="http://schemas.microsoft.com/office/word/2018/wordml" xmlns:w16du="http://schemas.microsoft.com/office/word/2023/wordml/word16du" xmlns:w16sdtdh="http://schemas.microsoft.com/office/word/2020/wordml/sdtdatahash" xmlns:w16sdtfl="http://schemas.microsoft.com/office/word/2024/wordml/sdtformatlock" xmlns:w16se="http://schemas.microsoft.com/office/word/2015/wordml/symex" xmlns:wpg="http://schemas.microsoft.com/office/word/2010/wordprocessingGroup" xmlns:wpi="http://schemas.microsoft.com/office/word/2010/wordprocessingInk" xmlns:wne="http://schemas.microsoft.com/office/word/2006/wordml" xmlns:wps="http://schemas.microsoft.com/office/word/2010/wordprocessingShape" mc:Ignorable="w14 w15 w16se w16cid w16 w16cex w16sdtdh w16sdtfl w16du wp14">
+  <w:endnote w:type="separator" w:id="-1">
+    <w:p>
+      <w:r>
+        <w:separator/>
+      </w:r>
+    </w:p>
+  </w:endnote>
+  <w:endnote w:type="continuationSeparator" w:id="0">
+    <w:p>
+      <w:r>
+        <w:continuationSeparator/>
+      </w:r>
+    </w:p>
+  </w:endnote>
+</w:endnotes>
+</file>
+
+<file path=word/footnotes.xml><?xml version="1.0" encoding="utf-8"?>
+<w:footnotes xmlns:wpc="http://schemas.microsoft.com/office/word/2010/wordprocessingCanvas" xmlns:cx="http://schemas.microsoft.com/office/drawing/2014/chartex" xmlns:cx1="http://schemas.microsoft.com/office/drawing/2015/9/8/chartex" xmlns:cx2="http://schemas.microsoft.com/office/drawing/2015/10/21/chartex" xmlns:cx3="http://schemas.microsoft.com/office/drawing/2016/5/9/chartex" xmlns:cx4="http://schemas.microsoft.com/office/drawing/2016/5/10/chartex" xmlns:cx5="http://schemas.microsoft.com/office/drawing/2016/5/11/chartex" xmlns:cx6="http://schemas.microsoft.com/office/drawing/2016/5/12/chartex" xmlns:cx7="http://schemas.microsoft.com/office/drawing/2016/5/13/chartex" xmlns:cx8="http://schemas.microsoft.com/office/drawing/2016/5/14/chartex" xmlns:mc="http://schemas.openxmlformats.org/markup-compatibility/2006" xmlns:aink="http://schemas.microsoft.com/office/drawing/2016/ink" xmlns:am3d="http://schemas.microsoft.com/office/drawing/2017/model3d" xmlns:o="urn:schemas-microsoft-com:office:office" xmlns:oel="http://schemas.microsoft.com/office/2019/extlst" xmlns:r="http://schemas.openxmlformats.org/officeDocument/2006/relationships" xmlns:m="http://schemas.openxmlformats.org/officeDocument/2006/math" xmlns:v="urn:schemas-microsoft-com:vml" xmlns:wp14="http://schemas.microsoft.com/office/word/2010/wordprocessingDrawing" xmlns:wp="http://schemas.openxmlformats.org/drawingml/2006/wordprocessingDrawing" xmlns:w10="urn:schemas-microsoft-com:office:word" xmlns:w="http://schemas.openxmlformats.org/wordprocessingml/2006/main" xmlns:w14="http://schemas.microsoft.com/office/word/2010/wordml" xmlns:w15="http://schemas.microsoft.com/office/word/2012/wordml" xmlns:w16cex="http://schemas.microsoft.com/office/word/2018/wordml/cex" xmlns:w16cid="http://schemas.microsoft.com/office/word/2016/wordml/cid" xmlns:w16="http://schemas.microsoft.com/office/word/2018/wordml" xmlns:w16du="http://schemas.microsoft.com/office/word/2023/wordml/word16du" xmlns:w16sdtdh="http://schemas.microsoft.com/office/word/2020/wordml/sdtdatahash" xmlns:w16sdtfl="http://schemas.microsoft.com/office/word/2024/wordml/sdtformatlock" xmlns:w16se="http://schemas.microsoft.com/office/word/2015/wordml/symex" xmlns:wpg="http://schemas.microsoft.com/office/word/2010/wordprocessingGroup" xmlns:wpi="http://schemas.microsoft.com/office/word/2010/wordprocessingInk" xmlns:wne="http://schemas.microsoft.com/office/word/2006/wordml" xmlns:wps="http://schemas.microsoft.com/office/word/2010/wordprocessingShape" mc:Ignorable="w14 w15 w16se w16cid w16 w16cex w16sdtdh w16sdtfl w16du wp14">
+  <w:footnote w:type="separator" w:id="-1">
+    <w:p>
+      <w:r>
+        <w:separator/>
+      </w:r>
+    </w:p>
+  </w:footnote>
+  <w:footnote w:type="continuationSeparator" w:id="0">
+    <w:p>
+      <w:r>
+        <w:continuationSeparator/>
+      </w:r>
+    </w:p>
+  </w:footnote>
+</w:footnotes>
+</file>
+
 <file path=word/numbering.xml><?xml version="1.0" encoding="utf-8"?>
 <w:numbering xmlns:wpc="http://schemas.microsoft.com/office/word/2010/wordprocessingCanvas" xmlns:cx="http://schemas.microsoft.com/office/drawing/2014/chartex" xmlns:cx1="http://schemas.microsoft.com/office/drawing/2015/9/8/chartex" xmlns:cx2="http://schemas.microsoft.com/office/drawing/2015/10/21/chartex" xmlns:cx3="http://schemas.microsoft.com/office/drawing/2016/5/9/chartex" xmlns:cx4="http://schemas.microsoft.com/office/drawing/2016/5/10/chartex" xmlns:cx5="http://schemas.microsoft.com/office/drawing/2016/5/11/chartex" xmlns:cx6="http://schemas.microsoft.com/office/drawing/2016/5/12/chartex" xmlns:cx7="http://schemas.microsoft.com/office/drawing/2016/5/13/chartex" xmlns:cx8="http://schemas.microsoft.com/office/drawing/2016/5/14/chartex" xmlns:mc="http://schemas.openxmlformats.org/markup-compatibility/2006" xmlns:aink="http://schemas.microsoft.com/office/drawing/2016/ink" xmlns:am3d="http://schemas.microsoft.com/office/drawing/2017/model3d" xmlns:o="urn:schemas-microsoft-com:office:office" xmlns:oel="http://schemas.microsoft.com/office/2019/extlst" xmlns:r="http://schemas.openxmlformats.org/officeDocument/2006/relationships" xmlns:m="http://schemas.openxmlformats.org/officeDocument/2006/math" xmlns:v="urn:schemas-microsoft-com:vml" xmlns:wp14="http://schemas.microsoft.com/office/word/2010/wordprocessingDrawing" xmlns:wp="http://schemas.openxmlformats.org/drawingml/2006/wordprocessingDrawing" xmlns:w10="urn:schemas-microsoft-com:office:word" xmlns:w="http://schemas.openxmlformats.org/wordprocessingml/2006/main" xmlns:w14="http://schemas.microsoft.com/office/word/2010/wordml" xmlns:w15="http://schemas.microsoft.com/office/word/2012/wordml" xmlns:w16cex="http://schemas.microsoft.com/office/word/2018/wordml/cex" xmlns:w16cid="http://schemas.microsoft.com/office/word/2016/wordml/cid" xmlns:w16="http://schemas.microsoft.com/office/word/2018/wordml" xmlns:w16du="http://schemas.microsoft.com/office/word/2023/wordml/word16du" xmlns:w16sdtdh="http://schemas.microsoft.com/office/word/2020/wordml/sdtdatahash" xmlns:w16sdtfl="http://schemas.microsoft.com/office/word/2024/wordml/sdtformatlock" xmlns:w16se="http://schemas.microsoft.com/office/word/2015/wordml/symex" xmlns:wpg="http://schemas.microsoft.com/office/word/2010/wordprocessingGroup" xmlns:wpi="http://schemas.microsoft.com/office/word/2010/wordprocessingInk" xmlns:wne="http://schemas.microsoft.com/office/word/2006/wordml" xmlns:wps="http://schemas.microsoft.com/office/word/2010/wordprocessingShape" mc:Ignorable="w14 w15 w16se w16cid w16 w16cex w16sdtdh w16sdtfl w16du wp14">
   <w:abstractNum w:abstractNumId="0" w15:restartNumberingAfterBreak="0">
-    <w:nsid w:val="1EB0746B"/>
+    <w:nsid w:val="07493A60"/>
     <w:multiLevelType w:val="multilevel"/>
-    <w:tmpl w:val="06844656"/>
+    <w:tmpl w:val="4FA25B4A"/>
     <w:lvl w:ilvl="0">
       <w:start w:val="1"/>
       <w:numFmt w:val="decimal"/>
@@ -3800,9 +3929,9 @@
     </w:lvl>
   </w:abstractNum>
   <w:abstractNum w:abstractNumId="1" w15:restartNumberingAfterBreak="0">
-    <w:nsid w:val="23814A1F"/>
+    <w:nsid w:val="1EAB445B"/>
     <w:multiLevelType w:val="multilevel"/>
-    <w:tmpl w:val="93B630D6"/>
+    <w:tmpl w:val="27425D3C"/>
     <w:lvl w:ilvl="0">
       <w:start w:val="1"/>
       <w:numFmt w:val="decimal"/>
@@ -3913,9 +4042,9 @@
     </w:lvl>
   </w:abstractNum>
   <w:abstractNum w:abstractNumId="2" w15:restartNumberingAfterBreak="0">
-    <w:nsid w:val="401E75C8"/>
+    <w:nsid w:val="38A72FC2"/>
     <w:multiLevelType w:val="multilevel"/>
-    <w:tmpl w:val="7768381C"/>
+    <w:tmpl w:val="BDBC67BA"/>
     <w:lvl w:ilvl="0">
       <w:start w:val="1"/>
       <w:numFmt w:val="decimal"/>
@@ -4026,9 +4155,9 @@
     </w:lvl>
   </w:abstractNum>
   <w:abstractNum w:abstractNumId="3" w15:restartNumberingAfterBreak="0">
-    <w:nsid w:val="5CE33A37"/>
+    <w:nsid w:val="45BF7AEA"/>
     <w:multiLevelType w:val="multilevel"/>
-    <w:tmpl w:val="39328E60"/>
+    <w:tmpl w:val="9154CBEA"/>
     <w:lvl w:ilvl="0">
       <w:start w:val="1"/>
       <w:numFmt w:val="decimal"/>
@@ -4139,9 +4268,9 @@
     </w:lvl>
   </w:abstractNum>
   <w:abstractNum w:abstractNumId="4" w15:restartNumberingAfterBreak="0">
-    <w:nsid w:val="633404BE"/>
+    <w:nsid w:val="58016135"/>
     <w:multiLevelType w:val="multilevel"/>
-    <w:tmpl w:val="3AD43C06"/>
+    <w:tmpl w:val="E51ACC7C"/>
     <w:lvl w:ilvl="0">
       <w:start w:val="1"/>
       <w:numFmt w:val="decimal"/>
@@ -4252,9 +4381,9 @@
     </w:lvl>
   </w:abstractNum>
   <w:abstractNum w:abstractNumId="5" w15:restartNumberingAfterBreak="0">
-    <w:nsid w:val="638E0C2A"/>
+    <w:nsid w:val="61C46737"/>
     <w:multiLevelType w:val="multilevel"/>
-    <w:tmpl w:val="CFC6822C"/>
+    <w:tmpl w:val="F1026E4E"/>
     <w:lvl w:ilvl="0">
       <w:start w:val="1"/>
       <w:numFmt w:val="decimal"/>
@@ -4364,23 +4493,139 @@
       </w:pPr>
     </w:lvl>
   </w:abstractNum>
-  <w:num w:numId="1" w16cid:durableId="68355678">
+  <w:abstractNum w:abstractNumId="6" w15:restartNumberingAfterBreak="0">
+    <w:nsid w:val="768C1C28"/>
+    <w:multiLevelType w:val="multilevel"/>
+    <w:tmpl w:val="D8FA6C7E"/>
+    <w:lvl w:ilvl="0">
+      <w:start w:val="1"/>
+      <w:numFmt w:val="decimal"/>
+      <w:lvlText w:val="%1."/>
+      <w:lvlJc w:val="left"/>
+      <w:pPr>
+        <w:tabs>
+          <w:tab w:val="num" w:pos="720"/>
+        </w:tabs>
+        <w:ind w:left="720" w:hanging="360"/>
+      </w:pPr>
+    </w:lvl>
+    <w:lvl w:ilvl="1" w:tentative="1">
+      <w:start w:val="1"/>
+      <w:numFmt w:val="decimal"/>
+      <w:lvlText w:val="%2."/>
+      <w:lvlJc w:val="left"/>
+      <w:pPr>
+        <w:tabs>
+          <w:tab w:val="num" w:pos="1440"/>
+        </w:tabs>
+        <w:ind w:left="1440" w:hanging="360"/>
+      </w:pPr>
+    </w:lvl>
+    <w:lvl w:ilvl="2" w:tentative="1">
+      <w:start w:val="1"/>
+      <w:numFmt w:val="decimal"/>
+      <w:lvlText w:val="%3."/>
+      <w:lvlJc w:val="left"/>
+      <w:pPr>
+        <w:tabs>
+          <w:tab w:val="num" w:pos="2160"/>
+        </w:tabs>
+        <w:ind w:left="2160" w:hanging="360"/>
+      </w:pPr>
+    </w:lvl>
+    <w:lvl w:ilvl="3" w:tentative="1">
+      <w:start w:val="1"/>
+      <w:numFmt w:val="decimal"/>
+      <w:lvlText w:val="%4."/>
+      <w:lvlJc w:val="left"/>
+      <w:pPr>
+        <w:tabs>
+          <w:tab w:val="num" w:pos="2880"/>
+        </w:tabs>
+        <w:ind w:left="2880" w:hanging="360"/>
+      </w:pPr>
+    </w:lvl>
+    <w:lvl w:ilvl="4" w:tentative="1">
+      <w:start w:val="1"/>
+      <w:numFmt w:val="decimal"/>
+      <w:lvlText w:val="%5."/>
+      <w:lvlJc w:val="left"/>
+      <w:pPr>
+        <w:tabs>
+          <w:tab w:val="num" w:pos="3600"/>
+        </w:tabs>
+        <w:ind w:left="3600" w:hanging="360"/>
+      </w:pPr>
+    </w:lvl>
+    <w:lvl w:ilvl="5" w:tentative="1">
+      <w:start w:val="1"/>
+      <w:numFmt w:val="decimal"/>
+      <w:lvlText w:val="%6."/>
+      <w:lvlJc w:val="left"/>
+      <w:pPr>
+        <w:tabs>
+          <w:tab w:val="num" w:pos="4320"/>
+        </w:tabs>
+        <w:ind w:left="4320" w:hanging="360"/>
+      </w:pPr>
+    </w:lvl>
+    <w:lvl w:ilvl="6" w:tentative="1">
+      <w:start w:val="1"/>
+      <w:numFmt w:val="decimal"/>
+      <w:lvlText w:val="%7."/>
+      <w:lvlJc w:val="left"/>
+      <w:pPr>
+        <w:tabs>
+          <w:tab w:val="num" w:pos="5040"/>
+        </w:tabs>
+        <w:ind w:left="5040" w:hanging="360"/>
+      </w:pPr>
+    </w:lvl>
+    <w:lvl w:ilvl="7" w:tentative="1">
+      <w:start w:val="1"/>
+      <w:numFmt w:val="decimal"/>
+      <w:lvlText w:val="%8."/>
+      <w:lvlJc w:val="left"/>
+      <w:pPr>
+        <w:tabs>
+          <w:tab w:val="num" w:pos="5760"/>
+        </w:tabs>
+        <w:ind w:left="5760" w:hanging="360"/>
+      </w:pPr>
+    </w:lvl>
+    <w:lvl w:ilvl="8" w:tentative="1">
+      <w:start w:val="1"/>
+      <w:numFmt w:val="decimal"/>
+      <w:lvlText w:val="%9."/>
+      <w:lvlJc w:val="left"/>
+      <w:pPr>
+        <w:tabs>
+          <w:tab w:val="num" w:pos="6480"/>
+        </w:tabs>
+        <w:ind w:left="6480" w:hanging="360"/>
+      </w:pPr>
+    </w:lvl>
+  </w:abstractNum>
+  <w:num w:numId="1" w16cid:durableId="874543975">
+    <w:abstractNumId w:val="3"/>
+  </w:num>
+  <w:num w:numId="2" w16cid:durableId="1082947479">
+    <w:abstractNumId w:val="6"/>
+  </w:num>
+  <w:num w:numId="3" w16cid:durableId="732431826">
     <w:abstractNumId w:val="1"/>
   </w:num>
-  <w:num w:numId="2" w16cid:durableId="684135486">
+  <w:num w:numId="4" w16cid:durableId="1142038338">
+    <w:abstractNumId w:val="0"/>
+  </w:num>
+  <w:num w:numId="5" w16cid:durableId="66850661">
     <w:abstractNumId w:val="5"/>
   </w:num>
-  <w:num w:numId="3" w16cid:durableId="121729365">
+  <w:num w:numId="6" w16cid:durableId="1870995840">
     <w:abstractNumId w:val="2"/>
   </w:num>
-  <w:num w:numId="4" w16cid:durableId="1314482508">
-    <w:abstractNumId w:val="0"/>
-  </w:num>
-  <w:num w:numId="5" w16cid:durableId="248464910">
+  <w:num w:numId="7" w16cid:durableId="885682358">
     <w:abstractNumId w:val="4"/>
-  </w:num>
-  <w:num w:numId="6" w16cid:durableId="1117025664">
-    <w:abstractNumId w:val="3"/>
   </w:num>
 </w:numbering>
 </file>
@@ -5122,6 +5367,60 @@
       <w:color w:val="888888"/>
     </w:rPr>
   </w:style>
+  <w:style w:type="paragraph" w:styleId="a8">
+    <w:name w:val="header"/>
+    <w:basedOn w:val="a"/>
+    <w:link w:val="Char"/>
+    <w:uiPriority w:val="99"/>
+    <w:unhideWhenUsed/>
+    <w:rsid w:val="00C95ABA"/>
+    <w:pPr>
+      <w:tabs>
+        <w:tab w:val="center" w:pos="4513"/>
+        <w:tab w:val="right" w:pos="9026"/>
+      </w:tabs>
+      <w:snapToGrid w:val="0"/>
+    </w:pPr>
+  </w:style>
+  <w:style w:type="character" w:customStyle="1" w:styleId="Char">
+    <w:name w:val="머리글 Char"/>
+    <w:basedOn w:val="a0"/>
+    <w:link w:val="a8"/>
+    <w:uiPriority w:val="99"/>
+    <w:rsid w:val="00C95ABA"/>
+    <w:rPr>
+      <w:rFonts w:ascii="굴림" w:eastAsia="굴림" w:hAnsi="굴림" w:cs="굴림"/>
+      <w:sz w:val="24"/>
+      <w:szCs w:val="24"/>
+    </w:rPr>
+  </w:style>
+  <w:style w:type="paragraph" w:styleId="a9">
+    <w:name w:val="footer"/>
+    <w:basedOn w:val="a"/>
+    <w:link w:val="Char0"/>
+    <w:uiPriority w:val="99"/>
+    <w:unhideWhenUsed/>
+    <w:rsid w:val="00C95ABA"/>
+    <w:pPr>
+      <w:tabs>
+        <w:tab w:val="center" w:pos="4513"/>
+        <w:tab w:val="right" w:pos="9026"/>
+      </w:tabs>
+      <w:snapToGrid w:val="0"/>
+    </w:pPr>
+  </w:style>
+  <w:style w:type="character" w:customStyle="1" w:styleId="Char0">
+    <w:name w:val="바닥글 Char"/>
+    <w:basedOn w:val="a0"/>
+    <w:link w:val="a9"/>
+    <w:uiPriority w:val="99"/>
+    <w:rsid w:val="00C95ABA"/>
+    <w:rPr>
+      <w:rFonts w:ascii="굴림" w:eastAsia="굴림" w:hAnsi="굴림" w:cs="굴림"/>
+      <w:sz w:val="24"/>
+      <w:szCs w:val="24"/>
+    </w:rPr>
+  </w:style>
 </w:styles>
 </file>
 

</xml_diff>

<commit_message>
Add new in-prep paper (SUT-invariant IRT eval); Subway Fire status R1
</commit_message>
<xml_diff>
--- a/Curriculum_Vitae_Hyunchul_Park.docx
+++ b/Curriculum_Vitae_Hyunchul_Park.docx
@@ -5,7 +5,7 @@
     <w:p>
       <w:pPr>
         <w:pStyle w:val="1"/>
-        <w:divId w:val="1499534705"/>
+        <w:divId w:val="1056587177"/>
         <w:rPr>
           <w:rFonts w:ascii="Cambria" w:hAnsi="Cambria"/>
           <w:color w:val="000000"/>
@@ -24,7 +24,7 @@
     <w:p>
       <w:pPr>
         <w:pStyle w:val="topbio"/>
-        <w:divId w:val="1499534705"/>
+        <w:divId w:val="1056587177"/>
         <w:rPr>
           <w:rFonts w:ascii="Cambria" w:hAnsi="Cambria"/>
           <w:color w:val="000000"/>
@@ -47,7 +47,7 @@
     <w:p>
       <w:pPr>
         <w:pStyle w:val="topbio"/>
-        <w:divId w:val="1499534705"/>
+        <w:divId w:val="1056587177"/>
         <w:rPr>
           <w:rFonts w:ascii="Cambria" w:hAnsi="Cambria"/>
           <w:color w:val="000000"/>
@@ -70,7 +70,7 @@
     <w:p>
       <w:pPr>
         <w:pStyle w:val="contact"/>
-        <w:divId w:val="1499534705"/>
+        <w:divId w:val="1056587177"/>
         <w:rPr>
           <w:rFonts w:ascii="Cambria" w:hAnsi="Cambria"/>
           <w:color w:val="000000"/>
@@ -106,7 +106,7 @@
     <w:p>
       <w:pPr>
         <w:pStyle w:val="contact"/>
-        <w:divId w:val="1499534705"/>
+        <w:divId w:val="1056587177"/>
         <w:rPr>
           <w:rFonts w:ascii="Cambria" w:hAnsi="Cambria"/>
           <w:color w:val="000000"/>
@@ -142,7 +142,7 @@
     <w:p>
       <w:pPr>
         <w:pStyle w:val="2"/>
-        <w:divId w:val="1499534705"/>
+        <w:divId w:val="1056587177"/>
         <w:rPr>
           <w:rFonts w:ascii="Cambria" w:hAnsi="Cambria"/>
           <w:color w:val="000000"/>
@@ -175,7 +175,7 @@
       </w:tblGrid>
       <w:tr>
         <w:trPr>
-          <w:divId w:val="1499534705"/>
+          <w:divId w:val="1056587177"/>
         </w:trPr>
         <w:tc>
           <w:tcPr>
@@ -294,7 +294,7 @@
       </w:tr>
       <w:tr>
         <w:trPr>
-          <w:divId w:val="1499534705"/>
+          <w:divId w:val="1056587177"/>
         </w:trPr>
         <w:tc>
           <w:tcPr>
@@ -413,7 +413,7 @@
       </w:tr>
       <w:tr>
         <w:trPr>
-          <w:divId w:val="1499534705"/>
+          <w:divId w:val="1056587177"/>
         </w:trPr>
         <w:tc>
           <w:tcPr>
@@ -497,7 +497,7 @@
     <w:p>
       <w:pPr>
         <w:pStyle w:val="2"/>
-        <w:divId w:val="1499534705"/>
+        <w:divId w:val="1056587177"/>
         <w:rPr>
           <w:rFonts w:ascii="Cambria" w:hAnsi="Cambria"/>
           <w:color w:val="000000"/>
@@ -516,7 +516,7 @@
     <w:p>
       <w:pPr>
         <w:pStyle w:val="a6"/>
-        <w:divId w:val="1499534705"/>
+        <w:divId w:val="1056587177"/>
         <w:rPr>
           <w:rFonts w:ascii="Cambria" w:hAnsi="Cambria"/>
           <w:color w:val="000000"/>
@@ -539,7 +539,7 @@
     <w:p>
       <w:pPr>
         <w:pStyle w:val="2"/>
-        <w:divId w:val="1499534705"/>
+        <w:divId w:val="1056587177"/>
         <w:rPr>
           <w:rFonts w:ascii="Cambria" w:hAnsi="Cambria"/>
           <w:color w:val="000000"/>
@@ -559,7 +559,7 @@
       <w:pPr>
         <w:pStyle w:val="blank"/>
         <w:spacing w:before="60" w:beforeAutospacing="0" w:after="120" w:afterAutospacing="0"/>
-        <w:divId w:val="1499534705"/>
+        <w:divId w:val="1056587177"/>
         <w:rPr>
           <w:rFonts w:ascii="Cambria" w:hAnsi="Cambria"/>
           <w:sz w:val="19"/>
@@ -611,7 +611,7 @@
       <w:pPr>
         <w:pStyle w:val="3"/>
         <w:spacing w:before="240"/>
-        <w:divId w:val="1499534705"/>
+        <w:divId w:val="1056587177"/>
         <w:rPr>
           <w:rFonts w:ascii="Cambria" w:hAnsi="Cambria"/>
           <w:color w:val="000000"/>
@@ -634,7 +634,7 @@
           <w:numId w:val="1"/>
         </w:numPr>
         <w:spacing w:before="100" w:beforeAutospacing="1" w:after="100" w:afterAutospacing="1"/>
-        <w:divId w:val="1499534705"/>
+        <w:divId w:val="1056587177"/>
         <w:rPr>
           <w:rFonts w:ascii="Cambria" w:hAnsi="Cambria"/>
           <w:color w:val="000000"/>
@@ -746,7 +746,7 @@
           <w:numId w:val="1"/>
         </w:numPr>
         <w:spacing w:before="100" w:beforeAutospacing="1" w:after="100" w:afterAutospacing="1"/>
-        <w:divId w:val="1499534705"/>
+        <w:divId w:val="1056587177"/>
         <w:rPr>
           <w:rFonts w:ascii="Cambria" w:hAnsi="Cambria"/>
           <w:color w:val="000000"/>
@@ -859,7 +859,7 @@
           <w:numId w:val="1"/>
         </w:numPr>
         <w:spacing w:before="100" w:beforeAutospacing="1" w:after="100" w:afterAutospacing="1"/>
-        <w:divId w:val="1499534705"/>
+        <w:divId w:val="1056587177"/>
         <w:rPr>
           <w:rFonts w:ascii="Cambria" w:hAnsi="Cambria"/>
           <w:color w:val="000000"/>
@@ -958,7 +958,7 @@
       <w:pPr>
         <w:pStyle w:val="3"/>
         <w:spacing w:before="240"/>
-        <w:divId w:val="1499534705"/>
+        <w:divId w:val="1056587177"/>
         <w:rPr>
           <w:rFonts w:ascii="Cambria" w:hAnsi="Cambria"/>
           <w:color w:val="000000"/>
@@ -981,7 +981,7 @@
           <w:numId w:val="2"/>
         </w:numPr>
         <w:spacing w:before="100" w:beforeAutospacing="1" w:after="100" w:afterAutospacing="1"/>
-        <w:divId w:val="1499534705"/>
+        <w:divId w:val="1056587177"/>
         <w:rPr>
           <w:rFonts w:ascii="Cambria" w:hAnsi="Cambria"/>
           <w:color w:val="000000"/>
@@ -1051,7 +1051,7 @@
           <w:szCs w:val="22"/>
           <w:lang w:val="en"/>
         </w:rPr>
-        <w:t xml:space="preserve">. </w:t>
+        <w:t xml:space="preserve">. (Under review, R1.) </w:t>
       </w:r>
     </w:p>
     <w:p>
@@ -1061,7 +1061,7 @@
           <w:numId w:val="2"/>
         </w:numPr>
         <w:spacing w:before="100" w:beforeAutospacing="1" w:after="100" w:afterAutospacing="1"/>
-        <w:divId w:val="1499534705"/>
+        <w:divId w:val="1056587177"/>
         <w:rPr>
           <w:rFonts w:ascii="Cambria" w:hAnsi="Cambria"/>
           <w:color w:val="000000"/>
@@ -1141,7 +1141,7 @@
           <w:numId w:val="2"/>
         </w:numPr>
         <w:spacing w:before="100" w:beforeAutospacing="1" w:after="100" w:afterAutospacing="1"/>
-        <w:divId w:val="1499534705"/>
+        <w:divId w:val="1056587177"/>
         <w:rPr>
           <w:rFonts w:ascii="Cambria" w:hAnsi="Cambria"/>
           <w:color w:val="000000"/>
@@ -1231,7 +1231,7 @@
           <w:numId w:val="2"/>
         </w:numPr>
         <w:spacing w:before="100" w:beforeAutospacing="1" w:after="100" w:afterAutospacing="1"/>
-        <w:divId w:val="1499534705"/>
+        <w:divId w:val="1056587177"/>
         <w:rPr>
           <w:rFonts w:ascii="Cambria" w:hAnsi="Cambria"/>
           <w:color w:val="000000"/>
@@ -1318,7 +1318,7 @@
       <w:pPr>
         <w:pStyle w:val="3"/>
         <w:spacing w:before="240"/>
-        <w:divId w:val="1499534705"/>
+        <w:divId w:val="1056587177"/>
         <w:rPr>
           <w:rFonts w:ascii="Cambria" w:hAnsi="Cambria"/>
           <w:color w:val="000000"/>
@@ -1341,7 +1341,7 @@
           <w:numId w:val="3"/>
         </w:numPr>
         <w:spacing w:before="100" w:beforeAutospacing="1" w:after="100" w:afterAutospacing="1"/>
-        <w:divId w:val="1499534705"/>
+        <w:divId w:val="1056587177"/>
         <w:rPr>
           <w:rFonts w:ascii="Cambria" w:hAnsi="Cambria"/>
           <w:color w:val="000000"/>
@@ -1369,7 +1369,7 @@
           <w:szCs w:val="22"/>
           <w:lang w:val="en"/>
         </w:rPr>
-        <w:t>, Tamakloe, R., Kim, E. M., Lim, J., &amp; Kim, I.</w:t>
+        <w:t>, &amp; Kim, I.</w:t>
       </w:r>
       <w:r>
         <w:rPr>
@@ -1390,7 +1390,7 @@
           <w:szCs w:val="22"/>
           <w:lang w:val="en"/>
         </w:rPr>
-        <w:t xml:space="preserve"> (2026). Human-Centric Evaluation of UWB-based V2P ADAS: How Pedestrian Tag Adoption Rates Influence Driver Cognitive Load and Safety Performance in School Zones. </w:t>
+        <w:t xml:space="preserve"> (2026). Beyond Collision Rate: SUT-Invariant Adversarial Evaluation of Autonomous Driving via Item Response Theory. </w:t>
       </w:r>
     </w:p>
     <w:p>
@@ -1400,7 +1400,7 @@
           <w:numId w:val="3"/>
         </w:numPr>
         <w:spacing w:before="100" w:beforeAutospacing="1" w:after="100" w:afterAutospacing="1"/>
-        <w:divId w:val="1499534705"/>
+        <w:divId w:val="1056587177"/>
         <w:rPr>
           <w:rFonts w:ascii="Cambria" w:hAnsi="Cambria"/>
           <w:color w:val="000000"/>
@@ -1428,7 +1428,7 @@
           <w:szCs w:val="22"/>
           <w:lang w:val="en"/>
         </w:rPr>
-        <w:t>, &amp; Kim, I.</w:t>
+        <w:t>, Tamakloe, R., Kim, E. M., Lim, J., &amp; Kim, I.</w:t>
       </w:r>
       <w:r>
         <w:rPr>
@@ -1449,7 +1449,7 @@
           <w:szCs w:val="22"/>
           <w:lang w:val="en"/>
         </w:rPr>
-        <w:t xml:space="preserve"> (2026). Crossing in Front of a Humanoid-Driven Vehicle: Effects of In-Cabin Driver Embodiment and eHMI on Pedestrian Decisions. </w:t>
+        <w:t xml:space="preserve"> (2026). Human-Centric Evaluation of UWB-based V2P ADAS: How Pedestrian Tag Adoption Rates Influence Driver Cognitive Load and Safety Performance in School Zones. </w:t>
       </w:r>
     </w:p>
     <w:p>
@@ -1459,7 +1459,7 @@
           <w:numId w:val="3"/>
         </w:numPr>
         <w:spacing w:before="100" w:beforeAutospacing="1" w:after="100" w:afterAutospacing="1"/>
-        <w:divId w:val="1499534705"/>
+        <w:divId w:val="1056587177"/>
         <w:rPr>
           <w:rFonts w:ascii="Cambria" w:hAnsi="Cambria"/>
           <w:color w:val="000000"/>
@@ -1508,14 +1508,83 @@
           <w:szCs w:val="22"/>
           <w:lang w:val="en"/>
         </w:rPr>
-        <w:t xml:space="preserve"> (2026). From Ghost Driver to Humanoid: In-Cabin Embodiment Effects on Surrounding Drivers' Gap Acceptance and Lane-Change Latency. </w:t>
+        <w:t xml:space="preserve"> (2026). Crossing in Front of a Humanoid-Driven Vehicle: Effects of In-Cabin Driver Embodiment and eHMI on Pedestrian Decisions. </w:t>
       </w:r>
     </w:p>
     <w:p>
       <w:pPr>
+        <w:numPr>
+          <w:ilvl w:val="0"/>
+          <w:numId w:val="3"/>
+        </w:numPr>
+        <w:spacing w:before="100" w:beforeAutospacing="1" w:after="100" w:afterAutospacing="1"/>
+        <w:divId w:val="1056587177"/>
+        <w:rPr>
+          <w:rFonts w:ascii="Cambria" w:hAnsi="Cambria"/>
+          <w:color w:val="000000"/>
+          <w:sz w:val="22"/>
+          <w:szCs w:val="22"/>
+          <w:lang w:val="en"/>
+        </w:rPr>
+      </w:pPr>
+      <w:r>
+        <w:rPr>
+          <w:rStyle w:val="me3"/>
+          <w:rFonts w:ascii="Cambria" w:hAnsi="Cambria"/>
+          <w:color w:val="000000"/>
+          <w:sz w:val="22"/>
+          <w:szCs w:val="22"/>
+          <w:lang w:val="en"/>
+        </w:rPr>
+        <w:t>Park, H.</w:t>
+      </w:r>
+      <w:r>
+        <w:rPr>
+          <w:rFonts w:ascii="Cambria" w:hAnsi="Cambria"/>
+          <w:color w:val="000000"/>
+          <w:sz w:val="22"/>
+          <w:szCs w:val="22"/>
+          <w:lang w:val="en"/>
+        </w:rPr>
+        <w:t>, &amp; Kim, I.</w:t>
+      </w:r>
+      <w:r>
+        <w:rPr>
+          <w:rFonts w:ascii="Cambria" w:hAnsi="Cambria"/>
+          <w:color w:val="000000"/>
+          <w:sz w:val="22"/>
+          <w:szCs w:val="22"/>
+          <w:vertAlign w:val="superscript"/>
+          <w:lang w:val="en"/>
+        </w:rPr>
+        <w:t>*</w:t>
+      </w:r>
+      <w:r>
+        <w:rPr>
+          <w:rFonts w:ascii="Cambria" w:hAnsi="Cambria"/>
+          <w:color w:val="000000"/>
+          <w:sz w:val="22"/>
+          <w:szCs w:val="22"/>
+          <w:lang w:val="en"/>
+        </w:rPr>
+        <w:t xml:space="preserve"> (2026). </w:t>
+      </w:r>
+      <w:r>
+        <w:rPr>
+          <w:rFonts w:ascii="Cambria" w:hAnsi="Cambria"/>
+          <w:color w:val="000000"/>
+          <w:sz w:val="22"/>
+          <w:szCs w:val="22"/>
+          <w:lang w:val="en"/>
+        </w:rPr>
+        <w:t xml:space="preserve">From Ghost Driver to Humanoid: In-Cabin Embodiment Effects on Surrounding Drivers' Gap Acceptance and Lane-Change Latency. </w:t>
+      </w:r>
+    </w:p>
+    <w:p>
+      <w:pPr>
         <w:pStyle w:val="3"/>
         <w:spacing w:before="240"/>
-        <w:divId w:val="1499534705"/>
+        <w:divId w:val="1056587177"/>
         <w:rPr>
           <w:rFonts w:ascii="Cambria" w:hAnsi="Cambria"/>
           <w:color w:val="000000"/>
@@ -1538,7 +1607,7 @@
           <w:numId w:val="4"/>
         </w:numPr>
         <w:spacing w:before="100" w:beforeAutospacing="1" w:after="100" w:afterAutospacing="1"/>
-        <w:divId w:val="1499534705"/>
+        <w:divId w:val="1056587177"/>
         <w:rPr>
           <w:rFonts w:ascii="Cambria" w:hAnsi="Cambria"/>
           <w:color w:val="000000"/>
@@ -1587,17 +1656,7 @@
           <w:szCs w:val="22"/>
           <w:lang w:val="en"/>
         </w:rPr>
-        <w:t xml:space="preserve"> (2022). </w:t>
-      </w:r>
-      <w:r>
-        <w:rPr>
-          <w:rFonts w:ascii="Cambria" w:hAnsi="Cambria"/>
-          <w:color w:val="000000"/>
-          <w:sz w:val="22"/>
-          <w:szCs w:val="22"/>
-          <w:lang w:val="en"/>
-        </w:rPr>
-        <w:t xml:space="preserve">A Study on Validation of Omnidirectional VR Treadmill by Comparison of Spatial Orientation Skills. </w:t>
+        <w:t xml:space="preserve"> (2022). A Study on Validation of Omnidirectional VR Treadmill by Comparison of Spatial Orientation Skills. </w:t>
       </w:r>
       <w:r>
         <w:rPr>
@@ -1624,7 +1683,7 @@
     <w:p>
       <w:pPr>
         <w:pStyle w:val="2"/>
-        <w:divId w:val="1499534705"/>
+        <w:divId w:val="1056587177"/>
         <w:rPr>
           <w:rFonts w:ascii="Cambria" w:hAnsi="Cambria"/>
           <w:color w:val="000000"/>
@@ -1644,7 +1703,7 @@
       <w:pPr>
         <w:pStyle w:val="3"/>
         <w:spacing w:before="240"/>
-        <w:divId w:val="1499534705"/>
+        <w:divId w:val="1056587177"/>
         <w:rPr>
           <w:rFonts w:ascii="Cambria" w:hAnsi="Cambria"/>
           <w:color w:val="000000"/>
@@ -1667,7 +1726,7 @@
           <w:numId w:val="5"/>
         </w:numPr>
         <w:spacing w:before="100" w:beforeAutospacing="1" w:after="100" w:afterAutospacing="1"/>
-        <w:divId w:val="1499534705"/>
+        <w:divId w:val="1056587177"/>
         <w:rPr>
           <w:rFonts w:ascii="Cambria" w:hAnsi="Cambria"/>
           <w:color w:val="000000"/>
@@ -1705,7 +1764,7 @@
           <w:numId w:val="5"/>
         </w:numPr>
         <w:spacing w:before="100" w:beforeAutospacing="1" w:after="100" w:afterAutospacing="1"/>
-        <w:divId w:val="1499534705"/>
+        <w:divId w:val="1056587177"/>
         <w:rPr>
           <w:rFonts w:ascii="Cambria" w:hAnsi="Cambria"/>
           <w:color w:val="000000"/>
@@ -1740,7 +1799,7 @@
       <w:pPr>
         <w:pStyle w:val="3"/>
         <w:spacing w:before="240"/>
-        <w:divId w:val="1499534705"/>
+        <w:divId w:val="1056587177"/>
         <w:rPr>
           <w:rFonts w:ascii="Cambria" w:hAnsi="Cambria"/>
           <w:color w:val="000000"/>
@@ -1763,7 +1822,7 @@
           <w:numId w:val="6"/>
         </w:numPr>
         <w:spacing w:before="100" w:beforeAutospacing="1" w:after="100" w:afterAutospacing="1"/>
-        <w:divId w:val="1499534705"/>
+        <w:divId w:val="1056587177"/>
         <w:rPr>
           <w:rFonts w:ascii="Cambria" w:hAnsi="Cambria"/>
           <w:color w:val="000000"/>
@@ -1907,7 +1966,7 @@
           <w:numId w:val="6"/>
         </w:numPr>
         <w:spacing w:before="100" w:beforeAutospacing="1" w:after="100" w:afterAutospacing="1"/>
-        <w:divId w:val="1499534705"/>
+        <w:divId w:val="1056587177"/>
         <w:rPr>
           <w:rFonts w:ascii="Cambria" w:hAnsi="Cambria"/>
           <w:color w:val="000000"/>
@@ -1998,7 +2057,7 @@
           <w:numId w:val="6"/>
         </w:numPr>
         <w:spacing w:before="100" w:beforeAutospacing="1" w:after="100" w:afterAutospacing="1"/>
-        <w:divId w:val="1499534705"/>
+        <w:divId w:val="1056587177"/>
         <w:rPr>
           <w:rFonts w:ascii="Cambria" w:hAnsi="Cambria"/>
           <w:color w:val="000000"/>
@@ -2099,7 +2158,7 @@
           <w:numId w:val="6"/>
         </w:numPr>
         <w:spacing w:before="100" w:beforeAutospacing="1" w:after="100" w:afterAutospacing="1"/>
-        <w:divId w:val="1499534705"/>
+        <w:divId w:val="1056587177"/>
         <w:rPr>
           <w:rFonts w:ascii="Cambria" w:hAnsi="Cambria"/>
           <w:color w:val="000000"/>
@@ -2190,7 +2249,7 @@
           <w:numId w:val="6"/>
         </w:numPr>
         <w:spacing w:before="100" w:beforeAutospacing="1" w:after="100" w:afterAutospacing="1"/>
-        <w:divId w:val="1499534705"/>
+        <w:divId w:val="1056587177"/>
         <w:rPr>
           <w:rFonts w:ascii="Cambria" w:hAnsi="Cambria"/>
           <w:color w:val="000000"/>
@@ -2277,7 +2336,7 @@
     <w:p>
       <w:pPr>
         <w:pStyle w:val="2"/>
-        <w:divId w:val="1499534705"/>
+        <w:divId w:val="1056587177"/>
         <w:rPr>
           <w:rFonts w:ascii="Cambria" w:hAnsi="Cambria"/>
           <w:color w:val="000000"/>
@@ -2300,7 +2359,7 @@
           <w:numId w:val="7"/>
         </w:numPr>
         <w:spacing w:before="100" w:beforeAutospacing="1" w:after="100" w:afterAutospacing="1"/>
-        <w:divId w:val="1499534705"/>
+        <w:divId w:val="1056587177"/>
         <w:rPr>
           <w:rFonts w:ascii="Cambria" w:hAnsi="Cambria"/>
           <w:color w:val="000000"/>
@@ -2366,7 +2425,7 @@
     <w:p>
       <w:pPr>
         <w:pStyle w:val="2"/>
-        <w:divId w:val="1499534705"/>
+        <w:divId w:val="1056587177"/>
         <w:rPr>
           <w:rFonts w:ascii="Cambria" w:hAnsi="Cambria"/>
           <w:color w:val="000000"/>
@@ -2399,7 +2458,7 @@
       </w:tblGrid>
       <w:tr>
         <w:trPr>
-          <w:divId w:val="1499534705"/>
+          <w:divId w:val="1056587177"/>
         </w:trPr>
         <w:tc>
           <w:tcPr>
@@ -2470,7 +2529,7 @@
       </w:tr>
       <w:tr>
         <w:trPr>
-          <w:divId w:val="1499534705"/>
+          <w:divId w:val="1056587177"/>
         </w:trPr>
         <w:tc>
           <w:tcPr>
@@ -2541,7 +2600,7 @@
       </w:tr>
       <w:tr>
         <w:trPr>
-          <w:divId w:val="1499534705"/>
+          <w:divId w:val="1056587177"/>
         </w:trPr>
         <w:tc>
           <w:tcPr>
@@ -2612,7 +2671,7 @@
       </w:tr>
       <w:tr>
         <w:trPr>
-          <w:divId w:val="1499534705"/>
+          <w:divId w:val="1056587177"/>
         </w:trPr>
         <w:tc>
           <w:tcPr>
@@ -2683,7 +2742,7 @@
       </w:tr>
       <w:tr>
         <w:trPr>
-          <w:divId w:val="1499534705"/>
+          <w:divId w:val="1056587177"/>
         </w:trPr>
         <w:tc>
           <w:tcPr>
@@ -2754,7 +2813,7 @@
       </w:tr>
       <w:tr>
         <w:trPr>
-          <w:divId w:val="1499534705"/>
+          <w:divId w:val="1056587177"/>
         </w:trPr>
         <w:tc>
           <w:tcPr>
@@ -2825,7 +2884,7 @@
       </w:tr>
       <w:tr>
         <w:trPr>
-          <w:divId w:val="1499534705"/>
+          <w:divId w:val="1056587177"/>
         </w:trPr>
         <w:tc>
           <w:tcPr>
@@ -2897,7 +2956,7 @@
       </w:tr>
       <w:tr>
         <w:trPr>
-          <w:divId w:val="1499534705"/>
+          <w:divId w:val="1056587177"/>
         </w:trPr>
         <w:tc>
           <w:tcPr>
@@ -2968,7 +3027,7 @@
       </w:tr>
       <w:tr>
         <w:trPr>
-          <w:divId w:val="1499534705"/>
+          <w:divId w:val="1056587177"/>
         </w:trPr>
         <w:tc>
           <w:tcPr>
@@ -3039,7 +3098,7 @@
       </w:tr>
       <w:tr>
         <w:trPr>
-          <w:divId w:val="1499534705"/>
+          <w:divId w:val="1056587177"/>
         </w:trPr>
         <w:tc>
           <w:tcPr>
@@ -3110,7 +3169,7 @@
       </w:tr>
       <w:tr>
         <w:trPr>
-          <w:divId w:val="1499534705"/>
+          <w:divId w:val="1056587177"/>
         </w:trPr>
         <w:tc>
           <w:tcPr>
@@ -3183,7 +3242,7 @@
     <w:p>
       <w:pPr>
         <w:pStyle w:val="2"/>
-        <w:divId w:val="1499534705"/>
+        <w:divId w:val="1056587177"/>
         <w:rPr>
           <w:rFonts w:ascii="Cambria" w:hAnsi="Cambria"/>
           <w:color w:val="000000"/>
@@ -3203,7 +3262,7 @@
       <w:pPr>
         <w:pStyle w:val="3"/>
         <w:spacing w:before="240"/>
-        <w:divId w:val="1499534705"/>
+        <w:divId w:val="1056587177"/>
         <w:rPr>
           <w:rFonts w:ascii="Cambria" w:hAnsi="Cambria"/>
           <w:color w:val="000000"/>
@@ -3236,7 +3295,7 @@
       </w:tblGrid>
       <w:tr>
         <w:trPr>
-          <w:divId w:val="1499534705"/>
+          <w:divId w:val="1056587177"/>
         </w:trPr>
         <w:tc>
           <w:tcPr>
@@ -3337,7 +3396,7 @@
       <w:pPr>
         <w:pStyle w:val="3"/>
         <w:spacing w:before="240"/>
-        <w:divId w:val="1499534705"/>
+        <w:divId w:val="1056587177"/>
         <w:rPr>
           <w:rFonts w:ascii="Cambria" w:hAnsi="Cambria"/>
           <w:color w:val="000000"/>
@@ -3370,7 +3429,7 @@
       </w:tblGrid>
       <w:tr>
         <w:trPr>
-          <w:divId w:val="1499534705"/>
+          <w:divId w:val="1056587177"/>
         </w:trPr>
         <w:tc>
           <w:tcPr>
@@ -3470,7 +3529,7 @@
     <w:p>
       <w:pPr>
         <w:pStyle w:val="2"/>
-        <w:divId w:val="1499534705"/>
+        <w:divId w:val="1056587177"/>
         <w:rPr>
           <w:rFonts w:ascii="Cambria" w:hAnsi="Cambria"/>
           <w:color w:val="000000"/>
@@ -3490,7 +3549,7 @@
       <w:pPr>
         <w:pStyle w:val="blank"/>
         <w:spacing w:before="60" w:beforeAutospacing="0" w:after="60" w:afterAutospacing="0"/>
-        <w:divId w:val="1499534705"/>
+        <w:divId w:val="1056587177"/>
         <w:rPr>
           <w:rFonts w:ascii="Cambria" w:hAnsi="Cambria"/>
           <w:sz w:val="22"/>
@@ -3511,7 +3570,7 @@
     <w:p>
       <w:pPr>
         <w:pStyle w:val="2"/>
-        <w:divId w:val="1499534705"/>
+        <w:divId w:val="1056587177"/>
         <w:rPr>
           <w:rFonts w:ascii="Cambria" w:hAnsi="Cambria"/>
           <w:color w:val="000000"/>
@@ -3544,7 +3603,7 @@
       </w:tblGrid>
       <w:tr>
         <w:trPr>
-          <w:divId w:val="1499534705"/>
+          <w:divId w:val="1056587177"/>
         </w:trPr>
         <w:tc>
           <w:tcPr>
@@ -3673,7 +3732,7 @@
       </w:tr>
       <w:tr>
         <w:trPr>
-          <w:divId w:val="1499534705"/>
+          <w:divId w:val="1056587177"/>
         </w:trPr>
         <w:tc>
           <w:tcPr>
@@ -3745,7 +3804,7 @@
       <w:pPr>
         <w:pStyle w:val="footer"/>
         <w:spacing w:after="60" w:afterAutospacing="0"/>
-        <w:divId w:val="1499534705"/>
+        <w:divId w:val="1056587177"/>
         <w:rPr>
           <w:rFonts w:ascii="Cambria" w:hAnsi="Cambria"/>
           <w:color w:val="000000"/>
@@ -3816,9 +3875,9 @@
 <file path=word/numbering.xml><?xml version="1.0" encoding="utf-8"?>
 <w:numbering xmlns:wpc="http://schemas.microsoft.com/office/word/2010/wordprocessingCanvas" xmlns:cx="http://schemas.microsoft.com/office/drawing/2014/chartex" xmlns:cx1="http://schemas.microsoft.com/office/drawing/2015/9/8/chartex" xmlns:cx2="http://schemas.microsoft.com/office/drawing/2015/10/21/chartex" xmlns:cx3="http://schemas.microsoft.com/office/drawing/2016/5/9/chartex" xmlns:cx4="http://schemas.microsoft.com/office/drawing/2016/5/10/chartex" xmlns:cx5="http://schemas.microsoft.com/office/drawing/2016/5/11/chartex" xmlns:cx6="http://schemas.microsoft.com/office/drawing/2016/5/12/chartex" xmlns:cx7="http://schemas.microsoft.com/office/drawing/2016/5/13/chartex" xmlns:cx8="http://schemas.microsoft.com/office/drawing/2016/5/14/chartex" xmlns:mc="http://schemas.openxmlformats.org/markup-compatibility/2006" xmlns:aink="http://schemas.microsoft.com/office/drawing/2016/ink" xmlns:am3d="http://schemas.microsoft.com/office/drawing/2017/model3d" xmlns:o="urn:schemas-microsoft-com:office:office" xmlns:oel="http://schemas.microsoft.com/office/2019/extlst" xmlns:r="http://schemas.openxmlformats.org/officeDocument/2006/relationships" xmlns:m="http://schemas.openxmlformats.org/officeDocument/2006/math" xmlns:v="urn:schemas-microsoft-com:vml" xmlns:wp14="http://schemas.microsoft.com/office/word/2010/wordprocessingDrawing" xmlns:wp="http://schemas.openxmlformats.org/drawingml/2006/wordprocessingDrawing" xmlns:w10="urn:schemas-microsoft-com:office:word" xmlns:w="http://schemas.openxmlformats.org/wordprocessingml/2006/main" xmlns:w14="http://schemas.microsoft.com/office/word/2010/wordml" xmlns:w15="http://schemas.microsoft.com/office/word/2012/wordml" xmlns:w16cex="http://schemas.microsoft.com/office/word/2018/wordml/cex" xmlns:w16cid="http://schemas.microsoft.com/office/word/2016/wordml/cid" xmlns:w16="http://schemas.microsoft.com/office/word/2018/wordml" xmlns:w16du="http://schemas.microsoft.com/office/word/2023/wordml/word16du" xmlns:w16sdtdh="http://schemas.microsoft.com/office/word/2020/wordml/sdtdatahash" xmlns:w16sdtfl="http://schemas.microsoft.com/office/word/2024/wordml/sdtformatlock" xmlns:w16se="http://schemas.microsoft.com/office/word/2015/wordml/symex" xmlns:wpg="http://schemas.microsoft.com/office/word/2010/wordprocessingGroup" xmlns:wpi="http://schemas.microsoft.com/office/word/2010/wordprocessingInk" xmlns:wne="http://schemas.microsoft.com/office/word/2006/wordml" xmlns:wps="http://schemas.microsoft.com/office/word/2010/wordprocessingShape" mc:Ignorable="w14 w15 w16se w16cid w16 w16cex w16sdtdh w16sdtfl w16du wp14">
   <w:abstractNum w:abstractNumId="0" w15:restartNumberingAfterBreak="0">
-    <w:nsid w:val="07493A60"/>
+    <w:nsid w:val="05105AF0"/>
     <w:multiLevelType w:val="multilevel"/>
-    <w:tmpl w:val="4FA25B4A"/>
+    <w:tmpl w:val="6D18A700"/>
     <w:lvl w:ilvl="0">
       <w:start w:val="1"/>
       <w:numFmt w:val="decimal"/>
@@ -3929,9 +3988,9 @@
     </w:lvl>
   </w:abstractNum>
   <w:abstractNum w:abstractNumId="1" w15:restartNumberingAfterBreak="0">
-    <w:nsid w:val="1EAB445B"/>
+    <w:nsid w:val="108D23E7"/>
     <w:multiLevelType w:val="multilevel"/>
-    <w:tmpl w:val="27425D3C"/>
+    <w:tmpl w:val="034E38A0"/>
     <w:lvl w:ilvl="0">
       <w:start w:val="1"/>
       <w:numFmt w:val="decimal"/>
@@ -4042,9 +4101,9 @@
     </w:lvl>
   </w:abstractNum>
   <w:abstractNum w:abstractNumId="2" w15:restartNumberingAfterBreak="0">
-    <w:nsid w:val="38A72FC2"/>
+    <w:nsid w:val="1E6A0932"/>
     <w:multiLevelType w:val="multilevel"/>
-    <w:tmpl w:val="BDBC67BA"/>
+    <w:tmpl w:val="C7688BF2"/>
     <w:lvl w:ilvl="0">
       <w:start w:val="1"/>
       <w:numFmt w:val="decimal"/>
@@ -4155,9 +4214,9 @@
     </w:lvl>
   </w:abstractNum>
   <w:abstractNum w:abstractNumId="3" w15:restartNumberingAfterBreak="0">
-    <w:nsid w:val="45BF7AEA"/>
+    <w:nsid w:val="2BC441AE"/>
     <w:multiLevelType w:val="multilevel"/>
-    <w:tmpl w:val="9154CBEA"/>
+    <w:tmpl w:val="D4D2397A"/>
     <w:lvl w:ilvl="0">
       <w:start w:val="1"/>
       <w:numFmt w:val="decimal"/>
@@ -4268,9 +4327,9 @@
     </w:lvl>
   </w:abstractNum>
   <w:abstractNum w:abstractNumId="4" w15:restartNumberingAfterBreak="0">
-    <w:nsid w:val="58016135"/>
+    <w:nsid w:val="4CB453B7"/>
     <w:multiLevelType w:val="multilevel"/>
-    <w:tmpl w:val="E51ACC7C"/>
+    <w:tmpl w:val="D6948C9E"/>
     <w:lvl w:ilvl="0">
       <w:start w:val="1"/>
       <w:numFmt w:val="decimal"/>
@@ -4381,9 +4440,9 @@
     </w:lvl>
   </w:abstractNum>
   <w:abstractNum w:abstractNumId="5" w15:restartNumberingAfterBreak="0">
-    <w:nsid w:val="61C46737"/>
+    <w:nsid w:val="60A907F4"/>
     <w:multiLevelType w:val="multilevel"/>
-    <w:tmpl w:val="F1026E4E"/>
+    <w:tmpl w:val="AE4899F8"/>
     <w:lvl w:ilvl="0">
       <w:start w:val="1"/>
       <w:numFmt w:val="decimal"/>
@@ -4494,9 +4553,9 @@
     </w:lvl>
   </w:abstractNum>
   <w:abstractNum w:abstractNumId="6" w15:restartNumberingAfterBreak="0">
-    <w:nsid w:val="768C1C28"/>
+    <w:nsid w:val="69721669"/>
     <w:multiLevelType w:val="multilevel"/>
-    <w:tmpl w:val="D8FA6C7E"/>
+    <w:tmpl w:val="B930F35C"/>
     <w:lvl w:ilvl="0">
       <w:start w:val="1"/>
       <w:numFmt w:val="decimal"/>
@@ -4606,26 +4665,26 @@
       </w:pPr>
     </w:lvl>
   </w:abstractNum>
-  <w:num w:numId="1" w16cid:durableId="874543975">
+  <w:num w:numId="1" w16cid:durableId="728960106">
+    <w:abstractNumId w:val="0"/>
+  </w:num>
+  <w:num w:numId="2" w16cid:durableId="1556621199">
+    <w:abstractNumId w:val="6"/>
+  </w:num>
+  <w:num w:numId="3" w16cid:durableId="811337458">
+    <w:abstractNumId w:val="5"/>
+  </w:num>
+  <w:num w:numId="4" w16cid:durableId="1673991711">
+    <w:abstractNumId w:val="1"/>
+  </w:num>
+  <w:num w:numId="5" w16cid:durableId="73674849">
+    <w:abstractNumId w:val="4"/>
+  </w:num>
+  <w:num w:numId="6" w16cid:durableId="744961267">
     <w:abstractNumId w:val="3"/>
   </w:num>
-  <w:num w:numId="2" w16cid:durableId="1082947479">
-    <w:abstractNumId w:val="6"/>
-  </w:num>
-  <w:num w:numId="3" w16cid:durableId="732431826">
-    <w:abstractNumId w:val="1"/>
-  </w:num>
-  <w:num w:numId="4" w16cid:durableId="1142038338">
-    <w:abstractNumId w:val="0"/>
-  </w:num>
-  <w:num w:numId="5" w16cid:durableId="66850661">
-    <w:abstractNumId w:val="5"/>
-  </w:num>
-  <w:num w:numId="6" w16cid:durableId="1870995840">
+  <w:num w:numId="7" w16cid:durableId="717514283">
     <w:abstractNumId w:val="2"/>
-  </w:num>
-  <w:num w:numId="7" w16cid:durableId="885682358">
-    <w:abstractNumId w:val="4"/>
   </w:num>
 </w:numbering>
 </file>
@@ -5373,7 +5432,7 @@
     <w:link w:val="Char"/>
     <w:uiPriority w:val="99"/>
     <w:unhideWhenUsed/>
-    <w:rsid w:val="00C95ABA"/>
+    <w:rsid w:val="008A3B3B"/>
     <w:pPr>
       <w:tabs>
         <w:tab w:val="center" w:pos="4513"/>
@@ -5387,7 +5446,7 @@
     <w:basedOn w:val="a0"/>
     <w:link w:val="a8"/>
     <w:uiPriority w:val="99"/>
-    <w:rsid w:val="00C95ABA"/>
+    <w:rsid w:val="008A3B3B"/>
     <w:rPr>
       <w:rFonts w:ascii="굴림" w:eastAsia="굴림" w:hAnsi="굴림" w:cs="굴림"/>
       <w:sz w:val="24"/>
@@ -5400,7 +5459,7 @@
     <w:link w:val="Char0"/>
     <w:uiPriority w:val="99"/>
     <w:unhideWhenUsed/>
-    <w:rsid w:val="00C95ABA"/>
+    <w:rsid w:val="008A3B3B"/>
     <w:pPr>
       <w:tabs>
         <w:tab w:val="center" w:pos="4513"/>
@@ -5414,7 +5473,7 @@
     <w:basedOn w:val="a0"/>
     <w:link w:val="a9"/>
     <w:uiPriority w:val="99"/>
-    <w:rsid w:val="00C95ABA"/>
+    <w:rsid w:val="008A3B3B"/>
     <w:rPr>
       <w:rFonts w:ascii="굴림" w:eastAsia="굴림" w:hAnsi="굴림" w:cs="굴림"/>
       <w:sz w:val="24"/>

</xml_diff>

<commit_message>
Add National Excellence Scholarship (Science & Engineering) — Jun 2026, until graduation
</commit_message>
<xml_diff>
--- a/Curriculum_Vitae_Hyunchul_Park.docx
+++ b/Curriculum_Vitae_Hyunchul_Park.docx
@@ -5,7 +5,7 @@
     <w:p>
       <w:pPr>
         <w:pStyle w:val="1"/>
-        <w:divId w:val="1056587177"/>
+        <w:divId w:val="1032220966"/>
         <w:rPr>
           <w:rFonts w:ascii="Cambria" w:hAnsi="Cambria"/>
           <w:color w:val="000000"/>
@@ -24,7 +24,7 @@
     <w:p>
       <w:pPr>
         <w:pStyle w:val="topbio"/>
-        <w:divId w:val="1056587177"/>
+        <w:divId w:val="1032220966"/>
         <w:rPr>
           <w:rFonts w:ascii="Cambria" w:hAnsi="Cambria"/>
           <w:color w:val="000000"/>
@@ -47,7 +47,7 @@
     <w:p>
       <w:pPr>
         <w:pStyle w:val="topbio"/>
-        <w:divId w:val="1056587177"/>
+        <w:divId w:val="1032220966"/>
         <w:rPr>
           <w:rFonts w:ascii="Cambria" w:hAnsi="Cambria"/>
           <w:color w:val="000000"/>
@@ -70,7 +70,7 @@
     <w:p>
       <w:pPr>
         <w:pStyle w:val="contact"/>
-        <w:divId w:val="1056587177"/>
+        <w:divId w:val="1032220966"/>
         <w:rPr>
           <w:rFonts w:ascii="Cambria" w:hAnsi="Cambria"/>
           <w:color w:val="000000"/>
@@ -106,7 +106,7 @@
     <w:p>
       <w:pPr>
         <w:pStyle w:val="contact"/>
-        <w:divId w:val="1056587177"/>
+        <w:divId w:val="1032220966"/>
         <w:rPr>
           <w:rFonts w:ascii="Cambria" w:hAnsi="Cambria"/>
           <w:color w:val="000000"/>
@@ -142,7 +142,7 @@
     <w:p>
       <w:pPr>
         <w:pStyle w:val="2"/>
-        <w:divId w:val="1056587177"/>
+        <w:divId w:val="1032220966"/>
         <w:rPr>
           <w:rFonts w:ascii="Cambria" w:hAnsi="Cambria"/>
           <w:color w:val="000000"/>
@@ -175,7 +175,7 @@
       </w:tblGrid>
       <w:tr>
         <w:trPr>
-          <w:divId w:val="1056587177"/>
+          <w:divId w:val="1032220966"/>
         </w:trPr>
         <w:tc>
           <w:tcPr>
@@ -294,7 +294,7 @@
       </w:tr>
       <w:tr>
         <w:trPr>
-          <w:divId w:val="1056587177"/>
+          <w:divId w:val="1032220966"/>
         </w:trPr>
         <w:tc>
           <w:tcPr>
@@ -413,7 +413,7 @@
       </w:tr>
       <w:tr>
         <w:trPr>
-          <w:divId w:val="1056587177"/>
+          <w:divId w:val="1032220966"/>
         </w:trPr>
         <w:tc>
           <w:tcPr>
@@ -497,7 +497,7 @@
     <w:p>
       <w:pPr>
         <w:pStyle w:val="2"/>
-        <w:divId w:val="1056587177"/>
+        <w:divId w:val="1032220966"/>
         <w:rPr>
           <w:rFonts w:ascii="Cambria" w:hAnsi="Cambria"/>
           <w:color w:val="000000"/>
@@ -516,7 +516,7 @@
     <w:p>
       <w:pPr>
         <w:pStyle w:val="a6"/>
-        <w:divId w:val="1056587177"/>
+        <w:divId w:val="1032220966"/>
         <w:rPr>
           <w:rFonts w:ascii="Cambria" w:hAnsi="Cambria"/>
           <w:color w:val="000000"/>
@@ -539,7 +539,7 @@
     <w:p>
       <w:pPr>
         <w:pStyle w:val="2"/>
-        <w:divId w:val="1056587177"/>
+        <w:divId w:val="1032220966"/>
         <w:rPr>
           <w:rFonts w:ascii="Cambria" w:hAnsi="Cambria"/>
           <w:color w:val="000000"/>
@@ -559,7 +559,7 @@
       <w:pPr>
         <w:pStyle w:val="blank"/>
         <w:spacing w:before="60" w:beforeAutospacing="0" w:after="120" w:afterAutospacing="0"/>
-        <w:divId w:val="1056587177"/>
+        <w:divId w:val="1032220966"/>
         <w:rPr>
           <w:rFonts w:ascii="Cambria" w:hAnsi="Cambria"/>
           <w:sz w:val="19"/>
@@ -611,7 +611,7 @@
       <w:pPr>
         <w:pStyle w:val="3"/>
         <w:spacing w:before="240"/>
-        <w:divId w:val="1056587177"/>
+        <w:divId w:val="1032220966"/>
         <w:rPr>
           <w:rFonts w:ascii="Cambria" w:hAnsi="Cambria"/>
           <w:color w:val="000000"/>
@@ -634,7 +634,7 @@
           <w:numId w:val="1"/>
         </w:numPr>
         <w:spacing w:before="100" w:beforeAutospacing="1" w:after="100" w:afterAutospacing="1"/>
-        <w:divId w:val="1056587177"/>
+        <w:divId w:val="1032220966"/>
         <w:rPr>
           <w:rFonts w:ascii="Cambria" w:hAnsi="Cambria"/>
           <w:color w:val="000000"/>
@@ -746,7 +746,7 @@
           <w:numId w:val="1"/>
         </w:numPr>
         <w:spacing w:before="100" w:beforeAutospacing="1" w:after="100" w:afterAutospacing="1"/>
-        <w:divId w:val="1056587177"/>
+        <w:divId w:val="1032220966"/>
         <w:rPr>
           <w:rFonts w:ascii="Cambria" w:hAnsi="Cambria"/>
           <w:color w:val="000000"/>
@@ -859,7 +859,7 @@
           <w:numId w:val="1"/>
         </w:numPr>
         <w:spacing w:before="100" w:beforeAutospacing="1" w:after="100" w:afterAutospacing="1"/>
-        <w:divId w:val="1056587177"/>
+        <w:divId w:val="1032220966"/>
         <w:rPr>
           <w:rFonts w:ascii="Cambria" w:hAnsi="Cambria"/>
           <w:color w:val="000000"/>
@@ -958,7 +958,7 @@
       <w:pPr>
         <w:pStyle w:val="3"/>
         <w:spacing w:before="240"/>
-        <w:divId w:val="1056587177"/>
+        <w:divId w:val="1032220966"/>
         <w:rPr>
           <w:rFonts w:ascii="Cambria" w:hAnsi="Cambria"/>
           <w:color w:val="000000"/>
@@ -981,7 +981,7 @@
           <w:numId w:val="2"/>
         </w:numPr>
         <w:spacing w:before="100" w:beforeAutospacing="1" w:after="100" w:afterAutospacing="1"/>
-        <w:divId w:val="1056587177"/>
+        <w:divId w:val="1032220966"/>
         <w:rPr>
           <w:rFonts w:ascii="Cambria" w:hAnsi="Cambria"/>
           <w:color w:val="000000"/>
@@ -1061,7 +1061,7 @@
           <w:numId w:val="2"/>
         </w:numPr>
         <w:spacing w:before="100" w:beforeAutospacing="1" w:after="100" w:afterAutospacing="1"/>
-        <w:divId w:val="1056587177"/>
+        <w:divId w:val="1032220966"/>
         <w:rPr>
           <w:rFonts w:ascii="Cambria" w:hAnsi="Cambria"/>
           <w:color w:val="000000"/>
@@ -1141,7 +1141,7 @@
           <w:numId w:val="2"/>
         </w:numPr>
         <w:spacing w:before="100" w:beforeAutospacing="1" w:after="100" w:afterAutospacing="1"/>
-        <w:divId w:val="1056587177"/>
+        <w:divId w:val="1032220966"/>
         <w:rPr>
           <w:rFonts w:ascii="Cambria" w:hAnsi="Cambria"/>
           <w:color w:val="000000"/>
@@ -1231,7 +1231,7 @@
           <w:numId w:val="2"/>
         </w:numPr>
         <w:spacing w:before="100" w:beforeAutospacing="1" w:after="100" w:afterAutospacing="1"/>
-        <w:divId w:val="1056587177"/>
+        <w:divId w:val="1032220966"/>
         <w:rPr>
           <w:rFonts w:ascii="Cambria" w:hAnsi="Cambria"/>
           <w:color w:val="000000"/>
@@ -1318,7 +1318,7 @@
       <w:pPr>
         <w:pStyle w:val="3"/>
         <w:spacing w:before="240"/>
-        <w:divId w:val="1056587177"/>
+        <w:divId w:val="1032220966"/>
         <w:rPr>
           <w:rFonts w:ascii="Cambria" w:hAnsi="Cambria"/>
           <w:color w:val="000000"/>
@@ -1341,7 +1341,7 @@
           <w:numId w:val="3"/>
         </w:numPr>
         <w:spacing w:before="100" w:beforeAutospacing="1" w:after="100" w:afterAutospacing="1"/>
-        <w:divId w:val="1056587177"/>
+        <w:divId w:val="1032220966"/>
         <w:rPr>
           <w:rFonts w:ascii="Cambria" w:hAnsi="Cambria"/>
           <w:color w:val="000000"/>
@@ -1400,7 +1400,7 @@
           <w:numId w:val="3"/>
         </w:numPr>
         <w:spacing w:before="100" w:beforeAutospacing="1" w:after="100" w:afterAutospacing="1"/>
-        <w:divId w:val="1056587177"/>
+        <w:divId w:val="1032220966"/>
         <w:rPr>
           <w:rFonts w:ascii="Cambria" w:hAnsi="Cambria"/>
           <w:color w:val="000000"/>
@@ -1459,7 +1459,7 @@
           <w:numId w:val="3"/>
         </w:numPr>
         <w:spacing w:before="100" w:beforeAutospacing="1" w:after="100" w:afterAutospacing="1"/>
-        <w:divId w:val="1056587177"/>
+        <w:divId w:val="1032220966"/>
         <w:rPr>
           <w:rFonts w:ascii="Cambria" w:hAnsi="Cambria"/>
           <w:color w:val="000000"/>
@@ -1518,7 +1518,7 @@
           <w:numId w:val="3"/>
         </w:numPr>
         <w:spacing w:before="100" w:beforeAutospacing="1" w:after="100" w:afterAutospacing="1"/>
-        <w:divId w:val="1056587177"/>
+        <w:divId w:val="1032220966"/>
         <w:rPr>
           <w:rFonts w:ascii="Cambria" w:hAnsi="Cambria"/>
           <w:color w:val="000000"/>
@@ -1584,7 +1584,7 @@
       <w:pPr>
         <w:pStyle w:val="3"/>
         <w:spacing w:before="240"/>
-        <w:divId w:val="1056587177"/>
+        <w:divId w:val="1032220966"/>
         <w:rPr>
           <w:rFonts w:ascii="Cambria" w:hAnsi="Cambria"/>
           <w:color w:val="000000"/>
@@ -1607,7 +1607,7 @@
           <w:numId w:val="4"/>
         </w:numPr>
         <w:spacing w:before="100" w:beforeAutospacing="1" w:after="100" w:afterAutospacing="1"/>
-        <w:divId w:val="1056587177"/>
+        <w:divId w:val="1032220966"/>
         <w:rPr>
           <w:rFonts w:ascii="Cambria" w:hAnsi="Cambria"/>
           <w:color w:val="000000"/>
@@ -1683,7 +1683,7 @@
     <w:p>
       <w:pPr>
         <w:pStyle w:val="2"/>
-        <w:divId w:val="1056587177"/>
+        <w:divId w:val="1032220966"/>
         <w:rPr>
           <w:rFonts w:ascii="Cambria" w:hAnsi="Cambria"/>
           <w:color w:val="000000"/>
@@ -1703,7 +1703,7 @@
       <w:pPr>
         <w:pStyle w:val="3"/>
         <w:spacing w:before="240"/>
-        <w:divId w:val="1056587177"/>
+        <w:divId w:val="1032220966"/>
         <w:rPr>
           <w:rFonts w:ascii="Cambria" w:hAnsi="Cambria"/>
           <w:color w:val="000000"/>
@@ -1726,7 +1726,7 @@
           <w:numId w:val="5"/>
         </w:numPr>
         <w:spacing w:before="100" w:beforeAutospacing="1" w:after="100" w:afterAutospacing="1"/>
-        <w:divId w:val="1056587177"/>
+        <w:divId w:val="1032220966"/>
         <w:rPr>
           <w:rFonts w:ascii="Cambria" w:hAnsi="Cambria"/>
           <w:color w:val="000000"/>
@@ -1764,7 +1764,7 @@
           <w:numId w:val="5"/>
         </w:numPr>
         <w:spacing w:before="100" w:beforeAutospacing="1" w:after="100" w:afterAutospacing="1"/>
-        <w:divId w:val="1056587177"/>
+        <w:divId w:val="1032220966"/>
         <w:rPr>
           <w:rFonts w:ascii="Cambria" w:hAnsi="Cambria"/>
           <w:color w:val="000000"/>
@@ -1799,7 +1799,7 @@
       <w:pPr>
         <w:pStyle w:val="3"/>
         <w:spacing w:before="240"/>
-        <w:divId w:val="1056587177"/>
+        <w:divId w:val="1032220966"/>
         <w:rPr>
           <w:rFonts w:ascii="Cambria" w:hAnsi="Cambria"/>
           <w:color w:val="000000"/>
@@ -1822,7 +1822,7 @@
           <w:numId w:val="6"/>
         </w:numPr>
         <w:spacing w:before="100" w:beforeAutospacing="1" w:after="100" w:afterAutospacing="1"/>
-        <w:divId w:val="1056587177"/>
+        <w:divId w:val="1032220966"/>
         <w:rPr>
           <w:rFonts w:ascii="Cambria" w:hAnsi="Cambria"/>
           <w:color w:val="000000"/>
@@ -1966,7 +1966,7 @@
           <w:numId w:val="6"/>
         </w:numPr>
         <w:spacing w:before="100" w:beforeAutospacing="1" w:after="100" w:afterAutospacing="1"/>
-        <w:divId w:val="1056587177"/>
+        <w:divId w:val="1032220966"/>
         <w:rPr>
           <w:rFonts w:ascii="Cambria" w:hAnsi="Cambria"/>
           <w:color w:val="000000"/>
@@ -2057,7 +2057,7 @@
           <w:numId w:val="6"/>
         </w:numPr>
         <w:spacing w:before="100" w:beforeAutospacing="1" w:after="100" w:afterAutospacing="1"/>
-        <w:divId w:val="1056587177"/>
+        <w:divId w:val="1032220966"/>
         <w:rPr>
           <w:rFonts w:ascii="Cambria" w:hAnsi="Cambria"/>
           <w:color w:val="000000"/>
@@ -2158,7 +2158,7 @@
           <w:numId w:val="6"/>
         </w:numPr>
         <w:spacing w:before="100" w:beforeAutospacing="1" w:after="100" w:afterAutospacing="1"/>
-        <w:divId w:val="1056587177"/>
+        <w:divId w:val="1032220966"/>
         <w:rPr>
           <w:rFonts w:ascii="Cambria" w:hAnsi="Cambria"/>
           <w:color w:val="000000"/>
@@ -2249,7 +2249,7 @@
           <w:numId w:val="6"/>
         </w:numPr>
         <w:spacing w:before="100" w:beforeAutospacing="1" w:after="100" w:afterAutospacing="1"/>
-        <w:divId w:val="1056587177"/>
+        <w:divId w:val="1032220966"/>
         <w:rPr>
           <w:rFonts w:ascii="Cambria" w:hAnsi="Cambria"/>
           <w:color w:val="000000"/>
@@ -2336,7 +2336,7 @@
     <w:p>
       <w:pPr>
         <w:pStyle w:val="2"/>
-        <w:divId w:val="1056587177"/>
+        <w:divId w:val="1032220966"/>
         <w:rPr>
           <w:rFonts w:ascii="Cambria" w:hAnsi="Cambria"/>
           <w:color w:val="000000"/>
@@ -2359,7 +2359,7 @@
           <w:numId w:val="7"/>
         </w:numPr>
         <w:spacing w:before="100" w:beforeAutospacing="1" w:after="100" w:afterAutospacing="1"/>
-        <w:divId w:val="1056587177"/>
+        <w:divId w:val="1032220966"/>
         <w:rPr>
           <w:rFonts w:ascii="Cambria" w:hAnsi="Cambria"/>
           <w:color w:val="000000"/>
@@ -2425,7 +2425,7 @@
     <w:p>
       <w:pPr>
         <w:pStyle w:val="2"/>
-        <w:divId w:val="1056587177"/>
+        <w:divId w:val="1032220966"/>
         <w:rPr>
           <w:rFonts w:ascii="Cambria" w:hAnsi="Cambria"/>
           <w:color w:val="000000"/>
@@ -2453,12 +2453,12 @@
         <w:tblLook w:val="04A0" w:firstRow="1" w:lastRow="0" w:firstColumn="1" w:lastColumn="0" w:noHBand="0" w:noVBand="1"/>
       </w:tblPr>
       <w:tblGrid>
-        <w:gridCol w:w="7717"/>
-        <w:gridCol w:w="1309"/>
+        <w:gridCol w:w="6845"/>
+        <w:gridCol w:w="2181"/>
       </w:tblGrid>
       <w:tr>
         <w:trPr>
-          <w:divId w:val="1056587177"/>
+          <w:divId w:val="1032220966"/>
         </w:trPr>
         <w:tc>
           <w:tcPr>
@@ -2488,7 +2488,34 @@
                 <w:sz w:val="22"/>
                 <w:szCs w:val="22"/>
               </w:rPr>
-              <w:t>IPESK Young Investigator Award (2nd)</w:t>
+              <w:t>National Excellence Scholarship (Science &amp; Engineering)</w:t>
+            </w:r>
+            <w:r>
+              <w:rPr>
+                <w:rFonts w:ascii="Cambria" w:hAnsi="Cambria"/>
+                <w:color w:val="000000"/>
+                <w:sz w:val="22"/>
+                <w:szCs w:val="22"/>
+              </w:rPr>
+              <w:br/>
+            </w:r>
+            <w:r>
+              <w:rPr>
+                <w:rStyle w:val="meta2"/>
+                <w:rFonts w:ascii="Cambria" w:hAnsi="Cambria"/>
+                <w:sz w:val="22"/>
+                <w:szCs w:val="22"/>
+              </w:rPr>
+              <w:t>Korea Student Aid Foundation. Awarded until graduation.</w:t>
+            </w:r>
+            <w:r>
+              <w:rPr>
+                <w:rFonts w:ascii="Cambria" w:hAnsi="Cambria"/>
+                <w:color w:val="000000"/>
+                <w:sz w:val="22"/>
+                <w:szCs w:val="22"/>
+              </w:rPr>
+              <w:t xml:space="preserve"> </w:t>
             </w:r>
           </w:p>
         </w:tc>
@@ -2522,14 +2549,14 @@
                 <w:sz w:val="22"/>
                 <w:szCs w:val="22"/>
               </w:rPr>
-              <w:t>Aug. 2025</w:t>
+              <w:t>Jun. 2026 – present</w:t>
             </w:r>
           </w:p>
         </w:tc>
       </w:tr>
       <w:tr>
         <w:trPr>
-          <w:divId w:val="1056587177"/>
+          <w:divId w:val="1032220966"/>
         </w:trPr>
         <w:tc>
           <w:tcPr>
@@ -2559,7 +2586,7 @@
                 <w:sz w:val="22"/>
                 <w:szCs w:val="22"/>
               </w:rPr>
-              <w:t>TRB Outstanding Paper Award (104th Annual Meeting) — Perfect 10/10 score</w:t>
+              <w:t>IPESK Young Investigator Award (2nd)</w:t>
             </w:r>
           </w:p>
         </w:tc>
@@ -2593,14 +2620,14 @@
                 <w:sz w:val="22"/>
                 <w:szCs w:val="22"/>
               </w:rPr>
-              <w:t>Jan. 2025</w:t>
+              <w:t>Aug. 2025</w:t>
             </w:r>
           </w:p>
         </w:tc>
       </w:tr>
       <w:tr>
         <w:trPr>
-          <w:divId w:val="1056587177"/>
+          <w:divId w:val="1032220966"/>
         </w:trPr>
         <w:tc>
           <w:tcPr>
@@ -2630,7 +2657,7 @@
                 <w:sz w:val="22"/>
                 <w:szCs w:val="22"/>
               </w:rPr>
-              <w:t>KAIST Graduate Student Outstanding Paper Award (KRW 1.5M)</w:t>
+              <w:t>TRB Outstanding Paper Award (104th Annual Meeting) — Perfect 10/10 score</w:t>
             </w:r>
           </w:p>
         </w:tc>
@@ -2664,14 +2691,14 @@
                 <w:sz w:val="22"/>
                 <w:szCs w:val="22"/>
               </w:rPr>
-              <w:t>Oct. 2024</w:t>
+              <w:t>Jan. 2025</w:t>
             </w:r>
           </w:p>
         </w:tc>
       </w:tr>
       <w:tr>
         <w:trPr>
-          <w:divId w:val="1056587177"/>
+          <w:divId w:val="1032220966"/>
         </w:trPr>
         <w:tc>
           <w:tcPr>
@@ -2701,7 +2728,7 @@
                 <w:sz w:val="22"/>
                 <w:szCs w:val="22"/>
               </w:rPr>
-              <w:t>Young-Han Kim Global Leader Scholarship (KRW 4M / year)</w:t>
+              <w:t>KAIST Graduate Student Outstanding Paper Award (KRW 1.5M)</w:t>
             </w:r>
           </w:p>
         </w:tc>
@@ -2735,14 +2762,14 @@
                 <w:sz w:val="22"/>
                 <w:szCs w:val="22"/>
               </w:rPr>
-              <w:t>Jul. 2024</w:t>
+              <w:t>Oct. 2024</w:t>
             </w:r>
           </w:p>
         </w:tc>
       </w:tr>
       <w:tr>
         <w:trPr>
-          <w:divId w:val="1056587177"/>
+          <w:divId w:val="1032220966"/>
         </w:trPr>
         <w:tc>
           <w:tcPr>
@@ -2772,7 +2799,7 @@
                 <w:sz w:val="22"/>
                 <w:szCs w:val="22"/>
               </w:rPr>
-              <w:t>NRF Graduate Student Research Encouragement Fund (KRW 12M)</w:t>
+              <w:t>Young-Han Kim Global Leader Scholarship (KRW 4M / year)</w:t>
             </w:r>
           </w:p>
         </w:tc>
@@ -2813,7 +2840,7 @@
       </w:tr>
       <w:tr>
         <w:trPr>
-          <w:divId w:val="1056587177"/>
+          <w:divId w:val="1032220966"/>
         </w:trPr>
         <w:tc>
           <w:tcPr>
@@ -2843,7 +2870,8 @@
                 <w:sz w:val="22"/>
                 <w:szCs w:val="22"/>
               </w:rPr>
-              <w:t>Best Teaching Assistant Award, KAIST</w:t>
+              <w:lastRenderedPageBreak/>
+              <w:t>NRF Graduate Student Research Encouragement Fund (KRW 12M)</w:t>
             </w:r>
           </w:p>
         </w:tc>
@@ -2877,14 +2905,14 @@
                 <w:sz w:val="22"/>
                 <w:szCs w:val="22"/>
               </w:rPr>
-              <w:t>Apr. 2024</w:t>
+              <w:t>Jul. 2024</w:t>
             </w:r>
           </w:p>
         </w:tc>
       </w:tr>
       <w:tr>
         <w:trPr>
-          <w:divId w:val="1056587177"/>
+          <w:divId w:val="1032220966"/>
         </w:trPr>
         <w:tc>
           <w:tcPr>
@@ -2914,8 +2942,7 @@
                 <w:sz w:val="22"/>
                 <w:szCs w:val="22"/>
               </w:rPr>
-              <w:lastRenderedPageBreak/>
-              <w:t>Korean Society of Transportation — President's Award (Distinguished Graduate)</w:t>
+              <w:t>Best Teaching Assistant Award, KAIST</w:t>
             </w:r>
           </w:p>
         </w:tc>
@@ -2949,14 +2976,14 @@
                 <w:sz w:val="22"/>
                 <w:szCs w:val="22"/>
               </w:rPr>
-              <w:t>Feb. 2024</w:t>
+              <w:t>Apr. 2024</w:t>
             </w:r>
           </w:p>
         </w:tc>
       </w:tr>
       <w:tr>
         <w:trPr>
-          <w:divId w:val="1056587177"/>
+          <w:divId w:val="1032220966"/>
         </w:trPr>
         <w:tc>
           <w:tcPr>
@@ -2986,7 +3013,7 @@
                 <w:sz w:val="22"/>
                 <w:szCs w:val="22"/>
               </w:rPr>
-              <w:t>KITS Best Paper Award</w:t>
+              <w:t>Korean Society of Transportation — President's Award (Distinguished Graduate)</w:t>
             </w:r>
           </w:p>
         </w:tc>
@@ -3020,14 +3047,14 @@
                 <w:sz w:val="22"/>
                 <w:szCs w:val="22"/>
               </w:rPr>
-              <w:t>Apr. 2023</w:t>
+              <w:t>Feb. 2024</w:t>
             </w:r>
           </w:p>
         </w:tc>
       </w:tr>
       <w:tr>
         <w:trPr>
-          <w:divId w:val="1056587177"/>
+          <w:divId w:val="1032220966"/>
         </w:trPr>
         <w:tc>
           <w:tcPr>
@@ -3091,14 +3118,14 @@
                 <w:sz w:val="22"/>
                 <w:szCs w:val="22"/>
               </w:rPr>
-              <w:t>Oct. 2021</w:t>
+              <w:t>Apr. 2023</w:t>
             </w:r>
           </w:p>
         </w:tc>
       </w:tr>
       <w:tr>
         <w:trPr>
-          <w:divId w:val="1056587177"/>
+          <w:divId w:val="1032220966"/>
         </w:trPr>
         <w:tc>
           <w:tcPr>
@@ -3128,7 +3155,7 @@
                 <w:sz w:val="22"/>
                 <w:szCs w:val="22"/>
               </w:rPr>
-              <w:t>UNIST Excellence Award (Marine Big Data Analysis Competition)</w:t>
+              <w:t>KITS Best Paper Award</w:t>
             </w:r>
           </w:p>
         </w:tc>
@@ -3162,14 +3189,14 @@
                 <w:sz w:val="22"/>
                 <w:szCs w:val="22"/>
               </w:rPr>
-              <w:t>Aug. 2021</w:t>
+              <w:t>Oct. 2021</w:t>
             </w:r>
           </w:p>
         </w:tc>
       </w:tr>
       <w:tr>
         <w:trPr>
-          <w:divId w:val="1056587177"/>
+          <w:divId w:val="1032220966"/>
         </w:trPr>
         <w:tc>
           <w:tcPr>
@@ -3199,7 +3226,7 @@
                 <w:sz w:val="22"/>
                 <w:szCs w:val="22"/>
               </w:rPr>
-              <w:t>Kongju National University President's Award (Capstone) — rescue-drone proposal; patent opportunity</w:t>
+              <w:t>UNIST Excellence Award (Marine Big Data Analysis Competition)</w:t>
             </w:r>
           </w:p>
         </w:tc>
@@ -3233,6 +3260,77 @@
                 <w:sz w:val="22"/>
                 <w:szCs w:val="22"/>
               </w:rPr>
+              <w:t>Aug. 2021</w:t>
+            </w:r>
+          </w:p>
+        </w:tc>
+      </w:tr>
+      <w:tr>
+        <w:trPr>
+          <w:divId w:val="1032220966"/>
+        </w:trPr>
+        <w:tc>
+          <w:tcPr>
+            <w:tcW w:w="0" w:type="auto"/>
+            <w:tcMar>
+              <w:top w:w="120" w:type="dxa"/>
+              <w:left w:w="0" w:type="dxa"/>
+              <w:bottom w:w="120" w:type="dxa"/>
+              <w:right w:w="0" w:type="dxa"/>
+            </w:tcMar>
+            <w:hideMark/>
+          </w:tcPr>
+          <w:p>
+            <w:pPr>
+              <w:spacing w:before="120" w:after="200"/>
+              <w:rPr>
+                <w:rFonts w:ascii="Cambria" w:hAnsi="Cambria"/>
+                <w:color w:val="000000"/>
+                <w:sz w:val="22"/>
+                <w:szCs w:val="22"/>
+              </w:rPr>
+            </w:pPr>
+            <w:r>
+              <w:rPr>
+                <w:rFonts w:ascii="Cambria" w:hAnsi="Cambria"/>
+                <w:color w:val="000000"/>
+                <w:sz w:val="22"/>
+                <w:szCs w:val="22"/>
+              </w:rPr>
+              <w:t>Kongju National University President's Award (Capstone) — rescue-drone proposal; patent opportunity</w:t>
+            </w:r>
+          </w:p>
+        </w:tc>
+        <w:tc>
+          <w:tcPr>
+            <w:tcW w:w="50" w:type="pct"/>
+            <w:noWrap/>
+            <w:tcMar>
+              <w:top w:w="120" w:type="dxa"/>
+              <w:left w:w="360" w:type="dxa"/>
+              <w:bottom w:w="120" w:type="dxa"/>
+              <w:right w:w="0" w:type="dxa"/>
+            </w:tcMar>
+            <w:hideMark/>
+          </w:tcPr>
+          <w:p>
+            <w:pPr>
+              <w:spacing w:before="120" w:after="200"/>
+              <w:jc w:val="right"/>
+              <w:rPr>
+                <w:rFonts w:ascii="Cambria" w:hAnsi="Cambria"/>
+                <w:color w:val="000000"/>
+                <w:sz w:val="22"/>
+                <w:szCs w:val="22"/>
+              </w:rPr>
+            </w:pPr>
+            <w:r>
+              <w:rPr>
+                <w:rFonts w:ascii="Cambria" w:hAnsi="Cambria"/>
+                <w:color w:val="000000"/>
+                <w:sz w:val="22"/>
+                <w:szCs w:val="22"/>
+              </w:rPr>
               <w:t>Dec. 2020</w:t>
             </w:r>
           </w:p>
@@ -3242,7 +3340,7 @@
     <w:p>
       <w:pPr>
         <w:pStyle w:val="2"/>
-        <w:divId w:val="1056587177"/>
+        <w:divId w:val="1032220966"/>
         <w:rPr>
           <w:rFonts w:ascii="Cambria" w:hAnsi="Cambria"/>
           <w:color w:val="000000"/>
@@ -3262,7 +3360,7 @@
       <w:pPr>
         <w:pStyle w:val="3"/>
         <w:spacing w:before="240"/>
-        <w:divId w:val="1056587177"/>
+        <w:divId w:val="1032220966"/>
         <w:rPr>
           <w:rFonts w:ascii="Cambria" w:hAnsi="Cambria"/>
           <w:color w:val="000000"/>
@@ -3295,7 +3393,7 @@
       </w:tblGrid>
       <w:tr>
         <w:trPr>
-          <w:divId w:val="1056587177"/>
+          <w:divId w:val="1032220966"/>
         </w:trPr>
         <w:tc>
           <w:tcPr>
@@ -3396,7 +3494,7 @@
       <w:pPr>
         <w:pStyle w:val="3"/>
         <w:spacing w:before="240"/>
-        <w:divId w:val="1056587177"/>
+        <w:divId w:val="1032220966"/>
         <w:rPr>
           <w:rFonts w:ascii="Cambria" w:hAnsi="Cambria"/>
           <w:color w:val="000000"/>
@@ -3429,7 +3527,7 @@
       </w:tblGrid>
       <w:tr>
         <w:trPr>
-          <w:divId w:val="1056587177"/>
+          <w:divId w:val="1032220966"/>
         </w:trPr>
         <w:tc>
           <w:tcPr>
@@ -3529,7 +3627,7 @@
     <w:p>
       <w:pPr>
         <w:pStyle w:val="2"/>
-        <w:divId w:val="1056587177"/>
+        <w:divId w:val="1032220966"/>
         <w:rPr>
           <w:rFonts w:ascii="Cambria" w:hAnsi="Cambria"/>
           <w:color w:val="000000"/>
@@ -3549,7 +3647,7 @@
       <w:pPr>
         <w:pStyle w:val="blank"/>
         <w:spacing w:before="60" w:beforeAutospacing="0" w:after="60" w:afterAutospacing="0"/>
-        <w:divId w:val="1056587177"/>
+        <w:divId w:val="1032220966"/>
         <w:rPr>
           <w:rFonts w:ascii="Cambria" w:hAnsi="Cambria"/>
           <w:sz w:val="22"/>
@@ -3570,7 +3668,7 @@
     <w:p>
       <w:pPr>
         <w:pStyle w:val="2"/>
-        <w:divId w:val="1056587177"/>
+        <w:divId w:val="1032220966"/>
         <w:rPr>
           <w:rFonts w:ascii="Cambria" w:hAnsi="Cambria"/>
           <w:color w:val="000000"/>
@@ -3603,7 +3701,7 @@
       </w:tblGrid>
       <w:tr>
         <w:trPr>
-          <w:divId w:val="1056587177"/>
+          <w:divId w:val="1032220966"/>
         </w:trPr>
         <w:tc>
           <w:tcPr>
@@ -3662,6 +3760,14 @@
                 <w:szCs w:val="22"/>
               </w:rPr>
               <w:br/>
+            </w:r>
+            <w:r>
+              <w:rPr>
+                <w:rFonts w:ascii="Cambria" w:hAnsi="Cambria"/>
+                <w:color w:val="000000"/>
+                <w:sz w:val="22"/>
+                <w:szCs w:val="22"/>
+              </w:rPr>
               <w:t>Professor, Cho Chun Shik Graduate School of Mobility,</w:t>
             </w:r>
             <w:r>
@@ -3732,7 +3838,7 @@
       </w:tr>
       <w:tr>
         <w:trPr>
-          <w:divId w:val="1056587177"/>
+          <w:divId w:val="1032220966"/>
         </w:trPr>
         <w:tc>
           <w:tcPr>
@@ -3804,7 +3910,7 @@
       <w:pPr>
         <w:pStyle w:val="footer"/>
         <w:spacing w:after="60" w:afterAutospacing="0"/>
-        <w:divId w:val="1056587177"/>
+        <w:divId w:val="1032220966"/>
         <w:rPr>
           <w:rFonts w:ascii="Cambria" w:hAnsi="Cambria"/>
           <w:color w:val="000000"/>
@@ -3875,9 +3981,9 @@
 <file path=word/numbering.xml><?xml version="1.0" encoding="utf-8"?>
 <w:numbering xmlns:wpc="http://schemas.microsoft.com/office/word/2010/wordprocessingCanvas" xmlns:cx="http://schemas.microsoft.com/office/drawing/2014/chartex" xmlns:cx1="http://schemas.microsoft.com/office/drawing/2015/9/8/chartex" xmlns:cx2="http://schemas.microsoft.com/office/drawing/2015/10/21/chartex" xmlns:cx3="http://schemas.microsoft.com/office/drawing/2016/5/9/chartex" xmlns:cx4="http://schemas.microsoft.com/office/drawing/2016/5/10/chartex" xmlns:cx5="http://schemas.microsoft.com/office/drawing/2016/5/11/chartex" xmlns:cx6="http://schemas.microsoft.com/office/drawing/2016/5/12/chartex" xmlns:cx7="http://schemas.microsoft.com/office/drawing/2016/5/13/chartex" xmlns:cx8="http://schemas.microsoft.com/office/drawing/2016/5/14/chartex" xmlns:mc="http://schemas.openxmlformats.org/markup-compatibility/2006" xmlns:aink="http://schemas.microsoft.com/office/drawing/2016/ink" xmlns:am3d="http://schemas.microsoft.com/office/drawing/2017/model3d" xmlns:o="urn:schemas-microsoft-com:office:office" xmlns:oel="http://schemas.microsoft.com/office/2019/extlst" xmlns:r="http://schemas.openxmlformats.org/officeDocument/2006/relationships" xmlns:m="http://schemas.openxmlformats.org/officeDocument/2006/math" xmlns:v="urn:schemas-microsoft-com:vml" xmlns:wp14="http://schemas.microsoft.com/office/word/2010/wordprocessingDrawing" xmlns:wp="http://schemas.openxmlformats.org/drawingml/2006/wordprocessingDrawing" xmlns:w10="urn:schemas-microsoft-com:office:word" xmlns:w="http://schemas.openxmlformats.org/wordprocessingml/2006/main" xmlns:w14="http://schemas.microsoft.com/office/word/2010/wordml" xmlns:w15="http://schemas.microsoft.com/office/word/2012/wordml" xmlns:w16cex="http://schemas.microsoft.com/office/word/2018/wordml/cex" xmlns:w16cid="http://schemas.microsoft.com/office/word/2016/wordml/cid" xmlns:w16="http://schemas.microsoft.com/office/word/2018/wordml" xmlns:w16du="http://schemas.microsoft.com/office/word/2023/wordml/word16du" xmlns:w16sdtdh="http://schemas.microsoft.com/office/word/2020/wordml/sdtdatahash" xmlns:w16sdtfl="http://schemas.microsoft.com/office/word/2024/wordml/sdtformatlock" xmlns:w16se="http://schemas.microsoft.com/office/word/2015/wordml/symex" xmlns:wpg="http://schemas.microsoft.com/office/word/2010/wordprocessingGroup" xmlns:wpi="http://schemas.microsoft.com/office/word/2010/wordprocessingInk" xmlns:wne="http://schemas.microsoft.com/office/word/2006/wordml" xmlns:wps="http://schemas.microsoft.com/office/word/2010/wordprocessingShape" mc:Ignorable="w14 w15 w16se w16cid w16 w16cex w16sdtdh w16sdtfl w16du wp14">
   <w:abstractNum w:abstractNumId="0" w15:restartNumberingAfterBreak="0">
-    <w:nsid w:val="05105AF0"/>
+    <w:nsid w:val="2046434F"/>
     <w:multiLevelType w:val="multilevel"/>
-    <w:tmpl w:val="6D18A700"/>
+    <w:tmpl w:val="6C021E72"/>
     <w:lvl w:ilvl="0">
       <w:start w:val="1"/>
       <w:numFmt w:val="decimal"/>
@@ -3988,9 +4094,9 @@
     </w:lvl>
   </w:abstractNum>
   <w:abstractNum w:abstractNumId="1" w15:restartNumberingAfterBreak="0">
-    <w:nsid w:val="108D23E7"/>
+    <w:nsid w:val="271C12DA"/>
     <w:multiLevelType w:val="multilevel"/>
-    <w:tmpl w:val="034E38A0"/>
+    <w:tmpl w:val="C5F250D8"/>
     <w:lvl w:ilvl="0">
       <w:start w:val="1"/>
       <w:numFmt w:val="decimal"/>
@@ -4101,9 +4207,9 @@
     </w:lvl>
   </w:abstractNum>
   <w:abstractNum w:abstractNumId="2" w15:restartNumberingAfterBreak="0">
-    <w:nsid w:val="1E6A0932"/>
+    <w:nsid w:val="2BC301D8"/>
     <w:multiLevelType w:val="multilevel"/>
-    <w:tmpl w:val="C7688BF2"/>
+    <w:tmpl w:val="CC8CB9D0"/>
     <w:lvl w:ilvl="0">
       <w:start w:val="1"/>
       <w:numFmt w:val="decimal"/>
@@ -4214,9 +4320,9 @@
     </w:lvl>
   </w:abstractNum>
   <w:abstractNum w:abstractNumId="3" w15:restartNumberingAfterBreak="0">
-    <w:nsid w:val="2BC441AE"/>
+    <w:nsid w:val="388D3796"/>
     <w:multiLevelType w:val="multilevel"/>
-    <w:tmpl w:val="D4D2397A"/>
+    <w:tmpl w:val="68922C66"/>
     <w:lvl w:ilvl="0">
       <w:start w:val="1"/>
       <w:numFmt w:val="decimal"/>
@@ -4327,9 +4433,9 @@
     </w:lvl>
   </w:abstractNum>
   <w:abstractNum w:abstractNumId="4" w15:restartNumberingAfterBreak="0">
-    <w:nsid w:val="4CB453B7"/>
+    <w:nsid w:val="5A4608EF"/>
     <w:multiLevelType w:val="multilevel"/>
-    <w:tmpl w:val="D6948C9E"/>
+    <w:tmpl w:val="CCB020CC"/>
     <w:lvl w:ilvl="0">
       <w:start w:val="1"/>
       <w:numFmt w:val="decimal"/>
@@ -4440,9 +4546,9 @@
     </w:lvl>
   </w:abstractNum>
   <w:abstractNum w:abstractNumId="5" w15:restartNumberingAfterBreak="0">
-    <w:nsid w:val="60A907F4"/>
+    <w:nsid w:val="775B424D"/>
     <w:multiLevelType w:val="multilevel"/>
-    <w:tmpl w:val="AE4899F8"/>
+    <w:tmpl w:val="73108EC2"/>
     <w:lvl w:ilvl="0">
       <w:start w:val="1"/>
       <w:numFmt w:val="decimal"/>
@@ -4553,9 +4659,9 @@
     </w:lvl>
   </w:abstractNum>
   <w:abstractNum w:abstractNumId="6" w15:restartNumberingAfterBreak="0">
-    <w:nsid w:val="69721669"/>
+    <w:nsid w:val="7B9560FB"/>
     <w:multiLevelType w:val="multilevel"/>
-    <w:tmpl w:val="B930F35C"/>
+    <w:tmpl w:val="91CA9606"/>
     <w:lvl w:ilvl="0">
       <w:start w:val="1"/>
       <w:numFmt w:val="decimal"/>
@@ -4665,26 +4771,26 @@
       </w:pPr>
     </w:lvl>
   </w:abstractNum>
-  <w:num w:numId="1" w16cid:durableId="728960106">
+  <w:num w:numId="1" w16cid:durableId="1071656194">
     <w:abstractNumId w:val="0"/>
   </w:num>
-  <w:num w:numId="2" w16cid:durableId="1556621199">
+  <w:num w:numId="2" w16cid:durableId="1270234255">
+    <w:abstractNumId w:val="4"/>
+  </w:num>
+  <w:num w:numId="3" w16cid:durableId="377582877">
+    <w:abstractNumId w:val="5"/>
+  </w:num>
+  <w:num w:numId="4" w16cid:durableId="1446728312">
+    <w:abstractNumId w:val="3"/>
+  </w:num>
+  <w:num w:numId="5" w16cid:durableId="2050302611">
     <w:abstractNumId w:val="6"/>
   </w:num>
-  <w:num w:numId="3" w16cid:durableId="811337458">
-    <w:abstractNumId w:val="5"/>
+  <w:num w:numId="6" w16cid:durableId="1891334980">
+    <w:abstractNumId w:val="2"/>
   </w:num>
-  <w:num w:numId="4" w16cid:durableId="1673991711">
+  <w:num w:numId="7" w16cid:durableId="1699349009">
     <w:abstractNumId w:val="1"/>
-  </w:num>
-  <w:num w:numId="5" w16cid:durableId="73674849">
-    <w:abstractNumId w:val="4"/>
-  </w:num>
-  <w:num w:numId="6" w16cid:durableId="744961267">
-    <w:abstractNumId w:val="3"/>
-  </w:num>
-  <w:num w:numId="7" w16cid:durableId="717514283">
-    <w:abstractNumId w:val="2"/>
   </w:num>
 </w:numbering>
 </file>
@@ -5432,7 +5538,7 @@
     <w:link w:val="Char"/>
     <w:uiPriority w:val="99"/>
     <w:unhideWhenUsed/>
-    <w:rsid w:val="008A3B3B"/>
+    <w:rsid w:val="009B0D43"/>
     <w:pPr>
       <w:tabs>
         <w:tab w:val="center" w:pos="4513"/>
@@ -5446,7 +5552,7 @@
     <w:basedOn w:val="a0"/>
     <w:link w:val="a8"/>
     <w:uiPriority w:val="99"/>
-    <w:rsid w:val="008A3B3B"/>
+    <w:rsid w:val="009B0D43"/>
     <w:rPr>
       <w:rFonts w:ascii="굴림" w:eastAsia="굴림" w:hAnsi="굴림" w:cs="굴림"/>
       <w:sz w:val="24"/>
@@ -5459,7 +5565,7 @@
     <w:link w:val="Char0"/>
     <w:uiPriority w:val="99"/>
     <w:unhideWhenUsed/>
-    <w:rsid w:val="008A3B3B"/>
+    <w:rsid w:val="009B0D43"/>
     <w:pPr>
       <w:tabs>
         <w:tab w:val="center" w:pos="4513"/>
@@ -5473,7 +5579,7 @@
     <w:basedOn w:val="a0"/>
     <w:link w:val="a9"/>
     <w:uiPriority w:val="99"/>
-    <w:rsid w:val="008A3B3B"/>
+    <w:rsid w:val="009B0D43"/>
     <w:rPr>
       <w:rFonts w:ascii="굴림" w:eastAsia="굴림" w:hAnsi="굴림" w:cs="굴림"/>
       <w:sz w:val="24"/>

</xml_diff>

<commit_message>
Remove em-dashes site-wide: replaced with periods, commas, parentheses, or hyphens
</commit_message>
<xml_diff>
--- a/Curriculum_Vitae_Hyunchul_Park.docx
+++ b/Curriculum_Vitae_Hyunchul_Park.docx
@@ -5,7 +5,7 @@
     <w:p>
       <w:pPr>
         <w:pStyle w:val="1"/>
-        <w:divId w:val="1032220966"/>
+        <w:divId w:val="1790011428"/>
         <w:rPr>
           <w:rFonts w:ascii="Cambria" w:hAnsi="Cambria"/>
           <w:color w:val="000000"/>
@@ -24,7 +24,7 @@
     <w:p>
       <w:pPr>
         <w:pStyle w:val="topbio"/>
-        <w:divId w:val="1032220966"/>
+        <w:divId w:val="1790011428"/>
         <w:rPr>
           <w:rFonts w:ascii="Cambria" w:hAnsi="Cambria"/>
           <w:color w:val="000000"/>
@@ -47,7 +47,7 @@
     <w:p>
       <w:pPr>
         <w:pStyle w:val="topbio"/>
-        <w:divId w:val="1032220966"/>
+        <w:divId w:val="1790011428"/>
         <w:rPr>
           <w:rFonts w:ascii="Cambria" w:hAnsi="Cambria"/>
           <w:color w:val="000000"/>
@@ -70,7 +70,7 @@
     <w:p>
       <w:pPr>
         <w:pStyle w:val="contact"/>
-        <w:divId w:val="1032220966"/>
+        <w:divId w:val="1790011428"/>
         <w:rPr>
           <w:rFonts w:ascii="Cambria" w:hAnsi="Cambria"/>
           <w:color w:val="000000"/>
@@ -106,7 +106,7 @@
     <w:p>
       <w:pPr>
         <w:pStyle w:val="contact"/>
-        <w:divId w:val="1032220966"/>
+        <w:divId w:val="1790011428"/>
         <w:rPr>
           <w:rFonts w:ascii="Cambria" w:hAnsi="Cambria"/>
           <w:color w:val="000000"/>
@@ -142,7 +142,7 @@
     <w:p>
       <w:pPr>
         <w:pStyle w:val="2"/>
-        <w:divId w:val="1032220966"/>
+        <w:divId w:val="1790011428"/>
         <w:rPr>
           <w:rFonts w:ascii="Cambria" w:hAnsi="Cambria"/>
           <w:color w:val="000000"/>
@@ -175,7 +175,7 @@
       </w:tblGrid>
       <w:tr>
         <w:trPr>
-          <w:divId w:val="1032220966"/>
+          <w:divId w:val="1790011428"/>
         </w:trPr>
         <w:tc>
           <w:tcPr>
@@ -294,7 +294,7 @@
       </w:tr>
       <w:tr>
         <w:trPr>
-          <w:divId w:val="1032220966"/>
+          <w:divId w:val="1790011428"/>
         </w:trPr>
         <w:tc>
           <w:tcPr>
@@ -413,7 +413,7 @@
       </w:tr>
       <w:tr>
         <w:trPr>
-          <w:divId w:val="1032220966"/>
+          <w:divId w:val="1790011428"/>
         </w:trPr>
         <w:tc>
           <w:tcPr>
@@ -497,7 +497,7 @@
     <w:p>
       <w:pPr>
         <w:pStyle w:val="2"/>
-        <w:divId w:val="1032220966"/>
+        <w:divId w:val="1790011428"/>
         <w:rPr>
           <w:rFonts w:ascii="Cambria" w:hAnsi="Cambria"/>
           <w:color w:val="000000"/>
@@ -516,7 +516,7 @@
     <w:p>
       <w:pPr>
         <w:pStyle w:val="a6"/>
-        <w:divId w:val="1032220966"/>
+        <w:divId w:val="1790011428"/>
         <w:rPr>
           <w:rFonts w:ascii="Cambria" w:hAnsi="Cambria"/>
           <w:color w:val="000000"/>
@@ -539,7 +539,7 @@
     <w:p>
       <w:pPr>
         <w:pStyle w:val="2"/>
-        <w:divId w:val="1032220966"/>
+        <w:divId w:val="1790011428"/>
         <w:rPr>
           <w:rFonts w:ascii="Cambria" w:hAnsi="Cambria"/>
           <w:color w:val="000000"/>
@@ -559,7 +559,7 @@
       <w:pPr>
         <w:pStyle w:val="blank"/>
         <w:spacing w:before="60" w:beforeAutospacing="0" w:after="120" w:afterAutospacing="0"/>
-        <w:divId w:val="1032220966"/>
+        <w:divId w:val="1790011428"/>
         <w:rPr>
           <w:rFonts w:ascii="Cambria" w:hAnsi="Cambria"/>
           <w:sz w:val="19"/>
@@ -611,7 +611,7 @@
       <w:pPr>
         <w:pStyle w:val="3"/>
         <w:spacing w:before="240"/>
-        <w:divId w:val="1032220966"/>
+        <w:divId w:val="1790011428"/>
         <w:rPr>
           <w:rFonts w:ascii="Cambria" w:hAnsi="Cambria"/>
           <w:color w:val="000000"/>
@@ -634,7 +634,7 @@
           <w:numId w:val="1"/>
         </w:numPr>
         <w:spacing w:before="100" w:beforeAutospacing="1" w:after="100" w:afterAutospacing="1"/>
-        <w:divId w:val="1032220966"/>
+        <w:divId w:val="1790011428"/>
         <w:rPr>
           <w:rFonts w:ascii="Cambria" w:hAnsi="Cambria"/>
           <w:color w:val="000000"/>
@@ -746,7 +746,7 @@
           <w:numId w:val="1"/>
         </w:numPr>
         <w:spacing w:before="100" w:beforeAutospacing="1" w:after="100" w:afterAutospacing="1"/>
-        <w:divId w:val="1032220966"/>
+        <w:divId w:val="1790011428"/>
         <w:rPr>
           <w:rFonts w:ascii="Cambria" w:hAnsi="Cambria"/>
           <w:color w:val="000000"/>
@@ -859,7 +859,7 @@
           <w:numId w:val="1"/>
         </w:numPr>
         <w:spacing w:before="100" w:beforeAutospacing="1" w:after="100" w:afterAutospacing="1"/>
-        <w:divId w:val="1032220966"/>
+        <w:divId w:val="1790011428"/>
         <w:rPr>
           <w:rFonts w:ascii="Cambria" w:hAnsi="Cambria"/>
           <w:color w:val="000000"/>
@@ -958,7 +958,7 @@
       <w:pPr>
         <w:pStyle w:val="3"/>
         <w:spacing w:before="240"/>
-        <w:divId w:val="1032220966"/>
+        <w:divId w:val="1790011428"/>
         <w:rPr>
           <w:rFonts w:ascii="Cambria" w:hAnsi="Cambria"/>
           <w:color w:val="000000"/>
@@ -981,7 +981,7 @@
           <w:numId w:val="2"/>
         </w:numPr>
         <w:spacing w:before="100" w:beforeAutospacing="1" w:after="100" w:afterAutospacing="1"/>
-        <w:divId w:val="1032220966"/>
+        <w:divId w:val="1790011428"/>
         <w:rPr>
           <w:rFonts w:ascii="Cambria" w:hAnsi="Cambria"/>
           <w:color w:val="000000"/>
@@ -1061,7 +1061,7 @@
           <w:numId w:val="2"/>
         </w:numPr>
         <w:spacing w:before="100" w:beforeAutospacing="1" w:after="100" w:afterAutospacing="1"/>
-        <w:divId w:val="1032220966"/>
+        <w:divId w:val="1790011428"/>
         <w:rPr>
           <w:rFonts w:ascii="Cambria" w:hAnsi="Cambria"/>
           <w:color w:val="000000"/>
@@ -1141,7 +1141,7 @@
           <w:numId w:val="2"/>
         </w:numPr>
         <w:spacing w:before="100" w:beforeAutospacing="1" w:after="100" w:afterAutospacing="1"/>
-        <w:divId w:val="1032220966"/>
+        <w:divId w:val="1790011428"/>
         <w:rPr>
           <w:rFonts w:ascii="Cambria" w:hAnsi="Cambria"/>
           <w:color w:val="000000"/>
@@ -1231,7 +1231,7 @@
           <w:numId w:val="2"/>
         </w:numPr>
         <w:spacing w:before="100" w:beforeAutospacing="1" w:after="100" w:afterAutospacing="1"/>
-        <w:divId w:val="1032220966"/>
+        <w:divId w:val="1790011428"/>
         <w:rPr>
           <w:rFonts w:ascii="Cambria" w:hAnsi="Cambria"/>
           <w:color w:val="000000"/>
@@ -1318,7 +1318,7 @@
       <w:pPr>
         <w:pStyle w:val="3"/>
         <w:spacing w:before="240"/>
-        <w:divId w:val="1032220966"/>
+        <w:divId w:val="1790011428"/>
         <w:rPr>
           <w:rFonts w:ascii="Cambria" w:hAnsi="Cambria"/>
           <w:color w:val="000000"/>
@@ -1341,7 +1341,7 @@
           <w:numId w:val="3"/>
         </w:numPr>
         <w:spacing w:before="100" w:beforeAutospacing="1" w:after="100" w:afterAutospacing="1"/>
-        <w:divId w:val="1032220966"/>
+        <w:divId w:val="1790011428"/>
         <w:rPr>
           <w:rFonts w:ascii="Cambria" w:hAnsi="Cambria"/>
           <w:color w:val="000000"/>
@@ -1400,7 +1400,7 @@
           <w:numId w:val="3"/>
         </w:numPr>
         <w:spacing w:before="100" w:beforeAutospacing="1" w:after="100" w:afterAutospacing="1"/>
-        <w:divId w:val="1032220966"/>
+        <w:divId w:val="1790011428"/>
         <w:rPr>
           <w:rFonts w:ascii="Cambria" w:hAnsi="Cambria"/>
           <w:color w:val="000000"/>
@@ -1459,7 +1459,7 @@
           <w:numId w:val="3"/>
         </w:numPr>
         <w:spacing w:before="100" w:beforeAutospacing="1" w:after="100" w:afterAutospacing="1"/>
-        <w:divId w:val="1032220966"/>
+        <w:divId w:val="1790011428"/>
         <w:rPr>
           <w:rFonts w:ascii="Cambria" w:hAnsi="Cambria"/>
           <w:color w:val="000000"/>
@@ -1518,7 +1518,7 @@
           <w:numId w:val="3"/>
         </w:numPr>
         <w:spacing w:before="100" w:beforeAutospacing="1" w:after="100" w:afterAutospacing="1"/>
-        <w:divId w:val="1032220966"/>
+        <w:divId w:val="1790011428"/>
         <w:rPr>
           <w:rFonts w:ascii="Cambria" w:hAnsi="Cambria"/>
           <w:color w:val="000000"/>
@@ -1584,7 +1584,7 @@
       <w:pPr>
         <w:pStyle w:val="3"/>
         <w:spacing w:before="240"/>
-        <w:divId w:val="1032220966"/>
+        <w:divId w:val="1790011428"/>
         <w:rPr>
           <w:rFonts w:ascii="Cambria" w:hAnsi="Cambria"/>
           <w:color w:val="000000"/>
@@ -1607,7 +1607,7 @@
           <w:numId w:val="4"/>
         </w:numPr>
         <w:spacing w:before="100" w:beforeAutospacing="1" w:after="100" w:afterAutospacing="1"/>
-        <w:divId w:val="1032220966"/>
+        <w:divId w:val="1790011428"/>
         <w:rPr>
           <w:rFonts w:ascii="Cambria" w:hAnsi="Cambria"/>
           <w:color w:val="000000"/>
@@ -1683,7 +1683,7 @@
     <w:p>
       <w:pPr>
         <w:pStyle w:val="2"/>
-        <w:divId w:val="1032220966"/>
+        <w:divId w:val="1790011428"/>
         <w:rPr>
           <w:rFonts w:ascii="Cambria" w:hAnsi="Cambria"/>
           <w:color w:val="000000"/>
@@ -1703,7 +1703,7 @@
       <w:pPr>
         <w:pStyle w:val="3"/>
         <w:spacing w:before="240"/>
-        <w:divId w:val="1032220966"/>
+        <w:divId w:val="1790011428"/>
         <w:rPr>
           <w:rFonts w:ascii="Cambria" w:hAnsi="Cambria"/>
           <w:color w:val="000000"/>
@@ -1726,7 +1726,7 @@
           <w:numId w:val="5"/>
         </w:numPr>
         <w:spacing w:before="100" w:beforeAutospacing="1" w:after="100" w:afterAutospacing="1"/>
-        <w:divId w:val="1032220966"/>
+        <w:divId w:val="1790011428"/>
         <w:rPr>
           <w:rFonts w:ascii="Cambria" w:hAnsi="Cambria"/>
           <w:color w:val="000000"/>
@@ -1754,7 +1754,7 @@
           <w:szCs w:val="22"/>
           <w:lang w:val="en"/>
         </w:rPr>
-        <w:t xml:space="preserve">, 2026 — Upcoming presentation. </w:t>
+        <w:t xml:space="preserve">, 2026. Upcoming presentation. </w:t>
       </w:r>
     </w:p>
     <w:p>
@@ -1764,7 +1764,7 @@
           <w:numId w:val="5"/>
         </w:numPr>
         <w:spacing w:before="100" w:beforeAutospacing="1" w:after="100" w:afterAutospacing="1"/>
-        <w:divId w:val="1032220966"/>
+        <w:divId w:val="1790011428"/>
         <w:rPr>
           <w:rFonts w:ascii="Cambria" w:hAnsi="Cambria"/>
           <w:color w:val="000000"/>
@@ -1792,14 +1792,14 @@
           <w:szCs w:val="22"/>
           <w:lang w:val="en"/>
         </w:rPr>
-        <w:t xml:space="preserve">, Jeju Island, Republic of Korea, Jul. 8–10, 2026 — Upcoming presentation. </w:t>
+        <w:t xml:space="preserve">, Jeju Island, Republic of Korea, Jul. 8–10, 2026. Upcoming presentation. </w:t>
       </w:r>
     </w:p>
     <w:p>
       <w:pPr>
         <w:pStyle w:val="3"/>
         <w:spacing w:before="240"/>
-        <w:divId w:val="1032220966"/>
+        <w:divId w:val="1790011428"/>
         <w:rPr>
           <w:rFonts w:ascii="Cambria" w:hAnsi="Cambria"/>
           <w:color w:val="000000"/>
@@ -1822,7 +1822,7 @@
           <w:numId w:val="6"/>
         </w:numPr>
         <w:spacing w:before="100" w:beforeAutospacing="1" w:after="100" w:afterAutospacing="1"/>
-        <w:divId w:val="1032220966"/>
+        <w:divId w:val="1790011428"/>
         <w:rPr>
           <w:rFonts w:ascii="Cambria" w:hAnsi="Cambria"/>
           <w:color w:val="000000"/>
@@ -1904,7 +1904,7 @@
           <w:szCs w:val="22"/>
           <w:lang w:val="en"/>
         </w:rPr>
-        <w:t>, Washington, DC, USA, 2025 — Oral presentation.</w:t>
+        <w:t>, Washington, DC, USA, 2025. Oral presentation.</w:t>
       </w:r>
       <w:r>
         <w:rPr>
@@ -1966,7 +1966,7 @@
           <w:numId w:val="6"/>
         </w:numPr>
         <w:spacing w:before="100" w:beforeAutospacing="1" w:after="100" w:afterAutospacing="1"/>
-        <w:divId w:val="1032220966"/>
+        <w:divId w:val="1790011428"/>
         <w:rPr>
           <w:rFonts w:ascii="Cambria" w:hAnsi="Cambria"/>
           <w:color w:val="000000"/>
@@ -2047,7 +2047,7 @@
           <w:szCs w:val="22"/>
           <w:lang w:val="en"/>
         </w:rPr>
-        <w:t xml:space="preserve">, the Hague, Netherlands, 2024 — Oral presentation. </w:t>
+        <w:t xml:space="preserve">, the Hague, Netherlands, 2024. Oral presentation. </w:t>
       </w:r>
     </w:p>
     <w:p>
@@ -2057,7 +2057,7 @@
           <w:numId w:val="6"/>
         </w:numPr>
         <w:spacing w:before="100" w:beforeAutospacing="1" w:after="100" w:afterAutospacing="1"/>
-        <w:divId w:val="1032220966"/>
+        <w:divId w:val="1790011428"/>
         <w:rPr>
           <w:rFonts w:ascii="Cambria" w:hAnsi="Cambria"/>
           <w:color w:val="000000"/>
@@ -2148,7 +2148,7 @@
           <w:szCs w:val="22"/>
           <w:lang w:val="en"/>
         </w:rPr>
-        <w:t xml:space="preserve">, Washington, DC, USA, 2024 — Poster session. </w:t>
+        <w:t xml:space="preserve">, Washington, DC, USA, 2024. Poster session. </w:t>
       </w:r>
     </w:p>
     <w:p>
@@ -2158,7 +2158,7 @@
           <w:numId w:val="6"/>
         </w:numPr>
         <w:spacing w:before="100" w:beforeAutospacing="1" w:after="100" w:afterAutospacing="1"/>
-        <w:divId w:val="1032220966"/>
+        <w:divId w:val="1790011428"/>
         <w:rPr>
           <w:rFonts w:ascii="Cambria" w:hAnsi="Cambria"/>
           <w:color w:val="000000"/>
@@ -2239,7 +2239,7 @@
           <w:szCs w:val="22"/>
           <w:lang w:val="en"/>
         </w:rPr>
-        <w:t xml:space="preserve">, Washington, DC, USA, 2023 — Poster session. </w:t>
+        <w:t xml:space="preserve">, Washington, DC, USA, 2023. Poster session. </w:t>
       </w:r>
     </w:p>
     <w:p>
@@ -2249,7 +2249,7 @@
           <w:numId w:val="6"/>
         </w:numPr>
         <w:spacing w:before="100" w:beforeAutospacing="1" w:after="100" w:afterAutospacing="1"/>
-        <w:divId w:val="1032220966"/>
+        <w:divId w:val="1790011428"/>
         <w:rPr>
           <w:rFonts w:ascii="Cambria" w:hAnsi="Cambria"/>
           <w:color w:val="000000"/>
@@ -2330,13 +2330,13 @@
           <w:szCs w:val="22"/>
           <w:lang w:val="en"/>
         </w:rPr>
-        <w:t xml:space="preserve">, Los Angeles, USA, 2022 — Oral presentation. </w:t>
+        <w:t xml:space="preserve">, Los Angeles, USA, 2022. Oral presentation. </w:t>
       </w:r>
     </w:p>
     <w:p>
       <w:pPr>
         <w:pStyle w:val="2"/>
-        <w:divId w:val="1032220966"/>
+        <w:divId w:val="1790011428"/>
         <w:rPr>
           <w:rFonts w:ascii="Cambria" w:hAnsi="Cambria"/>
           <w:color w:val="000000"/>
@@ -2359,7 +2359,7 @@
           <w:numId w:val="7"/>
         </w:numPr>
         <w:spacing w:before="100" w:beforeAutospacing="1" w:after="100" w:afterAutospacing="1"/>
-        <w:divId w:val="1032220966"/>
+        <w:divId w:val="1790011428"/>
         <w:rPr>
           <w:rFonts w:ascii="Cambria" w:hAnsi="Cambria"/>
           <w:color w:val="000000"/>
@@ -2425,7 +2425,7 @@
     <w:p>
       <w:pPr>
         <w:pStyle w:val="2"/>
-        <w:divId w:val="1032220966"/>
+        <w:divId w:val="1790011428"/>
         <w:rPr>
           <w:rFonts w:ascii="Cambria" w:hAnsi="Cambria"/>
           <w:color w:val="000000"/>
@@ -2458,7 +2458,7 @@
       </w:tblGrid>
       <w:tr>
         <w:trPr>
-          <w:divId w:val="1032220966"/>
+          <w:divId w:val="1790011428"/>
         </w:trPr>
         <w:tc>
           <w:tcPr>
@@ -2556,7 +2556,7 @@
       </w:tr>
       <w:tr>
         <w:trPr>
-          <w:divId w:val="1032220966"/>
+          <w:divId w:val="1790011428"/>
         </w:trPr>
         <w:tc>
           <w:tcPr>
@@ -2627,7 +2627,7 @@
       </w:tr>
       <w:tr>
         <w:trPr>
-          <w:divId w:val="1032220966"/>
+          <w:divId w:val="1790011428"/>
         </w:trPr>
         <w:tc>
           <w:tcPr>
@@ -2657,7 +2657,7 @@
                 <w:sz w:val="22"/>
                 <w:szCs w:val="22"/>
               </w:rPr>
-              <w:t>TRB Outstanding Paper Award (104th Annual Meeting) — Perfect 10/10 score</w:t>
+              <w:t>TRB Outstanding Paper Award (104th Annual Meeting). Perfect 10/10 score</w:t>
             </w:r>
           </w:p>
         </w:tc>
@@ -2698,7 +2698,7 @@
       </w:tr>
       <w:tr>
         <w:trPr>
-          <w:divId w:val="1032220966"/>
+          <w:divId w:val="1790011428"/>
         </w:trPr>
         <w:tc>
           <w:tcPr>
@@ -2769,7 +2769,7 @@
       </w:tr>
       <w:tr>
         <w:trPr>
-          <w:divId w:val="1032220966"/>
+          <w:divId w:val="1790011428"/>
         </w:trPr>
         <w:tc>
           <w:tcPr>
@@ -2840,7 +2840,7 @@
       </w:tr>
       <w:tr>
         <w:trPr>
-          <w:divId w:val="1032220966"/>
+          <w:divId w:val="1790011428"/>
         </w:trPr>
         <w:tc>
           <w:tcPr>
@@ -2912,7 +2912,7 @@
       </w:tr>
       <w:tr>
         <w:trPr>
-          <w:divId w:val="1032220966"/>
+          <w:divId w:val="1790011428"/>
         </w:trPr>
         <w:tc>
           <w:tcPr>
@@ -2983,7 +2983,7 @@
       </w:tr>
       <w:tr>
         <w:trPr>
-          <w:divId w:val="1032220966"/>
+          <w:divId w:val="1790011428"/>
         </w:trPr>
         <w:tc>
           <w:tcPr>
@@ -3013,7 +3013,7 @@
                 <w:sz w:val="22"/>
                 <w:szCs w:val="22"/>
               </w:rPr>
-              <w:t>Korean Society of Transportation — President's Award (Distinguished Graduate)</w:t>
+              <w:t>Korean Society of Transportation, President's Award (Distinguished Graduate)</w:t>
             </w:r>
           </w:p>
         </w:tc>
@@ -3054,7 +3054,7 @@
       </w:tr>
       <w:tr>
         <w:trPr>
-          <w:divId w:val="1032220966"/>
+          <w:divId w:val="1790011428"/>
         </w:trPr>
         <w:tc>
           <w:tcPr>
@@ -3125,7 +3125,7 @@
       </w:tr>
       <w:tr>
         <w:trPr>
-          <w:divId w:val="1032220966"/>
+          <w:divId w:val="1790011428"/>
         </w:trPr>
         <w:tc>
           <w:tcPr>
@@ -3196,7 +3196,7 @@
       </w:tr>
       <w:tr>
         <w:trPr>
-          <w:divId w:val="1032220966"/>
+          <w:divId w:val="1790011428"/>
         </w:trPr>
         <w:tc>
           <w:tcPr>
@@ -3267,7 +3267,7 @@
       </w:tr>
       <w:tr>
         <w:trPr>
-          <w:divId w:val="1032220966"/>
+          <w:divId w:val="1790011428"/>
         </w:trPr>
         <w:tc>
           <w:tcPr>
@@ -3297,7 +3297,7 @@
                 <w:sz w:val="22"/>
                 <w:szCs w:val="22"/>
               </w:rPr>
-              <w:t>Kongju National University President's Award (Capstone) — rescue-drone proposal; patent opportunity</w:t>
+              <w:t>Kongju National University President's Award (Capstone). Rescue-drone proposal; patent opportunity</w:t>
             </w:r>
           </w:p>
         </w:tc>
@@ -3340,7 +3340,7 @@
     <w:p>
       <w:pPr>
         <w:pStyle w:val="2"/>
-        <w:divId w:val="1032220966"/>
+        <w:divId w:val="1790011428"/>
         <w:rPr>
           <w:rFonts w:ascii="Cambria" w:hAnsi="Cambria"/>
           <w:color w:val="000000"/>
@@ -3360,7 +3360,7 @@
       <w:pPr>
         <w:pStyle w:val="3"/>
         <w:spacing w:before="240"/>
-        <w:divId w:val="1032220966"/>
+        <w:divId w:val="1790011428"/>
         <w:rPr>
           <w:rFonts w:ascii="Cambria" w:hAnsi="Cambria"/>
           <w:color w:val="000000"/>
@@ -3393,7 +3393,7 @@
       </w:tblGrid>
       <w:tr>
         <w:trPr>
-          <w:divId w:val="1032220966"/>
+          <w:divId w:val="1790011428"/>
         </w:trPr>
         <w:tc>
           <w:tcPr>
@@ -3494,7 +3494,7 @@
       <w:pPr>
         <w:pStyle w:val="3"/>
         <w:spacing w:before="240"/>
-        <w:divId w:val="1032220966"/>
+        <w:divId w:val="1790011428"/>
         <w:rPr>
           <w:rFonts w:ascii="Cambria" w:hAnsi="Cambria"/>
           <w:color w:val="000000"/>
@@ -3527,7 +3527,7 @@
       </w:tblGrid>
       <w:tr>
         <w:trPr>
-          <w:divId w:val="1032220966"/>
+          <w:divId w:val="1790011428"/>
         </w:trPr>
         <w:tc>
           <w:tcPr>
@@ -3575,7 +3575,7 @@
                 <w:sz w:val="22"/>
                 <w:szCs w:val="22"/>
               </w:rPr>
-              <w:t>National Research Foundation of Korea (NRF) — Graduate Student Research Encouragement Fund. Concluded early upon advancement to the Ph.D. program.</w:t>
+              <w:t>National Research Foundation of Korea (NRF), Graduate Student Research Encouragement Fund. Concluded early upon advancement to the Ph.D. program.</w:t>
             </w:r>
             <w:r>
               <w:rPr>
@@ -3627,7 +3627,7 @@
     <w:p>
       <w:pPr>
         <w:pStyle w:val="2"/>
-        <w:divId w:val="1032220966"/>
+        <w:divId w:val="1790011428"/>
         <w:rPr>
           <w:rFonts w:ascii="Cambria" w:hAnsi="Cambria"/>
           <w:color w:val="000000"/>
@@ -3647,7 +3647,7 @@
       <w:pPr>
         <w:pStyle w:val="blank"/>
         <w:spacing w:before="60" w:beforeAutospacing="0" w:after="60" w:afterAutospacing="0"/>
-        <w:divId w:val="1032220966"/>
+        <w:divId w:val="1790011428"/>
         <w:rPr>
           <w:rFonts w:ascii="Cambria" w:hAnsi="Cambria"/>
           <w:sz w:val="22"/>
@@ -3668,7 +3668,7 @@
     <w:p>
       <w:pPr>
         <w:pStyle w:val="2"/>
-        <w:divId w:val="1032220966"/>
+        <w:divId w:val="1790011428"/>
         <w:rPr>
           <w:rFonts w:ascii="Cambria" w:hAnsi="Cambria"/>
           <w:color w:val="000000"/>
@@ -3701,7 +3701,7 @@
       </w:tblGrid>
       <w:tr>
         <w:trPr>
-          <w:divId w:val="1032220966"/>
+          <w:divId w:val="1790011428"/>
         </w:trPr>
         <w:tc>
           <w:tcPr>
@@ -3838,7 +3838,7 @@
       </w:tr>
       <w:tr>
         <w:trPr>
-          <w:divId w:val="1032220966"/>
+          <w:divId w:val="1790011428"/>
         </w:trPr>
         <w:tc>
           <w:tcPr>
@@ -3868,7 +3868,7 @@
                 <w:sz w:val="22"/>
                 <w:szCs w:val="22"/>
               </w:rPr>
-              <w:t>[Optional: add a second / third reference here — e.g., committee members, collaborators.]</w:t>
+              <w:t>[Optional: add a second / third reference here, e.g., committee members, collaborators.]</w:t>
             </w:r>
             <w:r>
               <w:rPr>
@@ -3910,7 +3910,7 @@
       <w:pPr>
         <w:pStyle w:val="footer"/>
         <w:spacing w:after="60" w:afterAutospacing="0"/>
-        <w:divId w:val="1032220966"/>
+        <w:divId w:val="1790011428"/>
         <w:rPr>
           <w:rFonts w:ascii="Cambria" w:hAnsi="Cambria"/>
           <w:color w:val="000000"/>
@@ -3981,9 +3981,9 @@
 <file path=word/numbering.xml><?xml version="1.0" encoding="utf-8"?>
 <w:numbering xmlns:wpc="http://schemas.microsoft.com/office/word/2010/wordprocessingCanvas" xmlns:cx="http://schemas.microsoft.com/office/drawing/2014/chartex" xmlns:cx1="http://schemas.microsoft.com/office/drawing/2015/9/8/chartex" xmlns:cx2="http://schemas.microsoft.com/office/drawing/2015/10/21/chartex" xmlns:cx3="http://schemas.microsoft.com/office/drawing/2016/5/9/chartex" xmlns:cx4="http://schemas.microsoft.com/office/drawing/2016/5/10/chartex" xmlns:cx5="http://schemas.microsoft.com/office/drawing/2016/5/11/chartex" xmlns:cx6="http://schemas.microsoft.com/office/drawing/2016/5/12/chartex" xmlns:cx7="http://schemas.microsoft.com/office/drawing/2016/5/13/chartex" xmlns:cx8="http://schemas.microsoft.com/office/drawing/2016/5/14/chartex" xmlns:mc="http://schemas.openxmlformats.org/markup-compatibility/2006" xmlns:aink="http://schemas.microsoft.com/office/drawing/2016/ink" xmlns:am3d="http://schemas.microsoft.com/office/drawing/2017/model3d" xmlns:o="urn:schemas-microsoft-com:office:office" xmlns:oel="http://schemas.microsoft.com/office/2019/extlst" xmlns:r="http://schemas.openxmlformats.org/officeDocument/2006/relationships" xmlns:m="http://schemas.openxmlformats.org/officeDocument/2006/math" xmlns:v="urn:schemas-microsoft-com:vml" xmlns:wp14="http://schemas.microsoft.com/office/word/2010/wordprocessingDrawing" xmlns:wp="http://schemas.openxmlformats.org/drawingml/2006/wordprocessingDrawing" xmlns:w10="urn:schemas-microsoft-com:office:word" xmlns:w="http://schemas.openxmlformats.org/wordprocessingml/2006/main" xmlns:w14="http://schemas.microsoft.com/office/word/2010/wordml" xmlns:w15="http://schemas.microsoft.com/office/word/2012/wordml" xmlns:w16cex="http://schemas.microsoft.com/office/word/2018/wordml/cex" xmlns:w16cid="http://schemas.microsoft.com/office/word/2016/wordml/cid" xmlns:w16="http://schemas.microsoft.com/office/word/2018/wordml" xmlns:w16du="http://schemas.microsoft.com/office/word/2023/wordml/word16du" xmlns:w16sdtdh="http://schemas.microsoft.com/office/word/2020/wordml/sdtdatahash" xmlns:w16sdtfl="http://schemas.microsoft.com/office/word/2024/wordml/sdtformatlock" xmlns:w16se="http://schemas.microsoft.com/office/word/2015/wordml/symex" xmlns:wpg="http://schemas.microsoft.com/office/word/2010/wordprocessingGroup" xmlns:wpi="http://schemas.microsoft.com/office/word/2010/wordprocessingInk" xmlns:wne="http://schemas.microsoft.com/office/word/2006/wordml" xmlns:wps="http://schemas.microsoft.com/office/word/2010/wordprocessingShape" mc:Ignorable="w14 w15 w16se w16cid w16 w16cex w16sdtdh w16sdtfl w16du wp14">
   <w:abstractNum w:abstractNumId="0" w15:restartNumberingAfterBreak="0">
-    <w:nsid w:val="2046434F"/>
+    <w:nsid w:val="2D9737E8"/>
     <w:multiLevelType w:val="multilevel"/>
-    <w:tmpl w:val="6C021E72"/>
+    <w:tmpl w:val="1338903A"/>
     <w:lvl w:ilvl="0">
       <w:start w:val="1"/>
       <w:numFmt w:val="decimal"/>
@@ -4094,9 +4094,9 @@
     </w:lvl>
   </w:abstractNum>
   <w:abstractNum w:abstractNumId="1" w15:restartNumberingAfterBreak="0">
-    <w:nsid w:val="271C12DA"/>
+    <w:nsid w:val="55BD788C"/>
     <w:multiLevelType w:val="multilevel"/>
-    <w:tmpl w:val="C5F250D8"/>
+    <w:tmpl w:val="C41A9AE2"/>
     <w:lvl w:ilvl="0">
       <w:start w:val="1"/>
       <w:numFmt w:val="decimal"/>
@@ -4207,9 +4207,9 @@
     </w:lvl>
   </w:abstractNum>
   <w:abstractNum w:abstractNumId="2" w15:restartNumberingAfterBreak="0">
-    <w:nsid w:val="2BC301D8"/>
+    <w:nsid w:val="76D340EF"/>
     <w:multiLevelType w:val="multilevel"/>
-    <w:tmpl w:val="CC8CB9D0"/>
+    <w:tmpl w:val="936E83B2"/>
     <w:lvl w:ilvl="0">
       <w:start w:val="1"/>
       <w:numFmt w:val="decimal"/>
@@ -4320,9 +4320,9 @@
     </w:lvl>
   </w:abstractNum>
   <w:abstractNum w:abstractNumId="3" w15:restartNumberingAfterBreak="0">
-    <w:nsid w:val="388D3796"/>
+    <w:nsid w:val="7847045E"/>
     <w:multiLevelType w:val="multilevel"/>
-    <w:tmpl w:val="68922C66"/>
+    <w:tmpl w:val="65FE6056"/>
     <w:lvl w:ilvl="0">
       <w:start w:val="1"/>
       <w:numFmt w:val="decimal"/>
@@ -4433,9 +4433,9 @@
     </w:lvl>
   </w:abstractNum>
   <w:abstractNum w:abstractNumId="4" w15:restartNumberingAfterBreak="0">
-    <w:nsid w:val="5A4608EF"/>
+    <w:nsid w:val="7B33275C"/>
     <w:multiLevelType w:val="multilevel"/>
-    <w:tmpl w:val="CCB020CC"/>
+    <w:tmpl w:val="BFA23CC2"/>
     <w:lvl w:ilvl="0">
       <w:start w:val="1"/>
       <w:numFmt w:val="decimal"/>
@@ -4546,9 +4546,9 @@
     </w:lvl>
   </w:abstractNum>
   <w:abstractNum w:abstractNumId="5" w15:restartNumberingAfterBreak="0">
-    <w:nsid w:val="775B424D"/>
+    <w:nsid w:val="7B8F6104"/>
     <w:multiLevelType w:val="multilevel"/>
-    <w:tmpl w:val="73108EC2"/>
+    <w:tmpl w:val="1F485126"/>
     <w:lvl w:ilvl="0">
       <w:start w:val="1"/>
       <w:numFmt w:val="decimal"/>
@@ -4659,9 +4659,9 @@
     </w:lvl>
   </w:abstractNum>
   <w:abstractNum w:abstractNumId="6" w15:restartNumberingAfterBreak="0">
-    <w:nsid w:val="7B9560FB"/>
+    <w:nsid w:val="7CA339E3"/>
     <w:multiLevelType w:val="multilevel"/>
-    <w:tmpl w:val="91CA9606"/>
+    <w:tmpl w:val="071E57D0"/>
     <w:lvl w:ilvl="0">
       <w:start w:val="1"/>
       <w:numFmt w:val="decimal"/>
@@ -4771,26 +4771,26 @@
       </w:pPr>
     </w:lvl>
   </w:abstractNum>
-  <w:num w:numId="1" w16cid:durableId="1071656194">
+  <w:num w:numId="1" w16cid:durableId="746070050">
+    <w:abstractNumId w:val="4"/>
+  </w:num>
+  <w:num w:numId="2" w16cid:durableId="1514342399">
+    <w:abstractNumId w:val="5"/>
+  </w:num>
+  <w:num w:numId="3" w16cid:durableId="611013342">
+    <w:abstractNumId w:val="3"/>
+  </w:num>
+  <w:num w:numId="4" w16cid:durableId="1070690534">
+    <w:abstractNumId w:val="1"/>
+  </w:num>
+  <w:num w:numId="5" w16cid:durableId="1559319057">
+    <w:abstractNumId w:val="2"/>
+  </w:num>
+  <w:num w:numId="6" w16cid:durableId="1305160639">
     <w:abstractNumId w:val="0"/>
   </w:num>
-  <w:num w:numId="2" w16cid:durableId="1270234255">
-    <w:abstractNumId w:val="4"/>
-  </w:num>
-  <w:num w:numId="3" w16cid:durableId="377582877">
-    <w:abstractNumId w:val="5"/>
-  </w:num>
-  <w:num w:numId="4" w16cid:durableId="1446728312">
-    <w:abstractNumId w:val="3"/>
-  </w:num>
-  <w:num w:numId="5" w16cid:durableId="2050302611">
+  <w:num w:numId="7" w16cid:durableId="561214320">
     <w:abstractNumId w:val="6"/>
-  </w:num>
-  <w:num w:numId="6" w16cid:durableId="1891334980">
-    <w:abstractNumId w:val="2"/>
-  </w:num>
-  <w:num w:numId="7" w16cid:durableId="1699349009">
-    <w:abstractNumId w:val="1"/>
   </w:num>
 </w:numbering>
 </file>
@@ -5538,7 +5538,7 @@
     <w:link w:val="Char"/>
     <w:uiPriority w:val="99"/>
     <w:unhideWhenUsed/>
-    <w:rsid w:val="009B0D43"/>
+    <w:rsid w:val="008B3EDA"/>
     <w:pPr>
       <w:tabs>
         <w:tab w:val="center" w:pos="4513"/>
@@ -5552,7 +5552,7 @@
     <w:basedOn w:val="a0"/>
     <w:link w:val="a8"/>
     <w:uiPriority w:val="99"/>
-    <w:rsid w:val="009B0D43"/>
+    <w:rsid w:val="008B3EDA"/>
     <w:rPr>
       <w:rFonts w:ascii="굴림" w:eastAsia="굴림" w:hAnsi="굴림" w:cs="굴림"/>
       <w:sz w:val="24"/>
@@ -5565,7 +5565,7 @@
     <w:link w:val="Char0"/>
     <w:uiPriority w:val="99"/>
     <w:unhideWhenUsed/>
-    <w:rsid w:val="009B0D43"/>
+    <w:rsid w:val="008B3EDA"/>
     <w:pPr>
       <w:tabs>
         <w:tab w:val="center" w:pos="4513"/>
@@ -5579,7 +5579,7 @@
     <w:basedOn w:val="a0"/>
     <w:link w:val="a9"/>
     <w:uiPriority w:val="99"/>
-    <w:rsid w:val="009B0D43"/>
+    <w:rsid w:val="008B3EDA"/>
     <w:rPr>
       <w:rFonts w:ascii="굴림" w:eastAsia="굴림" w:hAnsi="굴림" w:cs="굴림"/>
       <w:sz w:val="24"/>

</xml_diff>